<commit_message>
docs: update Report workshop with integration and acceptance test details
</commit_message>
<xml_diff>
--- a/docs/Report workshop.docx
+++ b/docs/Report workshop.docx
@@ -12,7 +12,6 @@
           <w:szCs w:val="28"/>
         </w:rPr>
       </w:pPr>
-      <w:proofErr w:type="spellStart"/>
       <w:r>
         <w:rPr>
           <w:rFonts w:ascii="Times New Roman" w:hAnsi="Times New Roman" w:cs="Times New Roman"/>
@@ -21,66 +20,14 @@
           <w:sz w:val="28"/>
           <w:szCs w:val="28"/>
         </w:rPr>
-        <w:t>Part</w:t>
+        <w:t>Part 1: Prepare the project</w:t>
       </w:r>
-      <w:proofErr w:type="spellEnd"/>
-      <w:r>
-        <w:rPr>
-          <w:rFonts w:ascii="Times New Roman" w:hAnsi="Times New Roman" w:cs="Times New Roman"/>
-          <w:b/>
-          <w:bCs/>
-          <w:sz w:val="28"/>
-          <w:szCs w:val="28"/>
-        </w:rPr>
-        <w:t xml:space="preserve"> 1: </w:t>
-      </w:r>
-      <w:r>
-        <w:rPr>
-          <w:rFonts w:ascii="Times New Roman" w:hAnsi="Times New Roman" w:cs="Times New Roman"/>
-          <w:b/>
-          <w:bCs/>
-          <w:sz w:val="28"/>
-          <w:szCs w:val="28"/>
-        </w:rPr>
-        <w:t xml:space="preserve">Prepare </w:t>
-      </w:r>
-      <w:proofErr w:type="spellStart"/>
-      <w:r>
-        <w:rPr>
-          <w:rFonts w:ascii="Times New Roman" w:hAnsi="Times New Roman" w:cs="Times New Roman"/>
-          <w:b/>
-          <w:bCs/>
-          <w:sz w:val="28"/>
-          <w:szCs w:val="28"/>
-        </w:rPr>
-        <w:t>the</w:t>
-      </w:r>
-      <w:proofErr w:type="spellEnd"/>
-      <w:r>
-        <w:rPr>
-          <w:rFonts w:ascii="Times New Roman" w:hAnsi="Times New Roman" w:cs="Times New Roman"/>
-          <w:b/>
-          <w:bCs/>
-          <w:sz w:val="28"/>
-          <w:szCs w:val="28"/>
-        </w:rPr>
-        <w:t xml:space="preserve"> </w:t>
-      </w:r>
-      <w:proofErr w:type="spellStart"/>
-      <w:r>
-        <w:rPr>
-          <w:rFonts w:ascii="Times New Roman" w:hAnsi="Times New Roman" w:cs="Times New Roman"/>
-          <w:b/>
-          <w:bCs/>
-          <w:sz w:val="28"/>
-          <w:szCs w:val="28"/>
-        </w:rPr>
-        <w:t>project</w:t>
-      </w:r>
-      <w:proofErr w:type="spellEnd"/>
     </w:p>
     <w:p>
       <w:r>
+        <w:rPr>
+          <w:noProof/>
+        </w:rPr>
         <w:drawing>
           <wp:inline distT="0" distB="0" distL="0" distR="0" wp14:anchorId="20F36319" wp14:editId="18D6B406">
             <wp:extent cx="5400040" cy="1688465"/>
@@ -138,22 +85,14 @@
           <w:szCs w:val="28"/>
           <w:lang w:val="en-US"/>
         </w:rPr>
-        <w:t xml:space="preserve">Part 2: </w:t>
-      </w:r>
-      <w:r>
-        <w:rPr>
-          <w:rFonts w:ascii="Times New Roman" w:hAnsi="Times New Roman" w:cs="Times New Roman"/>
-          <w:b/>
-          <w:bCs/>
-          <w:sz w:val="28"/>
-          <w:szCs w:val="28"/>
-          <w:lang w:val="en-US"/>
-        </w:rPr>
-        <w:t>Audit the inherited suite</w:t>
+        <w:t>Part 2: Audit the inherited suite</w:t>
       </w:r>
     </w:p>
     <w:p>
       <w:r>
+        <w:rPr>
+          <w:noProof/>
+        </w:rPr>
         <w:drawing>
           <wp:inline distT="0" distB="0" distL="0" distR="0" wp14:anchorId="71447BDA" wp14:editId="5CF70C7B">
             <wp:extent cx="5400040" cy="1482090"/>
@@ -211,18 +150,7 @@
           <w:szCs w:val="28"/>
           <w:lang w:val="en-US"/>
         </w:rPr>
-        <w:t xml:space="preserve">Part 3: </w:t>
-      </w:r>
-      <w:r>
-        <w:rPr>
-          <w:rFonts w:ascii="Times New Roman" w:hAnsi="Times New Roman" w:cs="Times New Roman"/>
-          <w:b/>
-          <w:bCs/>
-          <w:sz w:val="28"/>
-          <w:szCs w:val="28"/>
-          <w:lang w:val="en-US"/>
-        </w:rPr>
-        <w:t>Test at the unit level</w:t>
+        <w:t>Part 3: Test at the unit level</w:t>
       </w:r>
     </w:p>
     <w:p>
@@ -230,6 +158,9 @@
         <w:jc w:val="center"/>
       </w:pPr>
       <w:r>
+        <w:rPr>
+          <w:noProof/>
+        </w:rPr>
         <w:drawing>
           <wp:inline distT="0" distB="0" distL="0" distR="0" wp14:anchorId="51761D8F" wp14:editId="63AC1079">
             <wp:extent cx="2679869" cy="4219575"/>
@@ -279,37 +210,7 @@
             <w:rPr>
               <w:rFonts w:ascii="Cambria Math" w:hAnsi="Cambria Math"/>
             </w:rPr>
-            <m:t>V(g) = E – N + 2 = 2</m:t>
-          </m:r>
-          <m:r>
-            <w:rPr>
-              <w:rFonts w:ascii="Cambria Math" w:hAnsi="Cambria Math"/>
-            </w:rPr>
-            <m:t>2</m:t>
-          </m:r>
-          <m:r>
-            <w:rPr>
-              <w:rFonts w:ascii="Cambria Math" w:hAnsi="Cambria Math"/>
-            </w:rPr>
-            <m:t xml:space="preserve"> – 1</m:t>
-          </m:r>
-          <m:r>
-            <w:rPr>
-              <w:rFonts w:ascii="Cambria Math" w:hAnsi="Cambria Math"/>
-            </w:rPr>
-            <m:t>7</m:t>
-          </m:r>
-          <m:r>
-            <w:rPr>
-              <w:rFonts w:ascii="Cambria Math" w:hAnsi="Cambria Math"/>
-            </w:rPr>
-            <m:t xml:space="preserve"> + 2 = </m:t>
-          </m:r>
-          <m:r>
-            <w:rPr>
-              <w:rFonts w:ascii="Cambria Math" w:hAnsi="Cambria Math"/>
-            </w:rPr>
-            <m:t>7</m:t>
+            <m:t>V(g) = E – N + 2 = 22 – 17 + 2 = 7</m:t>
           </m:r>
         </m:oMath>
       </m:oMathPara>
@@ -496,27 +397,7 @@
                 <w:szCs w:val="24"/>
                 <w:lang w:eastAsia="es-EC"/>
               </w:rPr>
-              <w:t>src,</w:t>
-            </w:r>
-            <w:proofErr w:type="gramStart"/>
-            <w:r>
-              <w:rPr>
-                <w:rFonts w:ascii="Times New Roman" w:eastAsia="Times New Roman" w:hAnsi="Times New Roman" w:cs="Times New Roman"/>
-                <w:sz w:val="24"/>
-                <w:szCs w:val="24"/>
-                <w:lang w:eastAsia="es-EC"/>
-              </w:rPr>
-              <w:t>40,41a</w:t>
-            </w:r>
-            <w:proofErr w:type="gramEnd"/>
-            <w:r>
-              <w:rPr>
-                <w:rFonts w:ascii="Times New Roman" w:eastAsia="Times New Roman" w:hAnsi="Times New Roman" w:cs="Times New Roman"/>
-                <w:sz w:val="24"/>
-                <w:szCs w:val="24"/>
-                <w:lang w:eastAsia="es-EC"/>
-              </w:rPr>
-              <w:t>,41b,43,45,47,48,49,53,snk</w:t>
+              <w:t>src,40,41a,41b,43,45,47,48,49,53,snk</w:t>
             </w:r>
           </w:p>
         </w:tc>
@@ -534,7 +415,6 @@
                 <w:lang w:eastAsia="es-EC"/>
               </w:rPr>
             </w:pPr>
-            <w:proofErr w:type="spellStart"/>
             <w:r>
               <w:rPr>
                 <w:rFonts w:ascii="Times New Roman" w:eastAsia="Times New Roman" w:hAnsi="Times New Roman" w:cs="Times New Roman"/>
@@ -544,7 +424,6 @@
               </w:rPr>
               <w:t>baseline</w:t>
             </w:r>
-            <w:proofErr w:type="spellEnd"/>
           </w:p>
         </w:tc>
         <w:tc>
@@ -568,27 +447,7 @@
                 <w:szCs w:val="24"/>
                 <w:lang w:eastAsia="es-EC"/>
               </w:rPr>
-              <w:t xml:space="preserve"> (</w:t>
-            </w:r>
-            <w:proofErr w:type="spellStart"/>
-            <w:r>
-              <w:rPr>
-                <w:rFonts w:ascii="Times New Roman" w:eastAsia="Times New Roman" w:hAnsi="Times New Roman" w:cs="Times New Roman"/>
-                <w:sz w:val="24"/>
-                <w:szCs w:val="24"/>
-                <w:lang w:eastAsia="es-EC"/>
-              </w:rPr>
-              <w:t>infactible</w:t>
-            </w:r>
-            <w:proofErr w:type="spellEnd"/>
-            <w:r>
-              <w:rPr>
-                <w:rFonts w:ascii="Times New Roman" w:eastAsia="Times New Roman" w:hAnsi="Times New Roman" w:cs="Times New Roman"/>
-                <w:sz w:val="24"/>
-                <w:szCs w:val="24"/>
-                <w:lang w:eastAsia="es-EC"/>
-              </w:rPr>
-              <w:t>)</w:t>
+              <w:t xml:space="preserve"> (infactible)</w:t>
             </w:r>
           </w:p>
         </w:tc>
@@ -640,27 +499,7 @@
                 <w:szCs w:val="24"/>
                 <w:lang w:eastAsia="es-EC"/>
               </w:rPr>
-              <w:t>src,</w:t>
-            </w:r>
-            <w:proofErr w:type="gramStart"/>
-            <w:r>
-              <w:rPr>
-                <w:rFonts w:ascii="Times New Roman" w:eastAsia="Times New Roman" w:hAnsi="Times New Roman" w:cs="Times New Roman"/>
-                <w:sz w:val="24"/>
-                <w:szCs w:val="24"/>
-                <w:lang w:eastAsia="es-EC"/>
-              </w:rPr>
-              <w:t>40,41a</w:t>
-            </w:r>
-            <w:proofErr w:type="gramEnd"/>
-            <w:r>
-              <w:rPr>
-                <w:rFonts w:ascii="Times New Roman" w:eastAsia="Times New Roman" w:hAnsi="Times New Roman" w:cs="Times New Roman"/>
-                <w:sz w:val="24"/>
-                <w:szCs w:val="24"/>
-                <w:lang w:eastAsia="es-EC"/>
-              </w:rPr>
-              <w:t>,42,snk</w:t>
+              <w:t>src,40,41a,42,snk</w:t>
             </w:r>
           </w:p>
         </w:tc>
@@ -762,27 +601,7 @@
                 <w:szCs w:val="24"/>
                 <w:lang w:eastAsia="es-EC"/>
               </w:rPr>
-              <w:t>src,</w:t>
-            </w:r>
-            <w:proofErr w:type="gramStart"/>
-            <w:r>
-              <w:rPr>
-                <w:rFonts w:ascii="Times New Roman" w:eastAsia="Times New Roman" w:hAnsi="Times New Roman" w:cs="Times New Roman"/>
-                <w:sz w:val="24"/>
-                <w:szCs w:val="24"/>
-                <w:lang w:eastAsia="es-EC"/>
-              </w:rPr>
-              <w:t>40,41a</w:t>
-            </w:r>
-            <w:proofErr w:type="gramEnd"/>
-            <w:r>
-              <w:rPr>
-                <w:rFonts w:ascii="Times New Roman" w:eastAsia="Times New Roman" w:hAnsi="Times New Roman" w:cs="Times New Roman"/>
-                <w:sz w:val="24"/>
-                <w:szCs w:val="24"/>
-                <w:lang w:eastAsia="es-EC"/>
-              </w:rPr>
-              <w:t>,41b,42,snk</w:t>
+              <w:t>src,40,41a,41b,42,snk</w:t>
             </w:r>
           </w:p>
         </w:tc>
@@ -884,27 +703,7 @@
                 <w:szCs w:val="24"/>
                 <w:lang w:eastAsia="es-EC"/>
               </w:rPr>
-              <w:t>src,</w:t>
-            </w:r>
-            <w:proofErr w:type="gramStart"/>
-            <w:r>
-              <w:rPr>
-                <w:rFonts w:ascii="Times New Roman" w:eastAsia="Times New Roman" w:hAnsi="Times New Roman" w:cs="Times New Roman"/>
-                <w:sz w:val="24"/>
-                <w:szCs w:val="24"/>
-                <w:lang w:eastAsia="es-EC"/>
-              </w:rPr>
-              <w:t>40,41a</w:t>
-            </w:r>
-            <w:proofErr w:type="gramEnd"/>
-            <w:r>
-              <w:rPr>
-                <w:rFonts w:ascii="Times New Roman" w:eastAsia="Times New Roman" w:hAnsi="Times New Roman" w:cs="Times New Roman"/>
-                <w:sz w:val="24"/>
-                <w:szCs w:val="24"/>
-                <w:lang w:eastAsia="es-EC"/>
-              </w:rPr>
-              <w:t>,41b,43,44,snk</w:t>
+              <w:t>src,40,41a,41b,43,44,snk</w:t>
             </w:r>
           </w:p>
         </w:tc>
@@ -1006,27 +805,7 @@
                 <w:szCs w:val="24"/>
                 <w:lang w:eastAsia="es-EC"/>
               </w:rPr>
-              <w:t>src,</w:t>
-            </w:r>
-            <w:proofErr w:type="gramStart"/>
-            <w:r>
-              <w:rPr>
-                <w:rFonts w:ascii="Times New Roman" w:eastAsia="Times New Roman" w:hAnsi="Times New Roman" w:cs="Times New Roman"/>
-                <w:sz w:val="24"/>
-                <w:szCs w:val="24"/>
-                <w:lang w:eastAsia="es-EC"/>
-              </w:rPr>
-              <w:t>40,41a</w:t>
-            </w:r>
-            <w:proofErr w:type="gramEnd"/>
-            <w:r>
-              <w:rPr>
-                <w:rFonts w:ascii="Times New Roman" w:eastAsia="Times New Roman" w:hAnsi="Times New Roman" w:cs="Times New Roman"/>
-                <w:sz w:val="24"/>
-                <w:szCs w:val="24"/>
-                <w:lang w:eastAsia="es-EC"/>
-              </w:rPr>
-              <w:t>,41b,43,45,46,snk</w:t>
+              <w:t>src,40,41a,41b,43,45,46,snk</w:t>
             </w:r>
           </w:p>
         </w:tc>
@@ -1128,27 +907,7 @@
                 <w:szCs w:val="24"/>
                 <w:lang w:eastAsia="es-EC"/>
               </w:rPr>
-              <w:t>src,</w:t>
-            </w:r>
-            <w:proofErr w:type="gramStart"/>
-            <w:r>
-              <w:rPr>
-                <w:rFonts w:ascii="Times New Roman" w:eastAsia="Times New Roman" w:hAnsi="Times New Roman" w:cs="Times New Roman"/>
-                <w:sz w:val="24"/>
-                <w:szCs w:val="24"/>
-                <w:lang w:eastAsia="es-EC"/>
-              </w:rPr>
-              <w:t>40,41a</w:t>
-            </w:r>
-            <w:proofErr w:type="gramEnd"/>
-            <w:r>
-              <w:rPr>
-                <w:rFonts w:ascii="Times New Roman" w:eastAsia="Times New Roman" w:hAnsi="Times New Roman" w:cs="Times New Roman"/>
-                <w:sz w:val="24"/>
-                <w:szCs w:val="24"/>
-                <w:lang w:eastAsia="es-EC"/>
-              </w:rPr>
-              <w:t>,41b,43,45,47,48,49,50,49,53,snk</w:t>
+              <w:t>src,40,41a,41b,43,45,47,48,49,50,49,53,snk</w:t>
             </w:r>
           </w:p>
         </w:tc>
@@ -1209,25 +968,14 @@
               </w:rPr>
               <w:t>(</w:t>
             </w:r>
-            <w:proofErr w:type="spellStart"/>
-            <w:r>
-              <w:rPr>
-                <w:rFonts w:ascii="Times New Roman" w:eastAsia="Times New Roman" w:hAnsi="Times New Roman" w:cs="Times New Roman"/>
-                <w:sz w:val="24"/>
-                <w:szCs w:val="24"/>
-                <w:lang w:eastAsia="es-EC"/>
-              </w:rPr>
-              <w:t>infactible</w:t>
-            </w:r>
-            <w:proofErr w:type="spellEnd"/>
-            <w:r>
-              <w:rPr>
-                <w:rFonts w:ascii="Times New Roman" w:eastAsia="Times New Roman" w:hAnsi="Times New Roman" w:cs="Times New Roman"/>
-                <w:sz w:val="24"/>
-                <w:szCs w:val="24"/>
-                <w:lang w:eastAsia="es-EC"/>
-              </w:rPr>
-              <w:t>)</w:t>
+            <w:r>
+              <w:rPr>
+                <w:rFonts w:ascii="Times New Roman" w:eastAsia="Times New Roman" w:hAnsi="Times New Roman" w:cs="Times New Roman"/>
+                <w:sz w:val="24"/>
+                <w:szCs w:val="24"/>
+                <w:lang w:eastAsia="es-EC"/>
+              </w:rPr>
+              <w:t>infactible)</w:t>
             </w:r>
           </w:p>
         </w:tc>
@@ -1279,27 +1027,7 @@
                 <w:szCs w:val="24"/>
                 <w:lang w:eastAsia="es-EC"/>
               </w:rPr>
-              <w:t>src,</w:t>
-            </w:r>
-            <w:proofErr w:type="gramStart"/>
-            <w:r>
-              <w:rPr>
-                <w:rFonts w:ascii="Times New Roman" w:eastAsia="Times New Roman" w:hAnsi="Times New Roman" w:cs="Times New Roman"/>
-                <w:sz w:val="24"/>
-                <w:szCs w:val="24"/>
-                <w:lang w:eastAsia="es-EC"/>
-              </w:rPr>
-              <w:t>40,41a</w:t>
-            </w:r>
-            <w:proofErr w:type="gramEnd"/>
-            <w:r>
-              <w:rPr>
-                <w:rFonts w:ascii="Times New Roman" w:eastAsia="Times New Roman" w:hAnsi="Times New Roman" w:cs="Times New Roman"/>
-                <w:sz w:val="24"/>
-                <w:szCs w:val="24"/>
-                <w:lang w:eastAsia="es-EC"/>
-              </w:rPr>
-              <w:t>,41b,43,45,47,48,49,50,51,52,50,49,53,snk</w:t>
+              <w:t>src,40,41a,41b,43,45,47,48,49,50,51,52,50,49,53,snk</w:t>
             </w:r>
           </w:p>
         </w:tc>
@@ -1356,6 +1084,3217 @@
       </w:tr>
     </w:tbl>
     <w:p/>
+    <w:tbl>
+      <w:tblPr>
+        <w:tblStyle w:val="Tablaconcuadrcula"/>
+        <w:tblW w:w="0" w:type="auto"/>
+        <w:jc w:val="center"/>
+        <w:tblLook w:val="04A0" w:firstRow="1" w:lastRow="0" w:firstColumn="1" w:lastColumn="0" w:noHBand="0" w:noVBand="1"/>
+      </w:tblPr>
+      <w:tblGrid>
+        <w:gridCol w:w="803"/>
+        <w:gridCol w:w="2850"/>
+        <w:gridCol w:w="2017"/>
+        <w:gridCol w:w="2017"/>
+      </w:tblGrid>
+      <w:tr>
+        <w:trPr>
+          <w:jc w:val="center"/>
+        </w:trPr>
+        <w:tc>
+          <w:tcPr>
+            <w:tcW w:w="0" w:type="auto"/>
+            <w:hideMark/>
+          </w:tcPr>
+          <w:p>
+            <w:pPr>
+              <w:jc w:val="center"/>
+              <w:rPr>
+                <w:rFonts w:ascii="Times New Roman" w:eastAsia="Times New Roman" w:hAnsi="Times New Roman" w:cs="Times New Roman"/>
+                <w:b/>
+                <w:bCs/>
+                <w:sz w:val="24"/>
+                <w:szCs w:val="24"/>
+                <w:lang w:eastAsia="es-EC"/>
+              </w:rPr>
+            </w:pPr>
+            <w:r>
+              <w:rPr>
+                <w:rFonts w:ascii="Times New Roman" w:eastAsia="Times New Roman" w:hAnsi="Times New Roman" w:cs="Times New Roman"/>
+                <w:b/>
+                <w:bCs/>
+                <w:sz w:val="24"/>
+                <w:szCs w:val="24"/>
+                <w:lang w:eastAsia="es-EC"/>
+              </w:rPr>
+              <w:t>Línea</w:t>
+            </w:r>
+          </w:p>
+        </w:tc>
+        <w:tc>
+          <w:tcPr>
+            <w:tcW w:w="0" w:type="auto"/>
+            <w:hideMark/>
+          </w:tcPr>
+          <w:p>
+            <w:pPr>
+              <w:jc w:val="center"/>
+              <w:rPr>
+                <w:rFonts w:ascii="Times New Roman" w:eastAsia="Times New Roman" w:hAnsi="Times New Roman" w:cs="Times New Roman"/>
+                <w:b/>
+                <w:bCs/>
+                <w:sz w:val="24"/>
+                <w:szCs w:val="24"/>
+                <w:lang w:eastAsia="es-EC"/>
+              </w:rPr>
+            </w:pPr>
+            <w:r>
+              <w:rPr>
+                <w:rFonts w:ascii="Times New Roman" w:eastAsia="Times New Roman" w:hAnsi="Times New Roman" w:cs="Times New Roman"/>
+                <w:b/>
+                <w:bCs/>
+                <w:sz w:val="24"/>
+                <w:szCs w:val="24"/>
+                <w:lang w:eastAsia="es-EC"/>
+              </w:rPr>
+              <w:t>Definición</w:t>
+            </w:r>
+          </w:p>
+        </w:tc>
+        <w:tc>
+          <w:tcPr>
+            <w:tcW w:w="0" w:type="auto"/>
+            <w:hideMark/>
+          </w:tcPr>
+          <w:p>
+            <w:pPr>
+              <w:jc w:val="center"/>
+              <w:rPr>
+                <w:rFonts w:ascii="Times New Roman" w:eastAsia="Times New Roman" w:hAnsi="Times New Roman" w:cs="Times New Roman"/>
+                <w:b/>
+                <w:bCs/>
+                <w:sz w:val="24"/>
+                <w:szCs w:val="24"/>
+                <w:lang w:eastAsia="es-EC"/>
+              </w:rPr>
+            </w:pPr>
+            <w:r>
+              <w:rPr>
+                <w:rFonts w:ascii="Times New Roman" w:eastAsia="Times New Roman" w:hAnsi="Times New Roman" w:cs="Times New Roman"/>
+                <w:b/>
+                <w:bCs/>
+                <w:sz w:val="24"/>
+                <w:szCs w:val="24"/>
+                <w:lang w:eastAsia="es-EC"/>
+              </w:rPr>
+              <w:t>c-use</w:t>
+            </w:r>
+          </w:p>
+        </w:tc>
+        <w:tc>
+          <w:tcPr>
+            <w:tcW w:w="0" w:type="auto"/>
+            <w:hideMark/>
+          </w:tcPr>
+          <w:p>
+            <w:pPr>
+              <w:jc w:val="center"/>
+              <w:rPr>
+                <w:rFonts w:ascii="Times New Roman" w:eastAsia="Times New Roman" w:hAnsi="Times New Roman" w:cs="Times New Roman"/>
+                <w:b/>
+                <w:bCs/>
+                <w:sz w:val="24"/>
+                <w:szCs w:val="24"/>
+                <w:lang w:eastAsia="es-EC"/>
+              </w:rPr>
+            </w:pPr>
+            <w:r>
+              <w:rPr>
+                <w:rFonts w:ascii="Times New Roman" w:eastAsia="Times New Roman" w:hAnsi="Times New Roman" w:cs="Times New Roman"/>
+                <w:b/>
+                <w:bCs/>
+                <w:sz w:val="24"/>
+                <w:szCs w:val="24"/>
+                <w:lang w:eastAsia="es-EC"/>
+              </w:rPr>
+              <w:t>p-use</w:t>
+            </w:r>
+          </w:p>
+        </w:tc>
+      </w:tr>
+      <w:tr>
+        <w:trPr>
+          <w:jc w:val="center"/>
+        </w:trPr>
+        <w:tc>
+          <w:tcPr>
+            <w:tcW w:w="0" w:type="auto"/>
+            <w:hideMark/>
+          </w:tcPr>
+          <w:p>
+            <w:pPr>
+              <w:rPr>
+                <w:rFonts w:ascii="Times New Roman" w:eastAsia="Times New Roman" w:hAnsi="Times New Roman" w:cs="Times New Roman"/>
+                <w:sz w:val="24"/>
+                <w:szCs w:val="24"/>
+                <w:lang w:eastAsia="es-EC"/>
+              </w:rPr>
+            </w:pPr>
+            <w:r>
+              <w:rPr>
+                <w:rFonts w:ascii="Times New Roman" w:eastAsia="Times New Roman" w:hAnsi="Times New Roman" w:cs="Times New Roman"/>
+                <w:sz w:val="24"/>
+                <w:szCs w:val="24"/>
+                <w:lang w:eastAsia="es-EC"/>
+              </w:rPr>
+              <w:t>40</w:t>
+            </w:r>
+          </w:p>
+        </w:tc>
+        <w:tc>
+          <w:tcPr>
+            <w:tcW w:w="0" w:type="auto"/>
+            <w:hideMark/>
+          </w:tcPr>
+          <w:p>
+            <w:pPr>
+              <w:rPr>
+                <w:rFonts w:ascii="Times New Roman" w:eastAsia="Times New Roman" w:hAnsi="Times New Roman" w:cs="Times New Roman"/>
+                <w:sz w:val="24"/>
+                <w:szCs w:val="24"/>
+                <w:lang w:eastAsia="es-EC"/>
+              </w:rPr>
+            </w:pPr>
+            <w:r>
+              <w:rPr>
+                <w:rFonts w:ascii="Courier New" w:eastAsia="Times New Roman" w:hAnsi="Courier New" w:cs="Courier New"/>
+                <w:sz w:val="20"/>
+                <w:szCs w:val="20"/>
+                <w:lang w:eastAsia="es-EC"/>
+              </w:rPr>
+              <w:t>n</w:t>
+            </w:r>
+          </w:p>
+        </w:tc>
+        <w:tc>
+          <w:tcPr>
+            <w:tcW w:w="0" w:type="auto"/>
+            <w:hideMark/>
+          </w:tcPr>
+          <w:p>
+            <w:pPr>
+              <w:rPr>
+                <w:rFonts w:ascii="Times New Roman" w:eastAsia="Times New Roman" w:hAnsi="Times New Roman" w:cs="Times New Roman"/>
+                <w:sz w:val="24"/>
+                <w:szCs w:val="24"/>
+                <w:lang w:eastAsia="es-EC"/>
+              </w:rPr>
+            </w:pPr>
+          </w:p>
+        </w:tc>
+        <w:tc>
+          <w:tcPr>
+            <w:tcW w:w="0" w:type="auto"/>
+            <w:hideMark/>
+          </w:tcPr>
+          <w:p>
+            <w:pPr>
+              <w:rPr>
+                <w:rFonts w:ascii="Times New Roman" w:eastAsia="Times New Roman" w:hAnsi="Times New Roman" w:cs="Times New Roman"/>
+                <w:sz w:val="20"/>
+                <w:szCs w:val="20"/>
+                <w:lang w:eastAsia="es-EC"/>
+              </w:rPr>
+            </w:pPr>
+          </w:p>
+        </w:tc>
+      </w:tr>
+      <w:tr>
+        <w:trPr>
+          <w:jc w:val="center"/>
+        </w:trPr>
+        <w:tc>
+          <w:tcPr>
+            <w:tcW w:w="0" w:type="auto"/>
+            <w:hideMark/>
+          </w:tcPr>
+          <w:p>
+            <w:pPr>
+              <w:rPr>
+                <w:rFonts w:ascii="Times New Roman" w:eastAsia="Times New Roman" w:hAnsi="Times New Roman" w:cs="Times New Roman"/>
+                <w:sz w:val="24"/>
+                <w:szCs w:val="24"/>
+                <w:lang w:eastAsia="es-EC"/>
+              </w:rPr>
+            </w:pPr>
+            <w:r>
+              <w:rPr>
+                <w:rFonts w:ascii="Times New Roman" w:eastAsia="Times New Roman" w:hAnsi="Times New Roman" w:cs="Times New Roman"/>
+                <w:sz w:val="24"/>
+                <w:szCs w:val="24"/>
+                <w:lang w:eastAsia="es-EC"/>
+              </w:rPr>
+              <w:t>41a</w:t>
+            </w:r>
+          </w:p>
+        </w:tc>
+        <w:tc>
+          <w:tcPr>
+            <w:tcW w:w="0" w:type="auto"/>
+            <w:hideMark/>
+          </w:tcPr>
+          <w:p>
+            <w:pPr>
+              <w:rPr>
+                <w:rFonts w:ascii="Times New Roman" w:eastAsia="Times New Roman" w:hAnsi="Times New Roman" w:cs="Times New Roman"/>
+                <w:sz w:val="24"/>
+                <w:szCs w:val="24"/>
+                <w:lang w:eastAsia="es-EC"/>
+              </w:rPr>
+            </w:pPr>
+          </w:p>
+        </w:tc>
+        <w:tc>
+          <w:tcPr>
+            <w:tcW w:w="0" w:type="auto"/>
+            <w:hideMark/>
+          </w:tcPr>
+          <w:p>
+            <w:pPr>
+              <w:rPr>
+                <w:rFonts w:ascii="Times New Roman" w:eastAsia="Times New Roman" w:hAnsi="Times New Roman" w:cs="Times New Roman"/>
+                <w:sz w:val="20"/>
+                <w:szCs w:val="20"/>
+                <w:lang w:eastAsia="es-EC"/>
+              </w:rPr>
+            </w:pPr>
+          </w:p>
+        </w:tc>
+        <w:tc>
+          <w:tcPr>
+            <w:tcW w:w="0" w:type="auto"/>
+            <w:hideMark/>
+          </w:tcPr>
+          <w:p>
+            <w:pPr>
+              <w:rPr>
+                <w:rFonts w:ascii="Times New Roman" w:eastAsia="Times New Roman" w:hAnsi="Times New Roman" w:cs="Times New Roman"/>
+                <w:sz w:val="24"/>
+                <w:szCs w:val="24"/>
+                <w:lang w:eastAsia="es-EC"/>
+              </w:rPr>
+            </w:pPr>
+            <w:r>
+              <w:rPr>
+                <w:rFonts w:ascii="Courier New" w:eastAsia="Times New Roman" w:hAnsi="Courier New" w:cs="Courier New"/>
+                <w:sz w:val="20"/>
+                <w:szCs w:val="20"/>
+                <w:lang w:eastAsia="es-EC"/>
+              </w:rPr>
+              <w:t>n</w:t>
+            </w:r>
+          </w:p>
+        </w:tc>
+      </w:tr>
+      <w:tr>
+        <w:trPr>
+          <w:jc w:val="center"/>
+        </w:trPr>
+        <w:tc>
+          <w:tcPr>
+            <w:tcW w:w="0" w:type="auto"/>
+            <w:hideMark/>
+          </w:tcPr>
+          <w:p>
+            <w:pPr>
+              <w:rPr>
+                <w:rFonts w:ascii="Times New Roman" w:eastAsia="Times New Roman" w:hAnsi="Times New Roman" w:cs="Times New Roman"/>
+                <w:sz w:val="24"/>
+                <w:szCs w:val="24"/>
+                <w:lang w:eastAsia="es-EC"/>
+              </w:rPr>
+            </w:pPr>
+            <w:r>
+              <w:rPr>
+                <w:rFonts w:ascii="Times New Roman" w:eastAsia="Times New Roman" w:hAnsi="Times New Roman" w:cs="Times New Roman"/>
+                <w:sz w:val="24"/>
+                <w:szCs w:val="24"/>
+                <w:lang w:eastAsia="es-EC"/>
+              </w:rPr>
+              <w:t>41b</w:t>
+            </w:r>
+          </w:p>
+        </w:tc>
+        <w:tc>
+          <w:tcPr>
+            <w:tcW w:w="0" w:type="auto"/>
+            <w:hideMark/>
+          </w:tcPr>
+          <w:p>
+            <w:pPr>
+              <w:rPr>
+                <w:rFonts w:ascii="Times New Roman" w:eastAsia="Times New Roman" w:hAnsi="Times New Roman" w:cs="Times New Roman"/>
+                <w:sz w:val="24"/>
+                <w:szCs w:val="24"/>
+                <w:lang w:eastAsia="es-EC"/>
+              </w:rPr>
+            </w:pPr>
+          </w:p>
+        </w:tc>
+        <w:tc>
+          <w:tcPr>
+            <w:tcW w:w="0" w:type="auto"/>
+            <w:hideMark/>
+          </w:tcPr>
+          <w:p>
+            <w:pPr>
+              <w:rPr>
+                <w:rFonts w:ascii="Times New Roman" w:eastAsia="Times New Roman" w:hAnsi="Times New Roman" w:cs="Times New Roman"/>
+                <w:sz w:val="20"/>
+                <w:szCs w:val="20"/>
+                <w:lang w:eastAsia="es-EC"/>
+              </w:rPr>
+            </w:pPr>
+          </w:p>
+        </w:tc>
+        <w:tc>
+          <w:tcPr>
+            <w:tcW w:w="0" w:type="auto"/>
+            <w:hideMark/>
+          </w:tcPr>
+          <w:p>
+            <w:pPr>
+              <w:rPr>
+                <w:rFonts w:ascii="Times New Roman" w:eastAsia="Times New Roman" w:hAnsi="Times New Roman" w:cs="Times New Roman"/>
+                <w:sz w:val="24"/>
+                <w:szCs w:val="24"/>
+                <w:lang w:eastAsia="es-EC"/>
+              </w:rPr>
+            </w:pPr>
+            <w:r>
+              <w:rPr>
+                <w:rFonts w:ascii="Courier New" w:eastAsia="Times New Roman" w:hAnsi="Courier New" w:cs="Courier New"/>
+                <w:sz w:val="20"/>
+                <w:szCs w:val="20"/>
+                <w:lang w:eastAsia="es-EC"/>
+              </w:rPr>
+              <w:t>n</w:t>
+            </w:r>
+          </w:p>
+        </w:tc>
+      </w:tr>
+      <w:tr>
+        <w:trPr>
+          <w:jc w:val="center"/>
+        </w:trPr>
+        <w:tc>
+          <w:tcPr>
+            <w:tcW w:w="0" w:type="auto"/>
+            <w:hideMark/>
+          </w:tcPr>
+          <w:p>
+            <w:pPr>
+              <w:rPr>
+                <w:rFonts w:ascii="Times New Roman" w:eastAsia="Times New Roman" w:hAnsi="Times New Roman" w:cs="Times New Roman"/>
+                <w:sz w:val="24"/>
+                <w:szCs w:val="24"/>
+                <w:lang w:eastAsia="es-EC"/>
+              </w:rPr>
+            </w:pPr>
+            <w:r>
+              <w:rPr>
+                <w:rFonts w:ascii="Times New Roman" w:eastAsia="Times New Roman" w:hAnsi="Times New Roman" w:cs="Times New Roman"/>
+                <w:sz w:val="24"/>
+                <w:szCs w:val="24"/>
+                <w:lang w:eastAsia="es-EC"/>
+              </w:rPr>
+              <w:t>43</w:t>
+            </w:r>
+          </w:p>
+        </w:tc>
+        <w:tc>
+          <w:tcPr>
+            <w:tcW w:w="0" w:type="auto"/>
+            <w:hideMark/>
+          </w:tcPr>
+          <w:p>
+            <w:pPr>
+              <w:rPr>
+                <w:rFonts w:ascii="Times New Roman" w:eastAsia="Times New Roman" w:hAnsi="Times New Roman" w:cs="Times New Roman"/>
+                <w:sz w:val="24"/>
+                <w:szCs w:val="24"/>
+                <w:lang w:eastAsia="es-EC"/>
+              </w:rPr>
+            </w:pPr>
+          </w:p>
+        </w:tc>
+        <w:tc>
+          <w:tcPr>
+            <w:tcW w:w="0" w:type="auto"/>
+            <w:hideMark/>
+          </w:tcPr>
+          <w:p>
+            <w:pPr>
+              <w:rPr>
+                <w:rFonts w:ascii="Times New Roman" w:eastAsia="Times New Roman" w:hAnsi="Times New Roman" w:cs="Times New Roman"/>
+                <w:sz w:val="20"/>
+                <w:szCs w:val="20"/>
+                <w:lang w:eastAsia="es-EC"/>
+              </w:rPr>
+            </w:pPr>
+          </w:p>
+        </w:tc>
+        <w:tc>
+          <w:tcPr>
+            <w:tcW w:w="0" w:type="auto"/>
+            <w:hideMark/>
+          </w:tcPr>
+          <w:p>
+            <w:pPr>
+              <w:rPr>
+                <w:rFonts w:ascii="Times New Roman" w:eastAsia="Times New Roman" w:hAnsi="Times New Roman" w:cs="Times New Roman"/>
+                <w:sz w:val="24"/>
+                <w:szCs w:val="24"/>
+                <w:lang w:eastAsia="es-EC"/>
+              </w:rPr>
+            </w:pPr>
+            <w:r>
+              <w:rPr>
+                <w:rFonts w:ascii="Courier New" w:eastAsia="Times New Roman" w:hAnsi="Courier New" w:cs="Courier New"/>
+                <w:sz w:val="20"/>
+                <w:szCs w:val="20"/>
+                <w:lang w:eastAsia="es-EC"/>
+              </w:rPr>
+              <w:t>n</w:t>
+            </w:r>
+            <w:r>
+              <w:rPr>
+                <w:rFonts w:ascii="Times New Roman" w:eastAsia="Times New Roman" w:hAnsi="Times New Roman" w:cs="Times New Roman"/>
+                <w:sz w:val="24"/>
+                <w:szCs w:val="24"/>
+                <w:lang w:eastAsia="es-EC"/>
+              </w:rPr>
+              <w:t xml:space="preserve">, </w:t>
+            </w:r>
+            <w:r>
+              <w:rPr>
+                <w:rFonts w:ascii="Courier New" w:eastAsia="Times New Roman" w:hAnsi="Courier New" w:cs="Courier New"/>
+                <w:sz w:val="20"/>
+                <w:szCs w:val="20"/>
+                <w:lang w:eastAsia="es-EC"/>
+              </w:rPr>
+              <w:t>_MIN_VALUE</w:t>
+            </w:r>
+          </w:p>
+        </w:tc>
+      </w:tr>
+      <w:tr>
+        <w:trPr>
+          <w:jc w:val="center"/>
+        </w:trPr>
+        <w:tc>
+          <w:tcPr>
+            <w:tcW w:w="0" w:type="auto"/>
+            <w:hideMark/>
+          </w:tcPr>
+          <w:p>
+            <w:pPr>
+              <w:rPr>
+                <w:rFonts w:ascii="Times New Roman" w:eastAsia="Times New Roman" w:hAnsi="Times New Roman" w:cs="Times New Roman"/>
+                <w:sz w:val="24"/>
+                <w:szCs w:val="24"/>
+                <w:lang w:eastAsia="es-EC"/>
+              </w:rPr>
+            </w:pPr>
+            <w:r>
+              <w:rPr>
+                <w:rFonts w:ascii="Times New Roman" w:eastAsia="Times New Roman" w:hAnsi="Times New Roman" w:cs="Times New Roman"/>
+                <w:sz w:val="24"/>
+                <w:szCs w:val="24"/>
+                <w:lang w:eastAsia="es-EC"/>
+              </w:rPr>
+              <w:t>45</w:t>
+            </w:r>
+          </w:p>
+        </w:tc>
+        <w:tc>
+          <w:tcPr>
+            <w:tcW w:w="0" w:type="auto"/>
+            <w:hideMark/>
+          </w:tcPr>
+          <w:p>
+            <w:pPr>
+              <w:rPr>
+                <w:rFonts w:ascii="Times New Roman" w:eastAsia="Times New Roman" w:hAnsi="Times New Roman" w:cs="Times New Roman"/>
+                <w:sz w:val="24"/>
+                <w:szCs w:val="24"/>
+                <w:lang w:eastAsia="es-EC"/>
+              </w:rPr>
+            </w:pPr>
+          </w:p>
+        </w:tc>
+        <w:tc>
+          <w:tcPr>
+            <w:tcW w:w="0" w:type="auto"/>
+            <w:hideMark/>
+          </w:tcPr>
+          <w:p>
+            <w:pPr>
+              <w:rPr>
+                <w:rFonts w:ascii="Times New Roman" w:eastAsia="Times New Roman" w:hAnsi="Times New Roman" w:cs="Times New Roman"/>
+                <w:sz w:val="20"/>
+                <w:szCs w:val="20"/>
+                <w:lang w:eastAsia="es-EC"/>
+              </w:rPr>
+            </w:pPr>
+          </w:p>
+        </w:tc>
+        <w:tc>
+          <w:tcPr>
+            <w:tcW w:w="0" w:type="auto"/>
+            <w:hideMark/>
+          </w:tcPr>
+          <w:p>
+            <w:pPr>
+              <w:rPr>
+                <w:rFonts w:ascii="Times New Roman" w:eastAsia="Times New Roman" w:hAnsi="Times New Roman" w:cs="Times New Roman"/>
+                <w:sz w:val="24"/>
+                <w:szCs w:val="24"/>
+                <w:lang w:eastAsia="es-EC"/>
+              </w:rPr>
+            </w:pPr>
+            <w:r>
+              <w:rPr>
+                <w:rFonts w:ascii="Courier New" w:eastAsia="Times New Roman" w:hAnsi="Courier New" w:cs="Courier New"/>
+                <w:sz w:val="20"/>
+                <w:szCs w:val="20"/>
+                <w:lang w:eastAsia="es-EC"/>
+              </w:rPr>
+              <w:t>n</w:t>
+            </w:r>
+            <w:r>
+              <w:rPr>
+                <w:rFonts w:ascii="Times New Roman" w:eastAsia="Times New Roman" w:hAnsi="Times New Roman" w:cs="Times New Roman"/>
+                <w:sz w:val="24"/>
+                <w:szCs w:val="24"/>
+                <w:lang w:eastAsia="es-EC"/>
+              </w:rPr>
+              <w:t xml:space="preserve">, </w:t>
+            </w:r>
+            <w:r>
+              <w:rPr>
+                <w:rFonts w:ascii="Courier New" w:eastAsia="Times New Roman" w:hAnsi="Courier New" w:cs="Courier New"/>
+                <w:sz w:val="20"/>
+                <w:szCs w:val="20"/>
+                <w:lang w:eastAsia="es-EC"/>
+              </w:rPr>
+              <w:t>_MAX_VALUE</w:t>
+            </w:r>
+          </w:p>
+        </w:tc>
+      </w:tr>
+      <w:tr>
+        <w:trPr>
+          <w:jc w:val="center"/>
+        </w:trPr>
+        <w:tc>
+          <w:tcPr>
+            <w:tcW w:w="0" w:type="auto"/>
+            <w:hideMark/>
+          </w:tcPr>
+          <w:p>
+            <w:pPr>
+              <w:rPr>
+                <w:rFonts w:ascii="Times New Roman" w:eastAsia="Times New Roman" w:hAnsi="Times New Roman" w:cs="Times New Roman"/>
+                <w:sz w:val="24"/>
+                <w:szCs w:val="24"/>
+                <w:lang w:eastAsia="es-EC"/>
+              </w:rPr>
+            </w:pPr>
+            <w:r>
+              <w:rPr>
+                <w:rFonts w:ascii="Times New Roman" w:eastAsia="Times New Roman" w:hAnsi="Times New Roman" w:cs="Times New Roman"/>
+                <w:sz w:val="24"/>
+                <w:szCs w:val="24"/>
+                <w:lang w:eastAsia="es-EC"/>
+              </w:rPr>
+              <w:t>47</w:t>
+            </w:r>
+          </w:p>
+        </w:tc>
+        <w:tc>
+          <w:tcPr>
+            <w:tcW w:w="0" w:type="auto"/>
+            <w:hideMark/>
+          </w:tcPr>
+          <w:p>
+            <w:pPr>
+              <w:rPr>
+                <w:rFonts w:ascii="Times New Roman" w:eastAsia="Times New Roman" w:hAnsi="Times New Roman" w:cs="Times New Roman"/>
+                <w:sz w:val="24"/>
+                <w:szCs w:val="24"/>
+                <w:lang w:eastAsia="es-EC"/>
+              </w:rPr>
+            </w:pPr>
+            <w:r>
+              <w:rPr>
+                <w:rFonts w:ascii="Courier New" w:eastAsia="Times New Roman" w:hAnsi="Courier New" w:cs="Courier New"/>
+                <w:sz w:val="20"/>
+                <w:szCs w:val="20"/>
+                <w:lang w:eastAsia="es-EC"/>
+              </w:rPr>
+              <w:t>out</w:t>
+            </w:r>
+          </w:p>
+        </w:tc>
+        <w:tc>
+          <w:tcPr>
+            <w:tcW w:w="0" w:type="auto"/>
+            <w:hideMark/>
+          </w:tcPr>
+          <w:p>
+            <w:pPr>
+              <w:rPr>
+                <w:rFonts w:ascii="Times New Roman" w:eastAsia="Times New Roman" w:hAnsi="Times New Roman" w:cs="Times New Roman"/>
+                <w:sz w:val="24"/>
+                <w:szCs w:val="24"/>
+                <w:lang w:eastAsia="es-EC"/>
+              </w:rPr>
+            </w:pPr>
+          </w:p>
+        </w:tc>
+        <w:tc>
+          <w:tcPr>
+            <w:tcW w:w="0" w:type="auto"/>
+            <w:hideMark/>
+          </w:tcPr>
+          <w:p>
+            <w:pPr>
+              <w:rPr>
+                <w:rFonts w:ascii="Times New Roman" w:eastAsia="Times New Roman" w:hAnsi="Times New Roman" w:cs="Times New Roman"/>
+                <w:sz w:val="20"/>
+                <w:szCs w:val="20"/>
+                <w:lang w:eastAsia="es-EC"/>
+              </w:rPr>
+            </w:pPr>
+          </w:p>
+        </w:tc>
+      </w:tr>
+      <w:tr>
+        <w:trPr>
+          <w:jc w:val="center"/>
+        </w:trPr>
+        <w:tc>
+          <w:tcPr>
+            <w:tcW w:w="0" w:type="auto"/>
+            <w:hideMark/>
+          </w:tcPr>
+          <w:p>
+            <w:pPr>
+              <w:rPr>
+                <w:rFonts w:ascii="Times New Roman" w:eastAsia="Times New Roman" w:hAnsi="Times New Roman" w:cs="Times New Roman"/>
+                <w:sz w:val="24"/>
+                <w:szCs w:val="24"/>
+                <w:lang w:eastAsia="es-EC"/>
+              </w:rPr>
+            </w:pPr>
+            <w:r>
+              <w:rPr>
+                <w:rFonts w:ascii="Times New Roman" w:eastAsia="Times New Roman" w:hAnsi="Times New Roman" w:cs="Times New Roman"/>
+                <w:sz w:val="24"/>
+                <w:szCs w:val="24"/>
+                <w:lang w:eastAsia="es-EC"/>
+              </w:rPr>
+              <w:t>48</w:t>
+            </w:r>
+          </w:p>
+        </w:tc>
+        <w:tc>
+          <w:tcPr>
+            <w:tcW w:w="0" w:type="auto"/>
+            <w:hideMark/>
+          </w:tcPr>
+          <w:p>
+            <w:pPr>
+              <w:rPr>
+                <w:rFonts w:ascii="Times New Roman" w:eastAsia="Times New Roman" w:hAnsi="Times New Roman" w:cs="Times New Roman"/>
+                <w:sz w:val="24"/>
+                <w:szCs w:val="24"/>
+                <w:lang w:eastAsia="es-EC"/>
+              </w:rPr>
+            </w:pPr>
+            <w:r>
+              <w:rPr>
+                <w:rFonts w:ascii="Courier New" w:eastAsia="Times New Roman" w:hAnsi="Courier New" w:cs="Courier New"/>
+                <w:sz w:val="20"/>
+                <w:szCs w:val="20"/>
+                <w:lang w:eastAsia="es-EC"/>
+              </w:rPr>
+              <w:t>remaining</w:t>
+            </w:r>
+          </w:p>
+        </w:tc>
+        <w:tc>
+          <w:tcPr>
+            <w:tcW w:w="0" w:type="auto"/>
+            <w:hideMark/>
+          </w:tcPr>
+          <w:p>
+            <w:pPr>
+              <w:rPr>
+                <w:rFonts w:ascii="Times New Roman" w:eastAsia="Times New Roman" w:hAnsi="Times New Roman" w:cs="Times New Roman"/>
+                <w:sz w:val="24"/>
+                <w:szCs w:val="24"/>
+                <w:lang w:eastAsia="es-EC"/>
+              </w:rPr>
+            </w:pPr>
+            <w:r>
+              <w:rPr>
+                <w:rFonts w:ascii="Courier New" w:eastAsia="Times New Roman" w:hAnsi="Courier New" w:cs="Courier New"/>
+                <w:sz w:val="20"/>
+                <w:szCs w:val="20"/>
+                <w:lang w:eastAsia="es-EC"/>
+              </w:rPr>
+              <w:t>n</w:t>
+            </w:r>
+          </w:p>
+        </w:tc>
+        <w:tc>
+          <w:tcPr>
+            <w:tcW w:w="0" w:type="auto"/>
+            <w:hideMark/>
+          </w:tcPr>
+          <w:p>
+            <w:pPr>
+              <w:rPr>
+                <w:rFonts w:ascii="Times New Roman" w:eastAsia="Times New Roman" w:hAnsi="Times New Roman" w:cs="Times New Roman"/>
+                <w:sz w:val="24"/>
+                <w:szCs w:val="24"/>
+                <w:lang w:eastAsia="es-EC"/>
+              </w:rPr>
+            </w:pPr>
+          </w:p>
+        </w:tc>
+      </w:tr>
+      <w:tr>
+        <w:trPr>
+          <w:jc w:val="center"/>
+        </w:trPr>
+        <w:tc>
+          <w:tcPr>
+            <w:tcW w:w="0" w:type="auto"/>
+            <w:hideMark/>
+          </w:tcPr>
+          <w:p>
+            <w:pPr>
+              <w:rPr>
+                <w:rFonts w:ascii="Times New Roman" w:eastAsia="Times New Roman" w:hAnsi="Times New Roman" w:cs="Times New Roman"/>
+                <w:sz w:val="24"/>
+                <w:szCs w:val="24"/>
+                <w:lang w:eastAsia="es-EC"/>
+              </w:rPr>
+            </w:pPr>
+            <w:r>
+              <w:rPr>
+                <w:rFonts w:ascii="Times New Roman" w:eastAsia="Times New Roman" w:hAnsi="Times New Roman" w:cs="Times New Roman"/>
+                <w:sz w:val="24"/>
+                <w:szCs w:val="24"/>
+                <w:lang w:eastAsia="es-EC"/>
+              </w:rPr>
+              <w:t>49</w:t>
+            </w:r>
+          </w:p>
+        </w:tc>
+        <w:tc>
+          <w:tcPr>
+            <w:tcW w:w="0" w:type="auto"/>
+            <w:hideMark/>
+          </w:tcPr>
+          <w:p>
+            <w:pPr>
+              <w:rPr>
+                <w:rFonts w:ascii="Times New Roman" w:eastAsia="Times New Roman" w:hAnsi="Times New Roman" w:cs="Times New Roman"/>
+                <w:sz w:val="24"/>
+                <w:szCs w:val="24"/>
+                <w:lang w:eastAsia="es-EC"/>
+              </w:rPr>
+            </w:pPr>
+            <w:r>
+              <w:rPr>
+                <w:rFonts w:ascii="Courier New" w:eastAsia="Times New Roman" w:hAnsi="Courier New" w:cs="Courier New"/>
+                <w:sz w:val="20"/>
+                <w:szCs w:val="20"/>
+                <w:lang w:eastAsia="es-EC"/>
+              </w:rPr>
+              <w:t>value</w:t>
+            </w:r>
+            <w:r>
+              <w:rPr>
+                <w:rFonts w:ascii="Times New Roman" w:eastAsia="Times New Roman" w:hAnsi="Times New Roman" w:cs="Times New Roman"/>
+                <w:sz w:val="24"/>
+                <w:szCs w:val="24"/>
+                <w:lang w:eastAsia="es-EC"/>
+              </w:rPr>
+              <w:t xml:space="preserve">, </w:t>
+            </w:r>
+            <w:r>
+              <w:rPr>
+                <w:rFonts w:ascii="Courier New" w:eastAsia="Times New Roman" w:hAnsi="Courier New" w:cs="Courier New"/>
+                <w:sz w:val="20"/>
+                <w:szCs w:val="20"/>
+                <w:lang w:eastAsia="es-EC"/>
+              </w:rPr>
+              <w:t>symbol</w:t>
+            </w:r>
+          </w:p>
+        </w:tc>
+        <w:tc>
+          <w:tcPr>
+            <w:tcW w:w="0" w:type="auto"/>
+            <w:hideMark/>
+          </w:tcPr>
+          <w:p>
+            <w:pPr>
+              <w:rPr>
+                <w:rFonts w:ascii="Times New Roman" w:eastAsia="Times New Roman" w:hAnsi="Times New Roman" w:cs="Times New Roman"/>
+                <w:sz w:val="24"/>
+                <w:szCs w:val="24"/>
+                <w:lang w:eastAsia="es-EC"/>
+              </w:rPr>
+            </w:pPr>
+            <w:r>
+              <w:rPr>
+                <w:rFonts w:ascii="Courier New" w:eastAsia="Times New Roman" w:hAnsi="Courier New" w:cs="Courier New"/>
+                <w:sz w:val="20"/>
+                <w:szCs w:val="20"/>
+                <w:lang w:eastAsia="es-EC"/>
+              </w:rPr>
+              <w:t>_PAIRS</w:t>
+            </w:r>
+          </w:p>
+        </w:tc>
+        <w:tc>
+          <w:tcPr>
+            <w:tcW w:w="0" w:type="auto"/>
+            <w:hideMark/>
+          </w:tcPr>
+          <w:p>
+            <w:pPr>
+              <w:rPr>
+                <w:rFonts w:ascii="Times New Roman" w:eastAsia="Times New Roman" w:hAnsi="Times New Roman" w:cs="Times New Roman"/>
+                <w:sz w:val="24"/>
+                <w:szCs w:val="24"/>
+                <w:lang w:eastAsia="es-EC"/>
+              </w:rPr>
+            </w:pPr>
+          </w:p>
+        </w:tc>
+      </w:tr>
+      <w:tr>
+        <w:trPr>
+          <w:jc w:val="center"/>
+        </w:trPr>
+        <w:tc>
+          <w:tcPr>
+            <w:tcW w:w="0" w:type="auto"/>
+            <w:hideMark/>
+          </w:tcPr>
+          <w:p>
+            <w:pPr>
+              <w:rPr>
+                <w:rFonts w:ascii="Times New Roman" w:eastAsia="Times New Roman" w:hAnsi="Times New Roman" w:cs="Times New Roman"/>
+                <w:sz w:val="24"/>
+                <w:szCs w:val="24"/>
+                <w:lang w:eastAsia="es-EC"/>
+              </w:rPr>
+            </w:pPr>
+            <w:r>
+              <w:rPr>
+                <w:rFonts w:ascii="Times New Roman" w:eastAsia="Times New Roman" w:hAnsi="Times New Roman" w:cs="Times New Roman"/>
+                <w:sz w:val="24"/>
+                <w:szCs w:val="24"/>
+                <w:lang w:eastAsia="es-EC"/>
+              </w:rPr>
+              <w:t>50</w:t>
+            </w:r>
+          </w:p>
+        </w:tc>
+        <w:tc>
+          <w:tcPr>
+            <w:tcW w:w="0" w:type="auto"/>
+            <w:hideMark/>
+          </w:tcPr>
+          <w:p>
+            <w:pPr>
+              <w:rPr>
+                <w:rFonts w:ascii="Times New Roman" w:eastAsia="Times New Roman" w:hAnsi="Times New Roman" w:cs="Times New Roman"/>
+                <w:sz w:val="24"/>
+                <w:szCs w:val="24"/>
+                <w:lang w:eastAsia="es-EC"/>
+              </w:rPr>
+            </w:pPr>
+          </w:p>
+        </w:tc>
+        <w:tc>
+          <w:tcPr>
+            <w:tcW w:w="0" w:type="auto"/>
+            <w:hideMark/>
+          </w:tcPr>
+          <w:p>
+            <w:pPr>
+              <w:rPr>
+                <w:rFonts w:ascii="Times New Roman" w:eastAsia="Times New Roman" w:hAnsi="Times New Roman" w:cs="Times New Roman"/>
+                <w:sz w:val="20"/>
+                <w:szCs w:val="20"/>
+                <w:lang w:eastAsia="es-EC"/>
+              </w:rPr>
+            </w:pPr>
+          </w:p>
+        </w:tc>
+        <w:tc>
+          <w:tcPr>
+            <w:tcW w:w="0" w:type="auto"/>
+            <w:hideMark/>
+          </w:tcPr>
+          <w:p>
+            <w:pPr>
+              <w:rPr>
+                <w:rFonts w:ascii="Times New Roman" w:eastAsia="Times New Roman" w:hAnsi="Times New Roman" w:cs="Times New Roman"/>
+                <w:sz w:val="24"/>
+                <w:szCs w:val="24"/>
+                <w:lang w:eastAsia="es-EC"/>
+              </w:rPr>
+            </w:pPr>
+            <w:r>
+              <w:rPr>
+                <w:rFonts w:ascii="Courier New" w:eastAsia="Times New Roman" w:hAnsi="Courier New" w:cs="Courier New"/>
+                <w:sz w:val="20"/>
+                <w:szCs w:val="20"/>
+                <w:lang w:eastAsia="es-EC"/>
+              </w:rPr>
+              <w:t>remaining</w:t>
+            </w:r>
+            <w:r>
+              <w:rPr>
+                <w:rFonts w:ascii="Times New Roman" w:eastAsia="Times New Roman" w:hAnsi="Times New Roman" w:cs="Times New Roman"/>
+                <w:sz w:val="24"/>
+                <w:szCs w:val="24"/>
+                <w:lang w:eastAsia="es-EC"/>
+              </w:rPr>
+              <w:t xml:space="preserve">, </w:t>
+            </w:r>
+            <w:r>
+              <w:rPr>
+                <w:rFonts w:ascii="Courier New" w:eastAsia="Times New Roman" w:hAnsi="Courier New" w:cs="Courier New"/>
+                <w:sz w:val="20"/>
+                <w:szCs w:val="20"/>
+                <w:lang w:eastAsia="es-EC"/>
+              </w:rPr>
+              <w:t>value</w:t>
+            </w:r>
+          </w:p>
+        </w:tc>
+      </w:tr>
+      <w:tr>
+        <w:trPr>
+          <w:jc w:val="center"/>
+        </w:trPr>
+        <w:tc>
+          <w:tcPr>
+            <w:tcW w:w="0" w:type="auto"/>
+            <w:hideMark/>
+          </w:tcPr>
+          <w:p>
+            <w:pPr>
+              <w:rPr>
+                <w:rFonts w:ascii="Times New Roman" w:eastAsia="Times New Roman" w:hAnsi="Times New Roman" w:cs="Times New Roman"/>
+                <w:sz w:val="24"/>
+                <w:szCs w:val="24"/>
+                <w:lang w:eastAsia="es-EC"/>
+              </w:rPr>
+            </w:pPr>
+            <w:r>
+              <w:rPr>
+                <w:rFonts w:ascii="Times New Roman" w:eastAsia="Times New Roman" w:hAnsi="Times New Roman" w:cs="Times New Roman"/>
+                <w:sz w:val="24"/>
+                <w:szCs w:val="24"/>
+                <w:lang w:eastAsia="es-EC"/>
+              </w:rPr>
+              <w:t>51</w:t>
+            </w:r>
+          </w:p>
+        </w:tc>
+        <w:tc>
+          <w:tcPr>
+            <w:tcW w:w="0" w:type="auto"/>
+            <w:hideMark/>
+          </w:tcPr>
+          <w:p>
+            <w:pPr>
+              <w:rPr>
+                <w:rFonts w:ascii="Times New Roman" w:eastAsia="Times New Roman" w:hAnsi="Times New Roman" w:cs="Times New Roman"/>
+                <w:sz w:val="24"/>
+                <w:szCs w:val="24"/>
+                <w:lang w:eastAsia="es-EC"/>
+              </w:rPr>
+            </w:pPr>
+            <w:r>
+              <w:rPr>
+                <w:rFonts w:ascii="Courier New" w:eastAsia="Times New Roman" w:hAnsi="Courier New" w:cs="Courier New"/>
+                <w:sz w:val="20"/>
+                <w:szCs w:val="20"/>
+                <w:lang w:eastAsia="es-EC"/>
+              </w:rPr>
+              <w:t>out</w:t>
+            </w:r>
+            <w:r>
+              <w:rPr>
+                <w:rFonts w:ascii="Times New Roman" w:eastAsia="Times New Roman" w:hAnsi="Times New Roman" w:cs="Times New Roman"/>
+                <w:sz w:val="24"/>
+                <w:szCs w:val="24"/>
+                <w:lang w:eastAsia="es-EC"/>
+              </w:rPr>
+              <w:t xml:space="preserve"> (mutación por </w:t>
+            </w:r>
+            <w:r>
+              <w:rPr>
+                <w:rFonts w:ascii="Courier New" w:eastAsia="Times New Roman" w:hAnsi="Courier New" w:cs="Courier New"/>
+                <w:sz w:val="20"/>
+                <w:szCs w:val="20"/>
+                <w:lang w:eastAsia="es-EC"/>
+              </w:rPr>
+              <w:t>append</w:t>
+            </w:r>
+            <w:r>
+              <w:rPr>
+                <w:rFonts w:ascii="Times New Roman" w:eastAsia="Times New Roman" w:hAnsi="Times New Roman" w:cs="Times New Roman"/>
+                <w:sz w:val="24"/>
+                <w:szCs w:val="24"/>
+                <w:lang w:eastAsia="es-EC"/>
+              </w:rPr>
+              <w:t>)</w:t>
+            </w:r>
+          </w:p>
+        </w:tc>
+        <w:tc>
+          <w:tcPr>
+            <w:tcW w:w="0" w:type="auto"/>
+            <w:hideMark/>
+          </w:tcPr>
+          <w:p>
+            <w:pPr>
+              <w:rPr>
+                <w:rFonts w:ascii="Times New Roman" w:eastAsia="Times New Roman" w:hAnsi="Times New Roman" w:cs="Times New Roman"/>
+                <w:sz w:val="24"/>
+                <w:szCs w:val="24"/>
+                <w:lang w:eastAsia="es-EC"/>
+              </w:rPr>
+            </w:pPr>
+            <w:r>
+              <w:rPr>
+                <w:rFonts w:ascii="Courier New" w:eastAsia="Times New Roman" w:hAnsi="Courier New" w:cs="Courier New"/>
+                <w:sz w:val="20"/>
+                <w:szCs w:val="20"/>
+                <w:lang w:eastAsia="es-EC"/>
+              </w:rPr>
+              <w:t>out</w:t>
+            </w:r>
+            <w:r>
+              <w:rPr>
+                <w:rFonts w:ascii="Times New Roman" w:eastAsia="Times New Roman" w:hAnsi="Times New Roman" w:cs="Times New Roman"/>
+                <w:sz w:val="24"/>
+                <w:szCs w:val="24"/>
+                <w:lang w:eastAsia="es-EC"/>
+              </w:rPr>
+              <w:t xml:space="preserve">, </w:t>
+            </w:r>
+            <w:r>
+              <w:rPr>
+                <w:rFonts w:ascii="Courier New" w:eastAsia="Times New Roman" w:hAnsi="Courier New" w:cs="Courier New"/>
+                <w:sz w:val="20"/>
+                <w:szCs w:val="20"/>
+                <w:lang w:eastAsia="es-EC"/>
+              </w:rPr>
+              <w:t>symbol</w:t>
+            </w:r>
+          </w:p>
+        </w:tc>
+        <w:tc>
+          <w:tcPr>
+            <w:tcW w:w="0" w:type="auto"/>
+            <w:hideMark/>
+          </w:tcPr>
+          <w:p>
+            <w:pPr>
+              <w:rPr>
+                <w:rFonts w:ascii="Times New Roman" w:eastAsia="Times New Roman" w:hAnsi="Times New Roman" w:cs="Times New Roman"/>
+                <w:sz w:val="24"/>
+                <w:szCs w:val="24"/>
+                <w:lang w:eastAsia="es-EC"/>
+              </w:rPr>
+            </w:pPr>
+          </w:p>
+        </w:tc>
+      </w:tr>
+      <w:tr>
+        <w:trPr>
+          <w:jc w:val="center"/>
+        </w:trPr>
+        <w:tc>
+          <w:tcPr>
+            <w:tcW w:w="0" w:type="auto"/>
+            <w:hideMark/>
+          </w:tcPr>
+          <w:p>
+            <w:pPr>
+              <w:rPr>
+                <w:rFonts w:ascii="Times New Roman" w:eastAsia="Times New Roman" w:hAnsi="Times New Roman" w:cs="Times New Roman"/>
+                <w:sz w:val="24"/>
+                <w:szCs w:val="24"/>
+                <w:lang w:eastAsia="es-EC"/>
+              </w:rPr>
+            </w:pPr>
+            <w:r>
+              <w:rPr>
+                <w:rFonts w:ascii="Times New Roman" w:eastAsia="Times New Roman" w:hAnsi="Times New Roman" w:cs="Times New Roman"/>
+                <w:sz w:val="24"/>
+                <w:szCs w:val="24"/>
+                <w:lang w:eastAsia="es-EC"/>
+              </w:rPr>
+              <w:t>52</w:t>
+            </w:r>
+          </w:p>
+        </w:tc>
+        <w:tc>
+          <w:tcPr>
+            <w:tcW w:w="0" w:type="auto"/>
+            <w:hideMark/>
+          </w:tcPr>
+          <w:p>
+            <w:pPr>
+              <w:rPr>
+                <w:rFonts w:ascii="Times New Roman" w:eastAsia="Times New Roman" w:hAnsi="Times New Roman" w:cs="Times New Roman"/>
+                <w:sz w:val="24"/>
+                <w:szCs w:val="24"/>
+                <w:lang w:eastAsia="es-EC"/>
+              </w:rPr>
+            </w:pPr>
+            <w:r>
+              <w:rPr>
+                <w:rFonts w:ascii="Courier New" w:eastAsia="Times New Roman" w:hAnsi="Courier New" w:cs="Courier New"/>
+                <w:sz w:val="20"/>
+                <w:szCs w:val="20"/>
+                <w:lang w:eastAsia="es-EC"/>
+              </w:rPr>
+              <w:t>remaining</w:t>
+            </w:r>
+            <w:r>
+              <w:rPr>
+                <w:rFonts w:ascii="Times New Roman" w:eastAsia="Times New Roman" w:hAnsi="Times New Roman" w:cs="Times New Roman"/>
+                <w:sz w:val="24"/>
+                <w:szCs w:val="24"/>
+                <w:lang w:eastAsia="es-EC"/>
+              </w:rPr>
+              <w:t xml:space="preserve"> (redefinición)</w:t>
+            </w:r>
+          </w:p>
+        </w:tc>
+        <w:tc>
+          <w:tcPr>
+            <w:tcW w:w="0" w:type="auto"/>
+            <w:hideMark/>
+          </w:tcPr>
+          <w:p>
+            <w:pPr>
+              <w:rPr>
+                <w:rFonts w:ascii="Times New Roman" w:eastAsia="Times New Roman" w:hAnsi="Times New Roman" w:cs="Times New Roman"/>
+                <w:sz w:val="24"/>
+                <w:szCs w:val="24"/>
+                <w:lang w:eastAsia="es-EC"/>
+              </w:rPr>
+            </w:pPr>
+            <w:r>
+              <w:rPr>
+                <w:rFonts w:ascii="Courier New" w:eastAsia="Times New Roman" w:hAnsi="Courier New" w:cs="Courier New"/>
+                <w:sz w:val="20"/>
+                <w:szCs w:val="20"/>
+                <w:lang w:eastAsia="es-EC"/>
+              </w:rPr>
+              <w:t>remaining</w:t>
+            </w:r>
+            <w:r>
+              <w:rPr>
+                <w:rFonts w:ascii="Times New Roman" w:eastAsia="Times New Roman" w:hAnsi="Times New Roman" w:cs="Times New Roman"/>
+                <w:sz w:val="24"/>
+                <w:szCs w:val="24"/>
+                <w:lang w:eastAsia="es-EC"/>
+              </w:rPr>
+              <w:t xml:space="preserve">, </w:t>
+            </w:r>
+            <w:r>
+              <w:rPr>
+                <w:rFonts w:ascii="Courier New" w:eastAsia="Times New Roman" w:hAnsi="Courier New" w:cs="Courier New"/>
+                <w:sz w:val="20"/>
+                <w:szCs w:val="20"/>
+                <w:lang w:eastAsia="es-EC"/>
+              </w:rPr>
+              <w:t>value</w:t>
+            </w:r>
+          </w:p>
+        </w:tc>
+        <w:tc>
+          <w:tcPr>
+            <w:tcW w:w="0" w:type="auto"/>
+            <w:hideMark/>
+          </w:tcPr>
+          <w:p>
+            <w:pPr>
+              <w:rPr>
+                <w:rFonts w:ascii="Times New Roman" w:eastAsia="Times New Roman" w:hAnsi="Times New Roman" w:cs="Times New Roman"/>
+                <w:sz w:val="24"/>
+                <w:szCs w:val="24"/>
+                <w:lang w:eastAsia="es-EC"/>
+              </w:rPr>
+            </w:pPr>
+          </w:p>
+        </w:tc>
+      </w:tr>
+      <w:tr>
+        <w:trPr>
+          <w:jc w:val="center"/>
+        </w:trPr>
+        <w:tc>
+          <w:tcPr>
+            <w:tcW w:w="0" w:type="auto"/>
+            <w:hideMark/>
+          </w:tcPr>
+          <w:p>
+            <w:pPr>
+              <w:rPr>
+                <w:rFonts w:ascii="Times New Roman" w:eastAsia="Times New Roman" w:hAnsi="Times New Roman" w:cs="Times New Roman"/>
+                <w:sz w:val="24"/>
+                <w:szCs w:val="24"/>
+                <w:lang w:eastAsia="es-EC"/>
+              </w:rPr>
+            </w:pPr>
+            <w:r>
+              <w:rPr>
+                <w:rFonts w:ascii="Times New Roman" w:eastAsia="Times New Roman" w:hAnsi="Times New Roman" w:cs="Times New Roman"/>
+                <w:sz w:val="24"/>
+                <w:szCs w:val="24"/>
+                <w:lang w:eastAsia="es-EC"/>
+              </w:rPr>
+              <w:t>53</w:t>
+            </w:r>
+          </w:p>
+        </w:tc>
+        <w:tc>
+          <w:tcPr>
+            <w:tcW w:w="0" w:type="auto"/>
+            <w:hideMark/>
+          </w:tcPr>
+          <w:p>
+            <w:pPr>
+              <w:rPr>
+                <w:rFonts w:ascii="Times New Roman" w:eastAsia="Times New Roman" w:hAnsi="Times New Roman" w:cs="Times New Roman"/>
+                <w:sz w:val="24"/>
+                <w:szCs w:val="24"/>
+                <w:lang w:eastAsia="es-EC"/>
+              </w:rPr>
+            </w:pPr>
+          </w:p>
+        </w:tc>
+        <w:tc>
+          <w:tcPr>
+            <w:tcW w:w="0" w:type="auto"/>
+            <w:hideMark/>
+          </w:tcPr>
+          <w:p>
+            <w:pPr>
+              <w:rPr>
+                <w:rFonts w:ascii="Times New Roman" w:eastAsia="Times New Roman" w:hAnsi="Times New Roman" w:cs="Times New Roman"/>
+                <w:sz w:val="24"/>
+                <w:szCs w:val="24"/>
+                <w:lang w:eastAsia="es-EC"/>
+              </w:rPr>
+            </w:pPr>
+            <w:r>
+              <w:rPr>
+                <w:rFonts w:ascii="Courier New" w:eastAsia="Times New Roman" w:hAnsi="Courier New" w:cs="Courier New"/>
+                <w:sz w:val="20"/>
+                <w:szCs w:val="20"/>
+                <w:lang w:eastAsia="es-EC"/>
+              </w:rPr>
+              <w:t>out</w:t>
+            </w:r>
+          </w:p>
+        </w:tc>
+        <w:tc>
+          <w:tcPr>
+            <w:tcW w:w="0" w:type="auto"/>
+            <w:hideMark/>
+          </w:tcPr>
+          <w:p>
+            <w:pPr>
+              <w:rPr>
+                <w:rFonts w:ascii="Times New Roman" w:eastAsia="Times New Roman" w:hAnsi="Times New Roman" w:cs="Times New Roman"/>
+                <w:sz w:val="24"/>
+                <w:szCs w:val="24"/>
+                <w:lang w:eastAsia="es-EC"/>
+              </w:rPr>
+            </w:pPr>
+          </w:p>
+        </w:tc>
+      </w:tr>
+    </w:tbl>
+    <w:p/>
+    <w:tbl>
+      <w:tblPr>
+        <w:tblStyle w:val="Tablaconcuadrcula"/>
+        <w:tblW w:w="0" w:type="auto"/>
+        <w:jc w:val="center"/>
+        <w:tblLook w:val="04A0" w:firstRow="1" w:lastRow="0" w:firstColumn="1" w:lastColumn="0" w:noHBand="0" w:noVBand="1"/>
+      </w:tblPr>
+      <w:tblGrid>
+        <w:gridCol w:w="2263"/>
+        <w:gridCol w:w="1270"/>
+        <w:gridCol w:w="1270"/>
+      </w:tblGrid>
+      <w:tr>
+        <w:trPr>
+          <w:jc w:val="center"/>
+        </w:trPr>
+        <w:tc>
+          <w:tcPr>
+            <w:tcW w:w="0" w:type="auto"/>
+            <w:hideMark/>
+          </w:tcPr>
+          <w:p>
+            <w:pPr>
+              <w:jc w:val="center"/>
+              <w:rPr>
+                <w:rFonts w:ascii="Times New Roman" w:eastAsia="Times New Roman" w:hAnsi="Times New Roman" w:cs="Times New Roman"/>
+                <w:b/>
+                <w:bCs/>
+                <w:sz w:val="24"/>
+                <w:szCs w:val="24"/>
+                <w:lang w:val="en-US" w:eastAsia="es-EC"/>
+              </w:rPr>
+            </w:pPr>
+            <w:r>
+              <w:rPr>
+                <w:rFonts w:ascii="Times New Roman" w:eastAsia="Times New Roman" w:hAnsi="Times New Roman" w:cs="Times New Roman"/>
+                <w:b/>
+                <w:bCs/>
+                <w:sz w:val="24"/>
+                <w:szCs w:val="24"/>
+                <w:lang w:val="en-US" w:eastAsia="es-EC"/>
+              </w:rPr>
+              <w:t>definition – use pair</w:t>
+            </w:r>
+            <w:r>
+              <w:rPr>
+                <w:rFonts w:ascii="Times New Roman" w:eastAsia="Times New Roman" w:hAnsi="Times New Roman" w:cs="Times New Roman"/>
+                <w:b/>
+                <w:bCs/>
+                <w:sz w:val="24"/>
+                <w:szCs w:val="24"/>
+                <w:lang w:val="en-US" w:eastAsia="es-EC"/>
+              </w:rPr>
+              <w:br/>
+              <w:t>(start line, end line)</w:t>
+            </w:r>
+          </w:p>
+        </w:tc>
+        <w:tc>
+          <w:tcPr>
+            <w:tcW w:w="0" w:type="auto"/>
+            <w:hideMark/>
+          </w:tcPr>
+          <w:p>
+            <w:pPr>
+              <w:jc w:val="center"/>
+              <w:rPr>
+                <w:rFonts w:ascii="Times New Roman" w:eastAsia="Times New Roman" w:hAnsi="Times New Roman" w:cs="Times New Roman"/>
+                <w:b/>
+                <w:bCs/>
+                <w:sz w:val="24"/>
+                <w:szCs w:val="24"/>
+                <w:lang w:eastAsia="es-EC"/>
+              </w:rPr>
+            </w:pPr>
+            <w:r>
+              <w:rPr>
+                <w:rFonts w:ascii="Times New Roman" w:eastAsia="Times New Roman" w:hAnsi="Times New Roman" w:cs="Times New Roman"/>
+                <w:b/>
+                <w:bCs/>
+                <w:sz w:val="24"/>
+                <w:szCs w:val="24"/>
+                <w:lang w:eastAsia="es-EC"/>
+              </w:rPr>
+              <w:t>c-use</w:t>
+            </w:r>
+          </w:p>
+        </w:tc>
+        <w:tc>
+          <w:tcPr>
+            <w:tcW w:w="0" w:type="auto"/>
+            <w:hideMark/>
+          </w:tcPr>
+          <w:p>
+            <w:pPr>
+              <w:jc w:val="center"/>
+              <w:rPr>
+                <w:rFonts w:ascii="Times New Roman" w:eastAsia="Times New Roman" w:hAnsi="Times New Roman" w:cs="Times New Roman"/>
+                <w:b/>
+                <w:bCs/>
+                <w:sz w:val="24"/>
+                <w:szCs w:val="24"/>
+                <w:lang w:eastAsia="es-EC"/>
+              </w:rPr>
+            </w:pPr>
+            <w:r>
+              <w:rPr>
+                <w:rFonts w:ascii="Times New Roman" w:eastAsia="Times New Roman" w:hAnsi="Times New Roman" w:cs="Times New Roman"/>
+                <w:b/>
+                <w:bCs/>
+                <w:sz w:val="24"/>
+                <w:szCs w:val="24"/>
+                <w:lang w:eastAsia="es-EC"/>
+              </w:rPr>
+              <w:t>p-use</w:t>
+            </w:r>
+          </w:p>
+        </w:tc>
+      </w:tr>
+      <w:tr>
+        <w:trPr>
+          <w:jc w:val="center"/>
+        </w:trPr>
+        <w:tc>
+          <w:tcPr>
+            <w:tcW w:w="0" w:type="auto"/>
+            <w:hideMark/>
+          </w:tcPr>
+          <w:p>
+            <w:pPr>
+              <w:rPr>
+                <w:rFonts w:ascii="Times New Roman" w:eastAsia="Times New Roman" w:hAnsi="Times New Roman" w:cs="Times New Roman"/>
+                <w:sz w:val="24"/>
+                <w:szCs w:val="24"/>
+                <w:lang w:eastAsia="es-EC"/>
+              </w:rPr>
+            </w:pPr>
+            <w:r>
+              <w:rPr>
+                <w:rFonts w:ascii="Times New Roman" w:eastAsia="Times New Roman" w:hAnsi="Times New Roman" w:cs="Times New Roman"/>
+                <w:sz w:val="24"/>
+                <w:szCs w:val="24"/>
+                <w:lang w:eastAsia="es-EC"/>
+              </w:rPr>
+              <w:t>(40, 41a)</w:t>
+            </w:r>
+          </w:p>
+        </w:tc>
+        <w:tc>
+          <w:tcPr>
+            <w:tcW w:w="0" w:type="auto"/>
+            <w:hideMark/>
+          </w:tcPr>
+          <w:p>
+            <w:pPr>
+              <w:rPr>
+                <w:rFonts w:ascii="Times New Roman" w:eastAsia="Times New Roman" w:hAnsi="Times New Roman" w:cs="Times New Roman"/>
+                <w:sz w:val="24"/>
+                <w:szCs w:val="24"/>
+                <w:lang w:eastAsia="es-EC"/>
+              </w:rPr>
+            </w:pPr>
+          </w:p>
+        </w:tc>
+        <w:tc>
+          <w:tcPr>
+            <w:tcW w:w="0" w:type="auto"/>
+            <w:hideMark/>
+          </w:tcPr>
+          <w:p>
+            <w:pPr>
+              <w:rPr>
+                <w:rFonts w:ascii="Times New Roman" w:eastAsia="Times New Roman" w:hAnsi="Times New Roman" w:cs="Times New Roman"/>
+                <w:sz w:val="24"/>
+                <w:szCs w:val="24"/>
+                <w:lang w:eastAsia="es-EC"/>
+              </w:rPr>
+            </w:pPr>
+            <w:r>
+              <w:rPr>
+                <w:rFonts w:ascii="Times New Roman" w:eastAsia="Times New Roman" w:hAnsi="Times New Roman" w:cs="Times New Roman"/>
+                <w:sz w:val="24"/>
+                <w:szCs w:val="24"/>
+                <w:lang w:eastAsia="es-EC"/>
+              </w:rPr>
+              <w:t>n</w:t>
+            </w:r>
+          </w:p>
+        </w:tc>
+      </w:tr>
+      <w:tr>
+        <w:trPr>
+          <w:jc w:val="center"/>
+        </w:trPr>
+        <w:tc>
+          <w:tcPr>
+            <w:tcW w:w="0" w:type="auto"/>
+            <w:hideMark/>
+          </w:tcPr>
+          <w:p>
+            <w:pPr>
+              <w:rPr>
+                <w:rFonts w:ascii="Times New Roman" w:eastAsia="Times New Roman" w:hAnsi="Times New Roman" w:cs="Times New Roman"/>
+                <w:sz w:val="24"/>
+                <w:szCs w:val="24"/>
+                <w:lang w:eastAsia="es-EC"/>
+              </w:rPr>
+            </w:pPr>
+            <w:r>
+              <w:rPr>
+                <w:rFonts w:ascii="Times New Roman" w:eastAsia="Times New Roman" w:hAnsi="Times New Roman" w:cs="Times New Roman"/>
+                <w:sz w:val="24"/>
+                <w:szCs w:val="24"/>
+                <w:lang w:eastAsia="es-EC"/>
+              </w:rPr>
+              <w:t>(40, 41b)</w:t>
+            </w:r>
+          </w:p>
+        </w:tc>
+        <w:tc>
+          <w:tcPr>
+            <w:tcW w:w="0" w:type="auto"/>
+            <w:hideMark/>
+          </w:tcPr>
+          <w:p>
+            <w:pPr>
+              <w:rPr>
+                <w:rFonts w:ascii="Times New Roman" w:eastAsia="Times New Roman" w:hAnsi="Times New Roman" w:cs="Times New Roman"/>
+                <w:sz w:val="24"/>
+                <w:szCs w:val="24"/>
+                <w:lang w:eastAsia="es-EC"/>
+              </w:rPr>
+            </w:pPr>
+          </w:p>
+        </w:tc>
+        <w:tc>
+          <w:tcPr>
+            <w:tcW w:w="0" w:type="auto"/>
+            <w:hideMark/>
+          </w:tcPr>
+          <w:p>
+            <w:pPr>
+              <w:rPr>
+                <w:rFonts w:ascii="Times New Roman" w:eastAsia="Times New Roman" w:hAnsi="Times New Roman" w:cs="Times New Roman"/>
+                <w:sz w:val="24"/>
+                <w:szCs w:val="24"/>
+                <w:lang w:eastAsia="es-EC"/>
+              </w:rPr>
+            </w:pPr>
+            <w:r>
+              <w:rPr>
+                <w:rFonts w:ascii="Times New Roman" w:eastAsia="Times New Roman" w:hAnsi="Times New Roman" w:cs="Times New Roman"/>
+                <w:sz w:val="24"/>
+                <w:szCs w:val="24"/>
+                <w:lang w:eastAsia="es-EC"/>
+              </w:rPr>
+              <w:t>n</w:t>
+            </w:r>
+          </w:p>
+        </w:tc>
+      </w:tr>
+      <w:tr>
+        <w:trPr>
+          <w:jc w:val="center"/>
+        </w:trPr>
+        <w:tc>
+          <w:tcPr>
+            <w:tcW w:w="0" w:type="auto"/>
+            <w:hideMark/>
+          </w:tcPr>
+          <w:p>
+            <w:pPr>
+              <w:rPr>
+                <w:rFonts w:ascii="Times New Roman" w:eastAsia="Times New Roman" w:hAnsi="Times New Roman" w:cs="Times New Roman"/>
+                <w:sz w:val="24"/>
+                <w:szCs w:val="24"/>
+                <w:lang w:eastAsia="es-EC"/>
+              </w:rPr>
+            </w:pPr>
+            <w:r>
+              <w:rPr>
+                <w:rFonts w:ascii="Times New Roman" w:eastAsia="Times New Roman" w:hAnsi="Times New Roman" w:cs="Times New Roman"/>
+                <w:sz w:val="24"/>
+                <w:szCs w:val="24"/>
+                <w:lang w:eastAsia="es-EC"/>
+              </w:rPr>
+              <w:t>(40, 43)</w:t>
+            </w:r>
+          </w:p>
+        </w:tc>
+        <w:tc>
+          <w:tcPr>
+            <w:tcW w:w="0" w:type="auto"/>
+            <w:hideMark/>
+          </w:tcPr>
+          <w:p>
+            <w:pPr>
+              <w:rPr>
+                <w:rFonts w:ascii="Times New Roman" w:eastAsia="Times New Roman" w:hAnsi="Times New Roman" w:cs="Times New Roman"/>
+                <w:sz w:val="24"/>
+                <w:szCs w:val="24"/>
+                <w:lang w:eastAsia="es-EC"/>
+              </w:rPr>
+            </w:pPr>
+          </w:p>
+        </w:tc>
+        <w:tc>
+          <w:tcPr>
+            <w:tcW w:w="0" w:type="auto"/>
+            <w:hideMark/>
+          </w:tcPr>
+          <w:p>
+            <w:pPr>
+              <w:rPr>
+                <w:rFonts w:ascii="Times New Roman" w:eastAsia="Times New Roman" w:hAnsi="Times New Roman" w:cs="Times New Roman"/>
+                <w:sz w:val="24"/>
+                <w:szCs w:val="24"/>
+                <w:lang w:eastAsia="es-EC"/>
+              </w:rPr>
+            </w:pPr>
+            <w:r>
+              <w:rPr>
+                <w:rFonts w:ascii="Times New Roman" w:eastAsia="Times New Roman" w:hAnsi="Times New Roman" w:cs="Times New Roman"/>
+                <w:sz w:val="24"/>
+                <w:szCs w:val="24"/>
+                <w:lang w:eastAsia="es-EC"/>
+              </w:rPr>
+              <w:t>n</w:t>
+            </w:r>
+          </w:p>
+        </w:tc>
+      </w:tr>
+      <w:tr>
+        <w:trPr>
+          <w:jc w:val="center"/>
+        </w:trPr>
+        <w:tc>
+          <w:tcPr>
+            <w:tcW w:w="0" w:type="auto"/>
+            <w:hideMark/>
+          </w:tcPr>
+          <w:p>
+            <w:pPr>
+              <w:rPr>
+                <w:rFonts w:ascii="Times New Roman" w:eastAsia="Times New Roman" w:hAnsi="Times New Roman" w:cs="Times New Roman"/>
+                <w:sz w:val="24"/>
+                <w:szCs w:val="24"/>
+                <w:lang w:eastAsia="es-EC"/>
+              </w:rPr>
+            </w:pPr>
+            <w:r>
+              <w:rPr>
+                <w:rFonts w:ascii="Times New Roman" w:eastAsia="Times New Roman" w:hAnsi="Times New Roman" w:cs="Times New Roman"/>
+                <w:sz w:val="24"/>
+                <w:szCs w:val="24"/>
+                <w:lang w:eastAsia="es-EC"/>
+              </w:rPr>
+              <w:t>(40, 45)</w:t>
+            </w:r>
+          </w:p>
+        </w:tc>
+        <w:tc>
+          <w:tcPr>
+            <w:tcW w:w="0" w:type="auto"/>
+            <w:hideMark/>
+          </w:tcPr>
+          <w:p>
+            <w:pPr>
+              <w:rPr>
+                <w:rFonts w:ascii="Times New Roman" w:eastAsia="Times New Roman" w:hAnsi="Times New Roman" w:cs="Times New Roman"/>
+                <w:sz w:val="24"/>
+                <w:szCs w:val="24"/>
+                <w:lang w:eastAsia="es-EC"/>
+              </w:rPr>
+            </w:pPr>
+          </w:p>
+        </w:tc>
+        <w:tc>
+          <w:tcPr>
+            <w:tcW w:w="0" w:type="auto"/>
+            <w:hideMark/>
+          </w:tcPr>
+          <w:p>
+            <w:pPr>
+              <w:rPr>
+                <w:rFonts w:ascii="Times New Roman" w:eastAsia="Times New Roman" w:hAnsi="Times New Roman" w:cs="Times New Roman"/>
+                <w:sz w:val="24"/>
+                <w:szCs w:val="24"/>
+                <w:lang w:eastAsia="es-EC"/>
+              </w:rPr>
+            </w:pPr>
+            <w:r>
+              <w:rPr>
+                <w:rFonts w:ascii="Times New Roman" w:eastAsia="Times New Roman" w:hAnsi="Times New Roman" w:cs="Times New Roman"/>
+                <w:sz w:val="24"/>
+                <w:szCs w:val="24"/>
+                <w:lang w:eastAsia="es-EC"/>
+              </w:rPr>
+              <w:t>n</w:t>
+            </w:r>
+          </w:p>
+        </w:tc>
+      </w:tr>
+      <w:tr>
+        <w:trPr>
+          <w:jc w:val="center"/>
+        </w:trPr>
+        <w:tc>
+          <w:tcPr>
+            <w:tcW w:w="0" w:type="auto"/>
+            <w:hideMark/>
+          </w:tcPr>
+          <w:p>
+            <w:pPr>
+              <w:rPr>
+                <w:rFonts w:ascii="Times New Roman" w:eastAsia="Times New Roman" w:hAnsi="Times New Roman" w:cs="Times New Roman"/>
+                <w:sz w:val="24"/>
+                <w:szCs w:val="24"/>
+                <w:lang w:eastAsia="es-EC"/>
+              </w:rPr>
+            </w:pPr>
+            <w:r>
+              <w:rPr>
+                <w:rFonts w:ascii="Times New Roman" w:eastAsia="Times New Roman" w:hAnsi="Times New Roman" w:cs="Times New Roman"/>
+                <w:sz w:val="24"/>
+                <w:szCs w:val="24"/>
+                <w:lang w:eastAsia="es-EC"/>
+              </w:rPr>
+              <w:t>(40, 48)</w:t>
+            </w:r>
+          </w:p>
+        </w:tc>
+        <w:tc>
+          <w:tcPr>
+            <w:tcW w:w="0" w:type="auto"/>
+            <w:hideMark/>
+          </w:tcPr>
+          <w:p>
+            <w:pPr>
+              <w:rPr>
+                <w:rFonts w:ascii="Times New Roman" w:eastAsia="Times New Roman" w:hAnsi="Times New Roman" w:cs="Times New Roman"/>
+                <w:sz w:val="24"/>
+                <w:szCs w:val="24"/>
+                <w:lang w:eastAsia="es-EC"/>
+              </w:rPr>
+            </w:pPr>
+            <w:r>
+              <w:rPr>
+                <w:rFonts w:ascii="Times New Roman" w:eastAsia="Times New Roman" w:hAnsi="Times New Roman" w:cs="Times New Roman"/>
+                <w:sz w:val="24"/>
+                <w:szCs w:val="24"/>
+                <w:lang w:eastAsia="es-EC"/>
+              </w:rPr>
+              <w:t>n</w:t>
+            </w:r>
+          </w:p>
+        </w:tc>
+        <w:tc>
+          <w:tcPr>
+            <w:tcW w:w="0" w:type="auto"/>
+            <w:hideMark/>
+          </w:tcPr>
+          <w:p>
+            <w:pPr>
+              <w:rPr>
+                <w:rFonts w:ascii="Times New Roman" w:eastAsia="Times New Roman" w:hAnsi="Times New Roman" w:cs="Times New Roman"/>
+                <w:sz w:val="24"/>
+                <w:szCs w:val="24"/>
+                <w:lang w:eastAsia="es-EC"/>
+              </w:rPr>
+            </w:pPr>
+          </w:p>
+        </w:tc>
+      </w:tr>
+      <w:tr>
+        <w:trPr>
+          <w:jc w:val="center"/>
+        </w:trPr>
+        <w:tc>
+          <w:tcPr>
+            <w:tcW w:w="0" w:type="auto"/>
+            <w:hideMark/>
+          </w:tcPr>
+          <w:p>
+            <w:pPr>
+              <w:rPr>
+                <w:rFonts w:ascii="Times New Roman" w:eastAsia="Times New Roman" w:hAnsi="Times New Roman" w:cs="Times New Roman"/>
+                <w:sz w:val="24"/>
+                <w:szCs w:val="24"/>
+                <w:lang w:eastAsia="es-EC"/>
+              </w:rPr>
+            </w:pPr>
+            <w:r>
+              <w:rPr>
+                <w:rFonts w:ascii="Times New Roman" w:eastAsia="Times New Roman" w:hAnsi="Times New Roman" w:cs="Times New Roman"/>
+                <w:sz w:val="24"/>
+                <w:szCs w:val="24"/>
+                <w:lang w:eastAsia="es-EC"/>
+              </w:rPr>
+              <w:t>(47, 51)</w:t>
+            </w:r>
+          </w:p>
+        </w:tc>
+        <w:tc>
+          <w:tcPr>
+            <w:tcW w:w="0" w:type="auto"/>
+            <w:hideMark/>
+          </w:tcPr>
+          <w:p>
+            <w:pPr>
+              <w:rPr>
+                <w:rFonts w:ascii="Times New Roman" w:eastAsia="Times New Roman" w:hAnsi="Times New Roman" w:cs="Times New Roman"/>
+                <w:sz w:val="24"/>
+                <w:szCs w:val="24"/>
+                <w:lang w:eastAsia="es-EC"/>
+              </w:rPr>
+            </w:pPr>
+            <w:r>
+              <w:rPr>
+                <w:rFonts w:ascii="Times New Roman" w:eastAsia="Times New Roman" w:hAnsi="Times New Roman" w:cs="Times New Roman"/>
+                <w:sz w:val="24"/>
+                <w:szCs w:val="24"/>
+                <w:lang w:eastAsia="es-EC"/>
+              </w:rPr>
+              <w:t>out</w:t>
+            </w:r>
+          </w:p>
+        </w:tc>
+        <w:tc>
+          <w:tcPr>
+            <w:tcW w:w="0" w:type="auto"/>
+            <w:hideMark/>
+          </w:tcPr>
+          <w:p>
+            <w:pPr>
+              <w:rPr>
+                <w:rFonts w:ascii="Times New Roman" w:eastAsia="Times New Roman" w:hAnsi="Times New Roman" w:cs="Times New Roman"/>
+                <w:sz w:val="24"/>
+                <w:szCs w:val="24"/>
+                <w:lang w:eastAsia="es-EC"/>
+              </w:rPr>
+            </w:pPr>
+          </w:p>
+        </w:tc>
+      </w:tr>
+      <w:tr>
+        <w:trPr>
+          <w:jc w:val="center"/>
+        </w:trPr>
+        <w:tc>
+          <w:tcPr>
+            <w:tcW w:w="0" w:type="auto"/>
+            <w:hideMark/>
+          </w:tcPr>
+          <w:p>
+            <w:pPr>
+              <w:rPr>
+                <w:rFonts w:ascii="Times New Roman" w:eastAsia="Times New Roman" w:hAnsi="Times New Roman" w:cs="Times New Roman"/>
+                <w:sz w:val="24"/>
+                <w:szCs w:val="24"/>
+                <w:lang w:eastAsia="es-EC"/>
+              </w:rPr>
+            </w:pPr>
+            <w:r>
+              <w:rPr>
+                <w:rFonts w:ascii="Times New Roman" w:eastAsia="Times New Roman" w:hAnsi="Times New Roman" w:cs="Times New Roman"/>
+                <w:sz w:val="24"/>
+                <w:szCs w:val="24"/>
+                <w:lang w:eastAsia="es-EC"/>
+              </w:rPr>
+              <w:t>(47, 53)</w:t>
+            </w:r>
+          </w:p>
+        </w:tc>
+        <w:tc>
+          <w:tcPr>
+            <w:tcW w:w="0" w:type="auto"/>
+            <w:hideMark/>
+          </w:tcPr>
+          <w:p>
+            <w:pPr>
+              <w:rPr>
+                <w:rFonts w:ascii="Times New Roman" w:eastAsia="Times New Roman" w:hAnsi="Times New Roman" w:cs="Times New Roman"/>
+                <w:sz w:val="24"/>
+                <w:szCs w:val="24"/>
+                <w:lang w:eastAsia="es-EC"/>
+              </w:rPr>
+            </w:pPr>
+            <w:r>
+              <w:rPr>
+                <w:rFonts w:ascii="Times New Roman" w:eastAsia="Times New Roman" w:hAnsi="Times New Roman" w:cs="Times New Roman"/>
+                <w:sz w:val="24"/>
+                <w:szCs w:val="24"/>
+                <w:lang w:eastAsia="es-EC"/>
+              </w:rPr>
+              <w:t>out</w:t>
+            </w:r>
+          </w:p>
+        </w:tc>
+        <w:tc>
+          <w:tcPr>
+            <w:tcW w:w="0" w:type="auto"/>
+            <w:hideMark/>
+          </w:tcPr>
+          <w:p>
+            <w:pPr>
+              <w:rPr>
+                <w:rFonts w:ascii="Times New Roman" w:eastAsia="Times New Roman" w:hAnsi="Times New Roman" w:cs="Times New Roman"/>
+                <w:sz w:val="24"/>
+                <w:szCs w:val="24"/>
+                <w:lang w:eastAsia="es-EC"/>
+              </w:rPr>
+            </w:pPr>
+          </w:p>
+        </w:tc>
+      </w:tr>
+      <w:tr>
+        <w:trPr>
+          <w:jc w:val="center"/>
+        </w:trPr>
+        <w:tc>
+          <w:tcPr>
+            <w:tcW w:w="0" w:type="auto"/>
+            <w:hideMark/>
+          </w:tcPr>
+          <w:p>
+            <w:pPr>
+              <w:rPr>
+                <w:rFonts w:ascii="Times New Roman" w:eastAsia="Times New Roman" w:hAnsi="Times New Roman" w:cs="Times New Roman"/>
+                <w:sz w:val="24"/>
+                <w:szCs w:val="24"/>
+                <w:lang w:eastAsia="es-EC"/>
+              </w:rPr>
+            </w:pPr>
+            <w:r>
+              <w:rPr>
+                <w:rFonts w:ascii="Times New Roman" w:eastAsia="Times New Roman" w:hAnsi="Times New Roman" w:cs="Times New Roman"/>
+                <w:sz w:val="24"/>
+                <w:szCs w:val="24"/>
+                <w:lang w:eastAsia="es-EC"/>
+              </w:rPr>
+              <w:t>(51, 51)</w:t>
+            </w:r>
+          </w:p>
+        </w:tc>
+        <w:tc>
+          <w:tcPr>
+            <w:tcW w:w="0" w:type="auto"/>
+            <w:hideMark/>
+          </w:tcPr>
+          <w:p>
+            <w:pPr>
+              <w:rPr>
+                <w:rFonts w:ascii="Times New Roman" w:eastAsia="Times New Roman" w:hAnsi="Times New Roman" w:cs="Times New Roman"/>
+                <w:sz w:val="24"/>
+                <w:szCs w:val="24"/>
+                <w:lang w:eastAsia="es-EC"/>
+              </w:rPr>
+            </w:pPr>
+            <w:r>
+              <w:rPr>
+                <w:rFonts w:ascii="Times New Roman" w:eastAsia="Times New Roman" w:hAnsi="Times New Roman" w:cs="Times New Roman"/>
+                <w:sz w:val="24"/>
+                <w:szCs w:val="24"/>
+                <w:lang w:eastAsia="es-EC"/>
+              </w:rPr>
+              <w:t>out</w:t>
+            </w:r>
+          </w:p>
+        </w:tc>
+        <w:tc>
+          <w:tcPr>
+            <w:tcW w:w="0" w:type="auto"/>
+            <w:hideMark/>
+          </w:tcPr>
+          <w:p>
+            <w:pPr>
+              <w:rPr>
+                <w:rFonts w:ascii="Times New Roman" w:eastAsia="Times New Roman" w:hAnsi="Times New Roman" w:cs="Times New Roman"/>
+                <w:sz w:val="24"/>
+                <w:szCs w:val="24"/>
+                <w:lang w:eastAsia="es-EC"/>
+              </w:rPr>
+            </w:pPr>
+          </w:p>
+        </w:tc>
+      </w:tr>
+      <w:tr>
+        <w:trPr>
+          <w:jc w:val="center"/>
+        </w:trPr>
+        <w:tc>
+          <w:tcPr>
+            <w:tcW w:w="0" w:type="auto"/>
+            <w:hideMark/>
+          </w:tcPr>
+          <w:p>
+            <w:pPr>
+              <w:rPr>
+                <w:rFonts w:ascii="Times New Roman" w:eastAsia="Times New Roman" w:hAnsi="Times New Roman" w:cs="Times New Roman"/>
+                <w:sz w:val="24"/>
+                <w:szCs w:val="24"/>
+                <w:lang w:eastAsia="es-EC"/>
+              </w:rPr>
+            </w:pPr>
+            <w:r>
+              <w:rPr>
+                <w:rFonts w:ascii="Times New Roman" w:eastAsia="Times New Roman" w:hAnsi="Times New Roman" w:cs="Times New Roman"/>
+                <w:sz w:val="24"/>
+                <w:szCs w:val="24"/>
+                <w:lang w:eastAsia="es-EC"/>
+              </w:rPr>
+              <w:t>(51, 53)</w:t>
+            </w:r>
+          </w:p>
+        </w:tc>
+        <w:tc>
+          <w:tcPr>
+            <w:tcW w:w="0" w:type="auto"/>
+            <w:hideMark/>
+          </w:tcPr>
+          <w:p>
+            <w:pPr>
+              <w:rPr>
+                <w:rFonts w:ascii="Times New Roman" w:eastAsia="Times New Roman" w:hAnsi="Times New Roman" w:cs="Times New Roman"/>
+                <w:sz w:val="24"/>
+                <w:szCs w:val="24"/>
+                <w:lang w:eastAsia="es-EC"/>
+              </w:rPr>
+            </w:pPr>
+            <w:r>
+              <w:rPr>
+                <w:rFonts w:ascii="Times New Roman" w:eastAsia="Times New Roman" w:hAnsi="Times New Roman" w:cs="Times New Roman"/>
+                <w:sz w:val="24"/>
+                <w:szCs w:val="24"/>
+                <w:lang w:eastAsia="es-EC"/>
+              </w:rPr>
+              <w:t>out</w:t>
+            </w:r>
+          </w:p>
+        </w:tc>
+        <w:tc>
+          <w:tcPr>
+            <w:tcW w:w="0" w:type="auto"/>
+            <w:hideMark/>
+          </w:tcPr>
+          <w:p>
+            <w:pPr>
+              <w:rPr>
+                <w:rFonts w:ascii="Times New Roman" w:eastAsia="Times New Roman" w:hAnsi="Times New Roman" w:cs="Times New Roman"/>
+                <w:sz w:val="24"/>
+                <w:szCs w:val="24"/>
+                <w:lang w:eastAsia="es-EC"/>
+              </w:rPr>
+            </w:pPr>
+          </w:p>
+        </w:tc>
+      </w:tr>
+      <w:tr>
+        <w:trPr>
+          <w:jc w:val="center"/>
+        </w:trPr>
+        <w:tc>
+          <w:tcPr>
+            <w:tcW w:w="0" w:type="auto"/>
+            <w:hideMark/>
+          </w:tcPr>
+          <w:p>
+            <w:pPr>
+              <w:rPr>
+                <w:rFonts w:ascii="Times New Roman" w:eastAsia="Times New Roman" w:hAnsi="Times New Roman" w:cs="Times New Roman"/>
+                <w:sz w:val="24"/>
+                <w:szCs w:val="24"/>
+                <w:lang w:eastAsia="es-EC"/>
+              </w:rPr>
+            </w:pPr>
+            <w:r>
+              <w:rPr>
+                <w:rFonts w:ascii="Times New Roman" w:eastAsia="Times New Roman" w:hAnsi="Times New Roman" w:cs="Times New Roman"/>
+                <w:sz w:val="24"/>
+                <w:szCs w:val="24"/>
+                <w:lang w:eastAsia="es-EC"/>
+              </w:rPr>
+              <w:t>(48, 50)</w:t>
+            </w:r>
+          </w:p>
+        </w:tc>
+        <w:tc>
+          <w:tcPr>
+            <w:tcW w:w="0" w:type="auto"/>
+            <w:hideMark/>
+          </w:tcPr>
+          <w:p>
+            <w:pPr>
+              <w:rPr>
+                <w:rFonts w:ascii="Times New Roman" w:eastAsia="Times New Roman" w:hAnsi="Times New Roman" w:cs="Times New Roman"/>
+                <w:sz w:val="24"/>
+                <w:szCs w:val="24"/>
+                <w:lang w:eastAsia="es-EC"/>
+              </w:rPr>
+            </w:pPr>
+          </w:p>
+        </w:tc>
+        <w:tc>
+          <w:tcPr>
+            <w:tcW w:w="0" w:type="auto"/>
+            <w:hideMark/>
+          </w:tcPr>
+          <w:p>
+            <w:pPr>
+              <w:rPr>
+                <w:rFonts w:ascii="Times New Roman" w:eastAsia="Times New Roman" w:hAnsi="Times New Roman" w:cs="Times New Roman"/>
+                <w:sz w:val="24"/>
+                <w:szCs w:val="24"/>
+                <w:lang w:eastAsia="es-EC"/>
+              </w:rPr>
+            </w:pPr>
+            <w:r>
+              <w:rPr>
+                <w:rFonts w:ascii="Times New Roman" w:eastAsia="Times New Roman" w:hAnsi="Times New Roman" w:cs="Times New Roman"/>
+                <w:sz w:val="24"/>
+                <w:szCs w:val="24"/>
+                <w:lang w:eastAsia="es-EC"/>
+              </w:rPr>
+              <w:t>remaining</w:t>
+            </w:r>
+          </w:p>
+        </w:tc>
+      </w:tr>
+      <w:tr>
+        <w:trPr>
+          <w:jc w:val="center"/>
+        </w:trPr>
+        <w:tc>
+          <w:tcPr>
+            <w:tcW w:w="0" w:type="auto"/>
+            <w:hideMark/>
+          </w:tcPr>
+          <w:p>
+            <w:pPr>
+              <w:rPr>
+                <w:rFonts w:ascii="Times New Roman" w:eastAsia="Times New Roman" w:hAnsi="Times New Roman" w:cs="Times New Roman"/>
+                <w:sz w:val="24"/>
+                <w:szCs w:val="24"/>
+                <w:lang w:eastAsia="es-EC"/>
+              </w:rPr>
+            </w:pPr>
+            <w:r>
+              <w:rPr>
+                <w:rFonts w:ascii="Times New Roman" w:eastAsia="Times New Roman" w:hAnsi="Times New Roman" w:cs="Times New Roman"/>
+                <w:sz w:val="24"/>
+                <w:szCs w:val="24"/>
+                <w:lang w:eastAsia="es-EC"/>
+              </w:rPr>
+              <w:t>(48, 52)</w:t>
+            </w:r>
+          </w:p>
+        </w:tc>
+        <w:tc>
+          <w:tcPr>
+            <w:tcW w:w="0" w:type="auto"/>
+            <w:hideMark/>
+          </w:tcPr>
+          <w:p>
+            <w:pPr>
+              <w:rPr>
+                <w:rFonts w:ascii="Times New Roman" w:eastAsia="Times New Roman" w:hAnsi="Times New Roman" w:cs="Times New Roman"/>
+                <w:sz w:val="24"/>
+                <w:szCs w:val="24"/>
+                <w:lang w:eastAsia="es-EC"/>
+              </w:rPr>
+            </w:pPr>
+            <w:r>
+              <w:rPr>
+                <w:rFonts w:ascii="Times New Roman" w:eastAsia="Times New Roman" w:hAnsi="Times New Roman" w:cs="Times New Roman"/>
+                <w:sz w:val="24"/>
+                <w:szCs w:val="24"/>
+                <w:lang w:eastAsia="es-EC"/>
+              </w:rPr>
+              <w:t>remaining</w:t>
+            </w:r>
+          </w:p>
+        </w:tc>
+        <w:tc>
+          <w:tcPr>
+            <w:tcW w:w="0" w:type="auto"/>
+            <w:hideMark/>
+          </w:tcPr>
+          <w:p>
+            <w:pPr>
+              <w:rPr>
+                <w:rFonts w:ascii="Times New Roman" w:eastAsia="Times New Roman" w:hAnsi="Times New Roman" w:cs="Times New Roman"/>
+                <w:sz w:val="24"/>
+                <w:szCs w:val="24"/>
+                <w:lang w:eastAsia="es-EC"/>
+              </w:rPr>
+            </w:pPr>
+          </w:p>
+        </w:tc>
+      </w:tr>
+      <w:tr>
+        <w:trPr>
+          <w:jc w:val="center"/>
+        </w:trPr>
+        <w:tc>
+          <w:tcPr>
+            <w:tcW w:w="0" w:type="auto"/>
+            <w:hideMark/>
+          </w:tcPr>
+          <w:p>
+            <w:pPr>
+              <w:rPr>
+                <w:rFonts w:ascii="Times New Roman" w:eastAsia="Times New Roman" w:hAnsi="Times New Roman" w:cs="Times New Roman"/>
+                <w:sz w:val="24"/>
+                <w:szCs w:val="24"/>
+                <w:lang w:eastAsia="es-EC"/>
+              </w:rPr>
+            </w:pPr>
+            <w:r>
+              <w:rPr>
+                <w:rFonts w:ascii="Times New Roman" w:eastAsia="Times New Roman" w:hAnsi="Times New Roman" w:cs="Times New Roman"/>
+                <w:b/>
+                <w:bCs/>
+                <w:sz w:val="24"/>
+                <w:szCs w:val="24"/>
+                <w:lang w:eastAsia="es-EC"/>
+              </w:rPr>
+              <w:t>(52, 50)</w:t>
+            </w:r>
+          </w:p>
+        </w:tc>
+        <w:tc>
+          <w:tcPr>
+            <w:tcW w:w="0" w:type="auto"/>
+            <w:hideMark/>
+          </w:tcPr>
+          <w:p>
+            <w:pPr>
+              <w:rPr>
+                <w:rFonts w:ascii="Times New Roman" w:eastAsia="Times New Roman" w:hAnsi="Times New Roman" w:cs="Times New Roman"/>
+                <w:sz w:val="24"/>
+                <w:szCs w:val="24"/>
+                <w:lang w:eastAsia="es-EC"/>
+              </w:rPr>
+            </w:pPr>
+          </w:p>
+        </w:tc>
+        <w:tc>
+          <w:tcPr>
+            <w:tcW w:w="0" w:type="auto"/>
+            <w:hideMark/>
+          </w:tcPr>
+          <w:p>
+            <w:pPr>
+              <w:rPr>
+                <w:rFonts w:ascii="Times New Roman" w:eastAsia="Times New Roman" w:hAnsi="Times New Roman" w:cs="Times New Roman"/>
+                <w:sz w:val="24"/>
+                <w:szCs w:val="24"/>
+                <w:lang w:eastAsia="es-EC"/>
+              </w:rPr>
+            </w:pPr>
+            <w:r>
+              <w:rPr>
+                <w:rFonts w:ascii="Times New Roman" w:eastAsia="Times New Roman" w:hAnsi="Times New Roman" w:cs="Times New Roman"/>
+                <w:b/>
+                <w:bCs/>
+                <w:sz w:val="24"/>
+                <w:szCs w:val="24"/>
+                <w:lang w:eastAsia="es-EC"/>
+              </w:rPr>
+              <w:t>remaining</w:t>
+            </w:r>
+          </w:p>
+        </w:tc>
+      </w:tr>
+      <w:tr>
+        <w:trPr>
+          <w:jc w:val="center"/>
+        </w:trPr>
+        <w:tc>
+          <w:tcPr>
+            <w:tcW w:w="0" w:type="auto"/>
+            <w:hideMark/>
+          </w:tcPr>
+          <w:p>
+            <w:pPr>
+              <w:rPr>
+                <w:rFonts w:ascii="Times New Roman" w:eastAsia="Times New Roman" w:hAnsi="Times New Roman" w:cs="Times New Roman"/>
+                <w:sz w:val="24"/>
+                <w:szCs w:val="24"/>
+                <w:lang w:eastAsia="es-EC"/>
+              </w:rPr>
+            </w:pPr>
+            <w:r>
+              <w:rPr>
+                <w:rFonts w:ascii="Times New Roman" w:eastAsia="Times New Roman" w:hAnsi="Times New Roman" w:cs="Times New Roman"/>
+                <w:b/>
+                <w:bCs/>
+                <w:sz w:val="24"/>
+                <w:szCs w:val="24"/>
+                <w:lang w:eastAsia="es-EC"/>
+              </w:rPr>
+              <w:t>(52, 52)</w:t>
+            </w:r>
+          </w:p>
+        </w:tc>
+        <w:tc>
+          <w:tcPr>
+            <w:tcW w:w="0" w:type="auto"/>
+            <w:hideMark/>
+          </w:tcPr>
+          <w:p>
+            <w:pPr>
+              <w:rPr>
+                <w:rFonts w:ascii="Times New Roman" w:eastAsia="Times New Roman" w:hAnsi="Times New Roman" w:cs="Times New Roman"/>
+                <w:sz w:val="24"/>
+                <w:szCs w:val="24"/>
+                <w:lang w:eastAsia="es-EC"/>
+              </w:rPr>
+            </w:pPr>
+            <w:r>
+              <w:rPr>
+                <w:rFonts w:ascii="Times New Roman" w:eastAsia="Times New Roman" w:hAnsi="Times New Roman" w:cs="Times New Roman"/>
+                <w:b/>
+                <w:bCs/>
+                <w:sz w:val="24"/>
+                <w:szCs w:val="24"/>
+                <w:lang w:eastAsia="es-EC"/>
+              </w:rPr>
+              <w:t>remaining</w:t>
+            </w:r>
+          </w:p>
+        </w:tc>
+        <w:tc>
+          <w:tcPr>
+            <w:tcW w:w="0" w:type="auto"/>
+            <w:hideMark/>
+          </w:tcPr>
+          <w:p>
+            <w:pPr>
+              <w:rPr>
+                <w:rFonts w:ascii="Times New Roman" w:eastAsia="Times New Roman" w:hAnsi="Times New Roman" w:cs="Times New Roman"/>
+                <w:sz w:val="24"/>
+                <w:szCs w:val="24"/>
+                <w:lang w:eastAsia="es-EC"/>
+              </w:rPr>
+            </w:pPr>
+          </w:p>
+        </w:tc>
+      </w:tr>
+      <w:tr>
+        <w:trPr>
+          <w:jc w:val="center"/>
+        </w:trPr>
+        <w:tc>
+          <w:tcPr>
+            <w:tcW w:w="0" w:type="auto"/>
+            <w:hideMark/>
+          </w:tcPr>
+          <w:p>
+            <w:pPr>
+              <w:rPr>
+                <w:rFonts w:ascii="Times New Roman" w:eastAsia="Times New Roman" w:hAnsi="Times New Roman" w:cs="Times New Roman"/>
+                <w:sz w:val="24"/>
+                <w:szCs w:val="24"/>
+                <w:lang w:eastAsia="es-EC"/>
+              </w:rPr>
+            </w:pPr>
+            <w:r>
+              <w:rPr>
+                <w:rFonts w:ascii="Times New Roman" w:eastAsia="Times New Roman" w:hAnsi="Times New Roman" w:cs="Times New Roman"/>
+                <w:sz w:val="24"/>
+                <w:szCs w:val="24"/>
+                <w:lang w:eastAsia="es-EC"/>
+              </w:rPr>
+              <w:t>(49, 50)</w:t>
+            </w:r>
+          </w:p>
+        </w:tc>
+        <w:tc>
+          <w:tcPr>
+            <w:tcW w:w="0" w:type="auto"/>
+            <w:hideMark/>
+          </w:tcPr>
+          <w:p>
+            <w:pPr>
+              <w:rPr>
+                <w:rFonts w:ascii="Times New Roman" w:eastAsia="Times New Roman" w:hAnsi="Times New Roman" w:cs="Times New Roman"/>
+                <w:sz w:val="24"/>
+                <w:szCs w:val="24"/>
+                <w:lang w:eastAsia="es-EC"/>
+              </w:rPr>
+            </w:pPr>
+          </w:p>
+        </w:tc>
+        <w:tc>
+          <w:tcPr>
+            <w:tcW w:w="0" w:type="auto"/>
+            <w:hideMark/>
+          </w:tcPr>
+          <w:p>
+            <w:pPr>
+              <w:rPr>
+                <w:rFonts w:ascii="Times New Roman" w:eastAsia="Times New Roman" w:hAnsi="Times New Roman" w:cs="Times New Roman"/>
+                <w:sz w:val="24"/>
+                <w:szCs w:val="24"/>
+                <w:lang w:eastAsia="es-EC"/>
+              </w:rPr>
+            </w:pPr>
+            <w:r>
+              <w:rPr>
+                <w:rFonts w:ascii="Times New Roman" w:eastAsia="Times New Roman" w:hAnsi="Times New Roman" w:cs="Times New Roman"/>
+                <w:sz w:val="24"/>
+                <w:szCs w:val="24"/>
+                <w:lang w:eastAsia="es-EC"/>
+              </w:rPr>
+              <w:t>value</w:t>
+            </w:r>
+          </w:p>
+        </w:tc>
+      </w:tr>
+      <w:tr>
+        <w:trPr>
+          <w:jc w:val="center"/>
+        </w:trPr>
+        <w:tc>
+          <w:tcPr>
+            <w:tcW w:w="0" w:type="auto"/>
+            <w:hideMark/>
+          </w:tcPr>
+          <w:p>
+            <w:pPr>
+              <w:rPr>
+                <w:rFonts w:ascii="Times New Roman" w:eastAsia="Times New Roman" w:hAnsi="Times New Roman" w:cs="Times New Roman"/>
+                <w:sz w:val="24"/>
+                <w:szCs w:val="24"/>
+                <w:lang w:eastAsia="es-EC"/>
+              </w:rPr>
+            </w:pPr>
+            <w:r>
+              <w:rPr>
+                <w:rFonts w:ascii="Times New Roman" w:eastAsia="Times New Roman" w:hAnsi="Times New Roman" w:cs="Times New Roman"/>
+                <w:sz w:val="24"/>
+                <w:szCs w:val="24"/>
+                <w:lang w:eastAsia="es-EC"/>
+              </w:rPr>
+              <w:t>(49, 52)</w:t>
+            </w:r>
+          </w:p>
+        </w:tc>
+        <w:tc>
+          <w:tcPr>
+            <w:tcW w:w="0" w:type="auto"/>
+            <w:hideMark/>
+          </w:tcPr>
+          <w:p>
+            <w:pPr>
+              <w:rPr>
+                <w:rFonts w:ascii="Times New Roman" w:eastAsia="Times New Roman" w:hAnsi="Times New Roman" w:cs="Times New Roman"/>
+                <w:sz w:val="24"/>
+                <w:szCs w:val="24"/>
+                <w:lang w:eastAsia="es-EC"/>
+              </w:rPr>
+            </w:pPr>
+            <w:r>
+              <w:rPr>
+                <w:rFonts w:ascii="Times New Roman" w:eastAsia="Times New Roman" w:hAnsi="Times New Roman" w:cs="Times New Roman"/>
+                <w:sz w:val="24"/>
+                <w:szCs w:val="24"/>
+                <w:lang w:eastAsia="es-EC"/>
+              </w:rPr>
+              <w:t>value</w:t>
+            </w:r>
+          </w:p>
+        </w:tc>
+        <w:tc>
+          <w:tcPr>
+            <w:tcW w:w="0" w:type="auto"/>
+            <w:hideMark/>
+          </w:tcPr>
+          <w:p>
+            <w:pPr>
+              <w:rPr>
+                <w:rFonts w:ascii="Times New Roman" w:eastAsia="Times New Roman" w:hAnsi="Times New Roman" w:cs="Times New Roman"/>
+                <w:sz w:val="24"/>
+                <w:szCs w:val="24"/>
+                <w:lang w:eastAsia="es-EC"/>
+              </w:rPr>
+            </w:pPr>
+          </w:p>
+        </w:tc>
+      </w:tr>
+      <w:tr>
+        <w:trPr>
+          <w:jc w:val="center"/>
+        </w:trPr>
+        <w:tc>
+          <w:tcPr>
+            <w:tcW w:w="0" w:type="auto"/>
+            <w:hideMark/>
+          </w:tcPr>
+          <w:p>
+            <w:pPr>
+              <w:rPr>
+                <w:rFonts w:ascii="Times New Roman" w:eastAsia="Times New Roman" w:hAnsi="Times New Roman" w:cs="Times New Roman"/>
+                <w:sz w:val="24"/>
+                <w:szCs w:val="24"/>
+                <w:lang w:eastAsia="es-EC"/>
+              </w:rPr>
+            </w:pPr>
+            <w:r>
+              <w:rPr>
+                <w:rFonts w:ascii="Times New Roman" w:eastAsia="Times New Roman" w:hAnsi="Times New Roman" w:cs="Times New Roman"/>
+                <w:sz w:val="24"/>
+                <w:szCs w:val="24"/>
+                <w:lang w:eastAsia="es-EC"/>
+              </w:rPr>
+              <w:t>(49, 51)</w:t>
+            </w:r>
+          </w:p>
+        </w:tc>
+        <w:tc>
+          <w:tcPr>
+            <w:tcW w:w="0" w:type="auto"/>
+            <w:hideMark/>
+          </w:tcPr>
+          <w:p>
+            <w:pPr>
+              <w:rPr>
+                <w:rFonts w:ascii="Times New Roman" w:eastAsia="Times New Roman" w:hAnsi="Times New Roman" w:cs="Times New Roman"/>
+                <w:sz w:val="24"/>
+                <w:szCs w:val="24"/>
+                <w:lang w:eastAsia="es-EC"/>
+              </w:rPr>
+            </w:pPr>
+            <w:r>
+              <w:rPr>
+                <w:rFonts w:ascii="Times New Roman" w:eastAsia="Times New Roman" w:hAnsi="Times New Roman" w:cs="Times New Roman"/>
+                <w:sz w:val="24"/>
+                <w:szCs w:val="24"/>
+                <w:lang w:eastAsia="es-EC"/>
+              </w:rPr>
+              <w:t>symbol</w:t>
+            </w:r>
+          </w:p>
+        </w:tc>
+        <w:tc>
+          <w:tcPr>
+            <w:tcW w:w="0" w:type="auto"/>
+            <w:hideMark/>
+          </w:tcPr>
+          <w:p>
+            <w:pPr>
+              <w:rPr>
+                <w:rFonts w:ascii="Times New Roman" w:eastAsia="Times New Roman" w:hAnsi="Times New Roman" w:cs="Times New Roman"/>
+                <w:sz w:val="24"/>
+                <w:szCs w:val="24"/>
+                <w:lang w:eastAsia="es-EC"/>
+              </w:rPr>
+            </w:pPr>
+          </w:p>
+        </w:tc>
+      </w:tr>
+    </w:tbl>
+    <w:p/>
+    <w:p>
+      <w:r>
+        <w:br w:type="page"/>
+      </w:r>
+    </w:p>
+    <w:p>
+      <w:r>
+        <w:lastRenderedPageBreak/>
+        <w:drawing>
+          <wp:inline distT="0" distB="0" distL="0" distR="0" wp14:anchorId="6743D46F" wp14:editId="428FBAAB">
+            <wp:extent cx="5400040" cy="730885"/>
+            <wp:effectExtent l="0" t="0" r="0" b="0"/>
+            <wp:docPr id="3" name="Imagen 3"/>
+            <wp:cNvGraphicFramePr>
+              <a:graphicFrameLocks xmlns:a="http://schemas.openxmlformats.org/drawingml/2006/main" noChangeAspect="1"/>
+            </wp:cNvGraphicFramePr>
+            <a:graphic xmlns:a="http://schemas.openxmlformats.org/drawingml/2006/main">
+              <a:graphicData uri="http://schemas.openxmlformats.org/drawingml/2006/picture">
+                <pic:pic xmlns:pic="http://schemas.openxmlformats.org/drawingml/2006/picture">
+                  <pic:nvPicPr>
+                    <pic:cNvPr id="1" name=""/>
+                    <pic:cNvPicPr/>
+                  </pic:nvPicPr>
+                  <pic:blipFill>
+                    <a:blip r:embed="rId9"/>
+                    <a:stretch>
+                      <a:fillRect/>
+                    </a:stretch>
+                  </pic:blipFill>
+                  <pic:spPr>
+                    <a:xfrm>
+                      <a:off x="0" y="0"/>
+                      <a:ext cx="5400040" cy="730885"/>
+                    </a:xfrm>
+                    <a:prstGeom prst="rect">
+                      <a:avLst/>
+                    </a:prstGeom>
+                  </pic:spPr>
+                </pic:pic>
+              </a:graphicData>
+            </a:graphic>
+          </wp:inline>
+        </w:drawing>
+      </w:r>
+    </w:p>
+    <w:p>
+      <w:r>
+        <w:drawing>
+          <wp:inline distT="0" distB="0" distL="0" distR="0" wp14:anchorId="31B60068" wp14:editId="636E3B8C">
+            <wp:extent cx="5400040" cy="2002790"/>
+            <wp:effectExtent l="0" t="0" r="0" b="0"/>
+            <wp:docPr id="4" name="Imagen 4"/>
+            <wp:cNvGraphicFramePr>
+              <a:graphicFrameLocks xmlns:a="http://schemas.openxmlformats.org/drawingml/2006/main" noChangeAspect="1"/>
+            </wp:cNvGraphicFramePr>
+            <a:graphic xmlns:a="http://schemas.openxmlformats.org/drawingml/2006/main">
+              <a:graphicData uri="http://schemas.openxmlformats.org/drawingml/2006/picture">
+                <pic:pic xmlns:pic="http://schemas.openxmlformats.org/drawingml/2006/picture">
+                  <pic:nvPicPr>
+                    <pic:cNvPr id="1" name=""/>
+                    <pic:cNvPicPr/>
+                  </pic:nvPicPr>
+                  <pic:blipFill>
+                    <a:blip r:embed="rId10"/>
+                    <a:stretch>
+                      <a:fillRect/>
+                    </a:stretch>
+                  </pic:blipFill>
+                  <pic:spPr>
+                    <a:xfrm>
+                      <a:off x="0" y="0"/>
+                      <a:ext cx="5400040" cy="2002790"/>
+                    </a:xfrm>
+                    <a:prstGeom prst="rect">
+                      <a:avLst/>
+                    </a:prstGeom>
+                  </pic:spPr>
+                </pic:pic>
+              </a:graphicData>
+            </a:graphic>
+          </wp:inline>
+        </w:drawing>
+      </w:r>
+    </w:p>
+    <w:p>
+      <w:r>
+        <w:drawing>
+          <wp:inline distT="0" distB="0" distL="0" distR="0" wp14:anchorId="17430B33" wp14:editId="21BEC4CC">
+            <wp:extent cx="5400040" cy="828675"/>
+            <wp:effectExtent l="0" t="0" r="0" b="9525"/>
+            <wp:docPr id="6" name="Imagen 6"/>
+            <wp:cNvGraphicFramePr>
+              <a:graphicFrameLocks xmlns:a="http://schemas.openxmlformats.org/drawingml/2006/main" noChangeAspect="1"/>
+            </wp:cNvGraphicFramePr>
+            <a:graphic xmlns:a="http://schemas.openxmlformats.org/drawingml/2006/main">
+              <a:graphicData uri="http://schemas.openxmlformats.org/drawingml/2006/picture">
+                <pic:pic xmlns:pic="http://schemas.openxmlformats.org/drawingml/2006/picture">
+                  <pic:nvPicPr>
+                    <pic:cNvPr id="1" name=""/>
+                    <pic:cNvPicPr/>
+                  </pic:nvPicPr>
+                  <pic:blipFill>
+                    <a:blip r:embed="rId11"/>
+                    <a:stretch>
+                      <a:fillRect/>
+                    </a:stretch>
+                  </pic:blipFill>
+                  <pic:spPr>
+                    <a:xfrm>
+                      <a:off x="0" y="0"/>
+                      <a:ext cx="5400040" cy="828675"/>
+                    </a:xfrm>
+                    <a:prstGeom prst="rect">
+                      <a:avLst/>
+                    </a:prstGeom>
+                  </pic:spPr>
+                </pic:pic>
+              </a:graphicData>
+            </a:graphic>
+          </wp:inline>
+        </w:drawing>
+      </w:r>
+    </w:p>
+    <w:p>
+      <w:pPr>
+        <w:rPr>
+          <w:rFonts w:ascii="Times New Roman" w:hAnsi="Times New Roman" w:cs="Times New Roman"/>
+          <w:b/>
+          <w:bCs/>
+          <w:sz w:val="28"/>
+          <w:szCs w:val="28"/>
+          <w:lang w:val="en-US"/>
+        </w:rPr>
+      </w:pPr>
+      <w:r>
+        <w:rPr>
+          <w:rFonts w:ascii="Times New Roman" w:hAnsi="Times New Roman" w:cs="Times New Roman"/>
+          <w:b/>
+          <w:bCs/>
+          <w:sz w:val="28"/>
+          <w:szCs w:val="28"/>
+          <w:lang w:val="en-US"/>
+        </w:rPr>
+        <w:t>Part 4: Test at the integration level</w:t>
+      </w:r>
+    </w:p>
+    <w:p>
+      <w:pPr>
+        <w:jc w:val="both"/>
+        <w:rPr>
+          <w:rFonts w:ascii="Times New Roman" w:hAnsi="Times New Roman" w:cs="Times New Roman"/>
+          <w:sz w:val="24"/>
+          <w:szCs w:val="24"/>
+          <w:lang w:val="en-US"/>
+        </w:rPr>
+      </w:pPr>
+      <w:r>
+        <w:rPr>
+          <w:rFonts w:ascii="Times New Roman" w:hAnsi="Times New Roman" w:cs="Times New Roman"/>
+          <w:sz w:val="24"/>
+          <w:szCs w:val="24"/>
+          <w:lang w:val="en-US"/>
+        </w:rPr>
+        <w:t>Section 7 defines add_roman and subtract_roman as compositions: each decodes both operands with from_roman, operates, and re-encodes with to_roman. The unit under test is a collaboration, not a function. Its closing requirement is the only one that constrains two units against each other: the result of add_roman must always be accepted by is_valid_roman. Five of the six mandatory examples hold; only add_roman("II", "II") deviates, returning IIII instead of IV. Yet the consistency requirement holds even there, since is_valid_roman("IIII") returns True and from_roman(to_roman(n)) == n has zero failures over the whole domain.</w:t>
+      </w:r>
+    </w:p>
+    <w:p>
+      <w:pPr>
+        <w:jc w:val="both"/>
+        <w:rPr>
+          <w:rFonts w:ascii="Times New Roman" w:hAnsi="Times New Roman" w:cs="Times New Roman"/>
+          <w:sz w:val="24"/>
+          <w:szCs w:val="24"/>
+          <w:lang w:val="en-US"/>
+        </w:rPr>
+      </w:pPr>
+      <w:r>
+        <w:rPr>
+          <w:rFonts w:ascii="Times New Roman" w:hAnsi="Times New Roman" w:cs="Times New Roman"/>
+          <w:sz w:val="24"/>
+          <w:szCs w:val="24"/>
+          <w:lang w:val="en-US"/>
+        </w:rPr>
+        <w:t>The reason is that two defects compensate each other: _PAIRS contains (5, "IV") where section 2 requires (4, "IV"), so IV is never emitted, and from_roman never enforces canonical form, so IIII parses to 4 instead of raising. The validator is exactly as permissive as the generator is incorrect, so the property is satisfied vacuously — the failure mode section 4 anticipates when it forbids using the code as its own oracle. The unit tests pass because neither defect is visible from the code alone: a control flow graph says which decisions exist, not which symbol _PAIRS should carry, and coverage cannot report a canonicity branch that was never written. The defect appears only when the units are composed and judged against an external criterion.</w:t>
+      </w:r>
+    </w:p>
+    <w:p>
+      <w:pPr>
+        <w:rPr>
+          <w:rFonts w:ascii="Times New Roman" w:hAnsi="Times New Roman" w:cs="Times New Roman"/>
+          <w:sz w:val="24"/>
+          <w:szCs w:val="24"/>
+          <w:lang w:val="en-US"/>
+        </w:rPr>
+      </w:pPr>
+      <w:r>
+        <w:rPr>
+          <w:noProof/>
+        </w:rPr>
+        <w:lastRenderedPageBreak/>
+        <w:drawing>
+          <wp:inline distT="0" distB="0" distL="0" distR="0" wp14:anchorId="774B7A51" wp14:editId="093E2038">
+            <wp:extent cx="5400040" cy="1787525"/>
+            <wp:effectExtent l="0" t="0" r="0" b="3175"/>
+            <wp:docPr id="8" name="Imagen 8"/>
+            <wp:cNvGraphicFramePr>
+              <a:graphicFrameLocks xmlns:a="http://schemas.openxmlformats.org/drawingml/2006/main" noChangeAspect="1"/>
+            </wp:cNvGraphicFramePr>
+            <a:graphic xmlns:a="http://schemas.openxmlformats.org/drawingml/2006/main">
+              <a:graphicData uri="http://schemas.openxmlformats.org/drawingml/2006/picture">
+                <pic:pic xmlns:pic="http://schemas.openxmlformats.org/drawingml/2006/picture">
+                  <pic:nvPicPr>
+                    <pic:cNvPr id="1" name=""/>
+                    <pic:cNvPicPr/>
+                  </pic:nvPicPr>
+                  <pic:blipFill>
+                    <a:blip r:embed="rId12"/>
+                    <a:stretch>
+                      <a:fillRect/>
+                    </a:stretch>
+                  </pic:blipFill>
+                  <pic:spPr>
+                    <a:xfrm>
+                      <a:off x="0" y="0"/>
+                      <a:ext cx="5400040" cy="1787525"/>
+                    </a:xfrm>
+                    <a:prstGeom prst="rect">
+                      <a:avLst/>
+                    </a:prstGeom>
+                  </pic:spPr>
+                </pic:pic>
+              </a:graphicData>
+            </a:graphic>
+          </wp:inline>
+        </w:drawing>
+      </w:r>
+    </w:p>
+    <w:p>
+      <w:pPr>
+        <w:rPr>
+          <w:rFonts w:ascii="Times New Roman" w:hAnsi="Times New Roman" w:cs="Times New Roman"/>
+          <w:sz w:val="24"/>
+          <w:szCs w:val="24"/>
+          <w:lang w:val="en-US"/>
+        </w:rPr>
+      </w:pPr>
+      <w:r>
+        <w:rPr>
+          <w:noProof/>
+        </w:rPr>
+        <w:drawing>
+          <wp:inline distT="0" distB="0" distL="0" distR="0" wp14:anchorId="5DB926B5" wp14:editId="33C83BFF">
+            <wp:extent cx="5400040" cy="1731645"/>
+            <wp:effectExtent l="0" t="0" r="0" b="1905"/>
+            <wp:docPr id="9" name="Imagen 9"/>
+            <wp:cNvGraphicFramePr>
+              <a:graphicFrameLocks xmlns:a="http://schemas.openxmlformats.org/drawingml/2006/main" noChangeAspect="1"/>
+            </wp:cNvGraphicFramePr>
+            <a:graphic xmlns:a="http://schemas.openxmlformats.org/drawingml/2006/main">
+              <a:graphicData uri="http://schemas.openxmlformats.org/drawingml/2006/picture">
+                <pic:pic xmlns:pic="http://schemas.openxmlformats.org/drawingml/2006/picture">
+                  <pic:nvPicPr>
+                    <pic:cNvPr id="1" name=""/>
+                    <pic:cNvPicPr/>
+                  </pic:nvPicPr>
+                  <pic:blipFill>
+                    <a:blip r:embed="rId13"/>
+                    <a:stretch>
+                      <a:fillRect/>
+                    </a:stretch>
+                  </pic:blipFill>
+                  <pic:spPr>
+                    <a:xfrm>
+                      <a:off x="0" y="0"/>
+                      <a:ext cx="5400040" cy="1731645"/>
+                    </a:xfrm>
+                    <a:prstGeom prst="rect">
+                      <a:avLst/>
+                    </a:prstGeom>
+                  </pic:spPr>
+                </pic:pic>
+              </a:graphicData>
+            </a:graphic>
+          </wp:inline>
+        </w:drawing>
+      </w:r>
+    </w:p>
+    <w:p>
+      <w:pPr>
+        <w:rPr>
+          <w:rFonts w:ascii="Times New Roman" w:hAnsi="Times New Roman" w:cs="Times New Roman"/>
+          <w:sz w:val="24"/>
+          <w:szCs w:val="24"/>
+          <w:lang w:val="en-US"/>
+        </w:rPr>
+      </w:pPr>
+      <w:r>
+        <w:rPr>
+          <w:noProof/>
+        </w:rPr>
+        <w:drawing>
+          <wp:inline distT="0" distB="0" distL="0" distR="0" wp14:anchorId="2D1A83A7" wp14:editId="6255D115">
+            <wp:extent cx="5400040" cy="555625"/>
+            <wp:effectExtent l="0" t="0" r="0" b="0"/>
+            <wp:docPr id="10" name="Imagen 10"/>
+            <wp:cNvGraphicFramePr>
+              <a:graphicFrameLocks xmlns:a="http://schemas.openxmlformats.org/drawingml/2006/main" noChangeAspect="1"/>
+            </wp:cNvGraphicFramePr>
+            <a:graphic xmlns:a="http://schemas.openxmlformats.org/drawingml/2006/main">
+              <a:graphicData uri="http://schemas.openxmlformats.org/drawingml/2006/picture">
+                <pic:pic xmlns:pic="http://schemas.openxmlformats.org/drawingml/2006/picture">
+                  <pic:nvPicPr>
+                    <pic:cNvPr id="1" name=""/>
+                    <pic:cNvPicPr/>
+                  </pic:nvPicPr>
+                  <pic:blipFill>
+                    <a:blip r:embed="rId14"/>
+                    <a:stretch>
+                      <a:fillRect/>
+                    </a:stretch>
+                  </pic:blipFill>
+                  <pic:spPr>
+                    <a:xfrm>
+                      <a:off x="0" y="0"/>
+                      <a:ext cx="5400040" cy="555625"/>
+                    </a:xfrm>
+                    <a:prstGeom prst="rect">
+                      <a:avLst/>
+                    </a:prstGeom>
+                  </pic:spPr>
+                </pic:pic>
+              </a:graphicData>
+            </a:graphic>
+          </wp:inline>
+        </w:drawing>
+      </w:r>
+    </w:p>
+    <w:p>
+      <w:pPr>
+        <w:jc w:val="both"/>
+        <w:rPr>
+          <w:rFonts w:ascii="Times New Roman" w:hAnsi="Times New Roman" w:cs="Times New Roman"/>
+          <w:sz w:val="24"/>
+          <w:szCs w:val="24"/>
+          <w:lang w:val="en-US"/>
+        </w:rPr>
+      </w:pPr>
+      <w:r>
+        <w:rPr>
+          <w:rFonts w:ascii="Times New Roman" w:hAnsi="Times New Roman" w:cs="Times New Roman"/>
+          <w:sz w:val="24"/>
+          <w:szCs w:val="24"/>
+          <w:lang w:val="en-US"/>
+        </w:rPr>
+        <w:t>The integration suite reports 14 passed and 7 failed. It reveals that add_roman and subtract_roman return non-canonical strings — add_roman("II","II") returns IIII where section 7 mandates IV — because _PAIRS holds (5, "IV") instead of (4, "IV") and, since (5, "V") precedes it, that entry can never match. What makes this an integration finding is the contrast in the execution log: test_add_roman_result_is_accepted_by_is_valid_roman[II-II] passes while test_add_roman_result_is_canonical[II-II] fails on the same input. The consistency requirement of section 7 holds only because is_valid_roman never enforces the canonical form of section 4 and therefore accepts IIII, so a second defect masks the first and from_roman(to_roman(n)) == n holds for all 3999 values while the system is wrong. The unit tests pass because neither defect is observable from a single unit: the structural tests of to_roman reach 100% branch coverage, but a control flow graph records which decisions exist, not which symbol a data table should carry, and in from_roman there is no canonicity check at all, so coverage cannot report a branch that was never written. Each unit is consistent with itself; the defect surfaces only when the generator and the validator are composed and judged against the five rules of section 4 instead of against the decoder that shares the same blind spot.</w:t>
+      </w:r>
+    </w:p>
+    <w:p>
+      <w:pPr>
+        <w:jc w:val="both"/>
+        <w:rPr>
+          <w:rFonts w:ascii="Times New Roman" w:hAnsi="Times New Roman" w:cs="Times New Roman"/>
+          <w:b/>
+          <w:bCs/>
+          <w:sz w:val="28"/>
+          <w:szCs w:val="28"/>
+          <w:lang w:val="en-US"/>
+        </w:rPr>
+      </w:pPr>
+      <w:r>
+        <w:rPr>
+          <w:rFonts w:ascii="Times New Roman" w:hAnsi="Times New Roman" w:cs="Times New Roman"/>
+          <w:b/>
+          <w:bCs/>
+          <w:sz w:val="28"/>
+          <w:szCs w:val="28"/>
+          <w:lang w:val="en-US"/>
+        </w:rPr>
+        <w:t>Part 5: Test at the acceptance level</w:t>
+      </w:r>
+    </w:p>
+    <w:p>
+      <w:pPr>
+        <w:jc w:val="both"/>
+        <w:rPr>
+          <w:rFonts w:ascii="Times New Roman" w:hAnsi="Times New Roman" w:cs="Times New Roman"/>
+          <w:sz w:val="24"/>
+          <w:szCs w:val="24"/>
+          <w:lang w:val="en-US"/>
+        </w:rPr>
+      </w:pPr>
+      <w:r>
+        <w:rPr>
+          <w:rFonts w:ascii="Times New Roman" w:hAnsi="Times New Roman" w:cs="Times New Roman"/>
+          <w:sz w:val="24"/>
+          <w:szCs w:val="24"/>
+          <w:lang w:val="en-US"/>
+        </w:rPr>
+        <w:t>AC1 (section 3). Given that roman numerals arrive from a user-facing field where stray blanks at the ends are common, when the user submits "  IV  " or "X ", then the system reads them as 4 and 10 and reports them as valid, while a numeral with internal whitespace such as "X I" is rejected.</w:t>
+      </w:r>
+    </w:p>
+    <w:p>
+      <w:pPr>
+        <w:jc w:val="both"/>
+        <w:rPr>
+          <w:rFonts w:ascii="Times New Roman" w:hAnsi="Times New Roman" w:cs="Times New Roman"/>
+          <w:sz w:val="24"/>
+          <w:szCs w:val="24"/>
+          <w:lang w:val="en-US"/>
+        </w:rPr>
+      </w:pPr>
+      <w:r>
+        <w:rPr>
+          <w:rFonts w:ascii="Times New Roman" w:hAnsi="Times New Roman" w:cs="Times New Roman"/>
+          <w:sz w:val="24"/>
+          <w:szCs w:val="24"/>
+          <w:lang w:val="en-US"/>
+        </w:rPr>
+        <w:lastRenderedPageBreak/>
+        <w:t>AC2 (sections 4 and 6). Given that the system accepts roman numerals in canonical form only, when a user enters a numeral that represents a value but is not its canonical form, such as "IIII" for 4 or "XXXX" for 40, then the system rejects it: from_roman raises RomanError and is_valid_roman returns False without raising.</w:t>
+      </w:r>
+    </w:p>
+    <w:p>
+      <w:pPr>
+        <w:jc w:val="both"/>
+        <w:rPr>
+          <w:rFonts w:ascii="Times New Roman" w:hAnsi="Times New Roman" w:cs="Times New Roman"/>
+          <w:sz w:val="24"/>
+          <w:szCs w:val="24"/>
+          <w:lang w:val="en-US"/>
+        </w:rPr>
+      </w:pPr>
+      <w:r>
+        <w:rPr>
+          <w:rFonts w:ascii="Times New Roman" w:hAnsi="Times New Roman" w:cs="Times New Roman"/>
+          <w:sz w:val="24"/>
+          <w:szCs w:val="24"/>
+          <w:lang w:val="en-US"/>
+        </w:rPr>
+        <w:t>AC3 (section 7). Given a user who adds two roman numerals, when the user adds "II" and "II", then the system returns "IV", the canonical numeral for 4, and not any other spelling of the same value.</w:t>
+      </w:r>
+    </w:p>
+    <w:p>
+      <w:pPr>
+        <w:jc w:val="both"/>
+        <w:rPr>
+          <w:rFonts w:ascii="Times New Roman" w:hAnsi="Times New Roman" w:cs="Times New Roman"/>
+          <w:b/>
+          <w:bCs/>
+          <w:sz w:val="28"/>
+          <w:szCs w:val="28"/>
+          <w:lang w:val="en-US"/>
+        </w:rPr>
+      </w:pPr>
+      <w:r>
+        <w:rPr>
+          <w:rFonts w:ascii="Times New Roman" w:hAnsi="Times New Roman" w:cs="Times New Roman"/>
+          <w:b/>
+          <w:bCs/>
+          <w:sz w:val="28"/>
+          <w:szCs w:val="28"/>
+          <w:lang w:val="en-US"/>
+        </w:rPr>
+        <w:t>Part 6: Iteration</w:t>
+      </w:r>
+    </w:p>
+    <w:p>
+      <w:pPr>
+        <w:jc w:val="both"/>
+        <w:rPr>
+          <w:rFonts w:ascii="Times New Roman" w:hAnsi="Times New Roman" w:cs="Times New Roman"/>
+          <w:sz w:val="24"/>
+          <w:szCs w:val="24"/>
+          <w:lang w:val="en-US"/>
+        </w:rPr>
+      </w:pPr>
+      <w:r>
+        <w:rPr>
+          <w:noProof/>
+        </w:rPr>
+        <w:drawing>
+          <wp:inline distT="0" distB="0" distL="0" distR="0" wp14:anchorId="74569DA7" wp14:editId="5E16FC4D">
+            <wp:extent cx="5400040" cy="892810"/>
+            <wp:effectExtent l="0" t="0" r="0" b="2540"/>
+            <wp:docPr id="11" name="Imagen 11"/>
+            <wp:cNvGraphicFramePr>
+              <a:graphicFrameLocks xmlns:a="http://schemas.openxmlformats.org/drawingml/2006/main" noChangeAspect="1"/>
+            </wp:cNvGraphicFramePr>
+            <a:graphic xmlns:a="http://schemas.openxmlformats.org/drawingml/2006/main">
+              <a:graphicData uri="http://schemas.openxmlformats.org/drawingml/2006/picture">
+                <pic:pic xmlns:pic="http://schemas.openxmlformats.org/drawingml/2006/picture">
+                  <pic:nvPicPr>
+                    <pic:cNvPr id="1" name=""/>
+                    <pic:cNvPicPr/>
+                  </pic:nvPicPr>
+                  <pic:blipFill>
+                    <a:blip r:embed="rId15"/>
+                    <a:stretch>
+                      <a:fillRect/>
+                    </a:stretch>
+                  </pic:blipFill>
+                  <pic:spPr>
+                    <a:xfrm>
+                      <a:off x="0" y="0"/>
+                      <a:ext cx="5400040" cy="892810"/>
+                    </a:xfrm>
+                    <a:prstGeom prst="rect">
+                      <a:avLst/>
+                    </a:prstGeom>
+                  </pic:spPr>
+                </pic:pic>
+              </a:graphicData>
+            </a:graphic>
+          </wp:inline>
+        </w:drawing>
+      </w:r>
+    </w:p>
+    <w:p>
+      <w:pPr>
+        <w:jc w:val="both"/>
+        <w:rPr>
+          <w:rFonts w:ascii="Times New Roman" w:hAnsi="Times New Roman" w:cs="Times New Roman"/>
+          <w:sz w:val="24"/>
+          <w:szCs w:val="24"/>
+          <w:lang w:val="en-US"/>
+        </w:rPr>
+      </w:pPr>
+      <w:r>
+        <w:rPr>
+          <w:rFonts w:ascii="Times New Roman" w:hAnsi="Times New Roman" w:cs="Times New Roman"/>
+          <w:sz w:val="24"/>
+          <w:szCs w:val="24"/>
+          <w:lang w:val="en-US"/>
+        </w:rPr>
+        <w:drawing>
+          <wp:inline distT="0" distB="0" distL="0" distR="0" wp14:anchorId="7E877AB5" wp14:editId="184BEC3F">
+            <wp:extent cx="5400040" cy="1350010"/>
+            <wp:effectExtent l="0" t="0" r="0" b="2540"/>
+            <wp:docPr id="12" name="Imagen 12"/>
+            <wp:cNvGraphicFramePr>
+              <a:graphicFrameLocks xmlns:a="http://schemas.openxmlformats.org/drawingml/2006/main" noChangeAspect="1"/>
+            </wp:cNvGraphicFramePr>
+            <a:graphic xmlns:a="http://schemas.openxmlformats.org/drawingml/2006/main">
+              <a:graphicData uri="http://schemas.openxmlformats.org/drawingml/2006/picture">
+                <pic:pic xmlns:pic="http://schemas.openxmlformats.org/drawingml/2006/picture">
+                  <pic:nvPicPr>
+                    <pic:cNvPr id="1" name=""/>
+                    <pic:cNvPicPr/>
+                  </pic:nvPicPr>
+                  <pic:blipFill>
+                    <a:blip r:embed="rId16"/>
+                    <a:stretch>
+                      <a:fillRect/>
+                    </a:stretch>
+                  </pic:blipFill>
+                  <pic:spPr>
+                    <a:xfrm>
+                      <a:off x="0" y="0"/>
+                      <a:ext cx="5400040" cy="1350010"/>
+                    </a:xfrm>
+                    <a:prstGeom prst="rect">
+                      <a:avLst/>
+                    </a:prstGeom>
+                  </pic:spPr>
+                </pic:pic>
+              </a:graphicData>
+            </a:graphic>
+          </wp:inline>
+        </w:drawing>
+      </w:r>
+    </w:p>
+    <w:p>
+      <w:pPr>
+        <w:jc w:val="both"/>
+        <w:rPr>
+          <w:rFonts w:ascii="Times New Roman" w:hAnsi="Times New Roman" w:cs="Times New Roman"/>
+          <w:sz w:val="24"/>
+          <w:szCs w:val="24"/>
+          <w:lang w:val="en-US"/>
+        </w:rPr>
+      </w:pPr>
+    </w:p>
     <w:sectPr>
       <w:pgSz w:w="11906" w:h="16838"/>
       <w:pgMar w:top="1417" w:right="1701" w:bottom="1417" w:left="1701" w:header="708" w:footer="708" w:gutter="0"/>
@@ -1918,6 +4857,33 @@
       </w:tblBorders>
     </w:tblPr>
   </w:style>
+  <w:style w:type="character" w:styleId="Textoennegrita">
+    <w:name w:val="Strong"/>
+    <w:basedOn w:val="Fuentedeprrafopredeter"/>
+    <w:uiPriority w:val="22"/>
+    <w:qFormat/>
+    <w:rsid w:val="008C7284"/>
+    <w:rPr>
+      <w:b/>
+      <w:bCs/>
+    </w:rPr>
+  </w:style>
+  <w:style w:type="paragraph" w:customStyle="1" w:styleId="Default">
+    <w:name w:val="Default"/>
+    <w:rsid w:val="00636B5F"/>
+    <w:pPr>
+      <w:autoSpaceDE w:val="0"/>
+      <w:autoSpaceDN w:val="0"/>
+      <w:adjustRightInd w:val="0"/>
+      <w:spacing w:after="0" w:line="240" w:lineRule="auto"/>
+    </w:pPr>
+    <w:rPr>
+      <w:rFonts w:ascii="Calibri-Bold" w:hAnsi="Calibri-Bold" w:cs="Calibri-Bold"/>
+      <w:color w:val="000000"/>
+      <w:sz w:val="24"/>
+      <w:szCs w:val="24"/>
+    </w:rPr>
+  </w:style>
 </w:styles>
 </file>
 

</xml_diff>

<commit_message>
docs: enhance Report workshop with detailed testing insights and defect analysis
</commit_message>
<xml_diff>
--- a/docs/Report workshop.docx
+++ b/docs/Report workshop.docx
@@ -4,12 +4,62 @@
   <w:body>
     <w:p>
       <w:pPr>
+        <w:jc w:val="center"/>
+        <w:rPr>
+          <w:lang w:val="en-US"/>
+        </w:rPr>
+      </w:pPr>
+      <w:r>
+        <w:rPr>
+          <w:rFonts w:ascii="Times New Roman" w:eastAsia="Times New Roman" w:hAnsi="Times New Roman" w:cs="Times New Roman"/>
+          <w:b/>
+          <w:sz w:val="32"/>
+          <w:lang w:val="en-US"/>
+        </w:rPr>
+        <w:t>Testing Life Cycle Workshop</w:t>
+      </w:r>
+    </w:p>
+    <w:p>
+      <w:pPr>
+        <w:jc w:val="center"/>
+        <w:rPr>
+          <w:lang w:val="en-US"/>
+        </w:rPr>
+      </w:pPr>
+      <w:r>
+        <w:rPr>
+          <w:rFonts w:ascii="Times New Roman" w:eastAsia="Times New Roman" w:hAnsi="Times New Roman" w:cs="Times New Roman"/>
+          <w:sz w:val="24"/>
+          <w:lang w:val="en-US"/>
+        </w:rPr>
+        <w:t>Software Engineering II</w:t>
+      </w:r>
+    </w:p>
+    <w:p>
+      <w:pPr>
+        <w:jc w:val="center"/>
+        <w:rPr>
+          <w:lang w:val="en-US"/>
+        </w:rPr>
+      </w:pPr>
+      <w:r>
+        <w:rPr>
+          <w:rFonts w:ascii="Times New Roman" w:eastAsia="Times New Roman" w:hAnsi="Times New Roman" w:cs="Times New Roman"/>
+          <w:sz w:val="24"/>
+          <w:lang w:val="en-US"/>
+        </w:rPr>
+        <w:t>Jorge Bravo Vidal</w:t>
+      </w:r>
+    </w:p>
+    <w:p>
+      <w:pPr>
         <w:rPr>
           <w:rFonts w:ascii="Times New Roman" w:hAnsi="Times New Roman" w:cs="Times New Roman"/>
           <w:b/>
           <w:bCs/>
           <w:sz w:val="28"/>
           <w:szCs w:val="28"/>
+          <w:lang w:val="en-US"/>
         </w:rPr>
       </w:pPr>
       <w:r>
@@ -19,6 +69,7 @@
           <w:bCs/>
           <w:sz w:val="28"/>
           <w:szCs w:val="28"/>
+          <w:lang w:val="en-US"/>
         </w:rPr>
         <w:t>Part 1: Prepare the project</w:t>
       </w:r>
@@ -29,7 +80,7 @@
           <w:noProof/>
         </w:rPr>
         <w:drawing>
-          <wp:inline distT="0" distB="0" distL="0" distR="0" wp14:anchorId="20F36319" wp14:editId="18D6B406">
+          <wp:inline distT="0" distB="0" distL="0" distR="0" wp14:anchorId="07EFD26E" wp14:editId="166884E7">
             <wp:extent cx="5400040" cy="1688465"/>
             <wp:effectExtent l="0" t="0" r="0" b="6985"/>
             <wp:docPr id="1" name="Imagen 1"/>
@@ -94,7 +145,7 @@
           <w:noProof/>
         </w:rPr>
         <w:drawing>
-          <wp:inline distT="0" distB="0" distL="0" distR="0" wp14:anchorId="71447BDA" wp14:editId="5CF70C7B">
+          <wp:inline distT="0" distB="0" distL="0" distR="0" wp14:anchorId="42BF5B93" wp14:editId="4228DF15">
             <wp:extent cx="5400040" cy="1482090"/>
             <wp:effectExtent l="0" t="0" r="0" b="3810"/>
             <wp:docPr id="2" name="Imagen 2"/>
@@ -162,9 +213,9 @@
           <w:noProof/>
         </w:rPr>
         <w:drawing>
-          <wp:inline distT="0" distB="0" distL="0" distR="0" wp14:anchorId="51761D8F" wp14:editId="63AC1079">
-            <wp:extent cx="2679869" cy="4219575"/>
-            <wp:effectExtent l="0" t="0" r="6350" b="0"/>
+          <wp:inline distT="0" distB="0" distL="0" distR="0" wp14:anchorId="350309D0" wp14:editId="0A53AEE3">
+            <wp:extent cx="2250366" cy="3543300"/>
+            <wp:effectExtent l="0" t="0" r="0" b="0"/>
             <wp:docPr id="5" name="Imagen 5"/>
             <wp:cNvGraphicFramePr>
               <a:graphicFrameLocks xmlns:a="http://schemas.openxmlformats.org/drawingml/2006/main" noChangeAspect="1"/>
@@ -185,7 +236,7 @@
                   <pic:spPr>
                     <a:xfrm>
                       <a:off x="0" y="0"/>
-                      <a:ext cx="2697839" cy="4247870"/>
+                      <a:ext cx="2304102" cy="3627910"/>
                     </a:xfrm>
                     <a:prstGeom prst="rect">
                       <a:avLst/>
@@ -196,6 +247,115 @@
             </a:graphic>
           </wp:inline>
         </w:drawing>
+      </w:r>
+    </w:p>
+    <w:p>
+      <w:pPr>
+        <w:jc w:val="both"/>
+        <w:rPr>
+          <w:lang w:val="en-US"/>
+        </w:rPr>
+      </w:pPr>
+      <w:r>
+        <w:rPr>
+          <w:rFonts w:ascii="Times New Roman" w:eastAsia="Times New Roman" w:hAnsi="Times New Roman" w:cs="Times New Roman"/>
+          <w:sz w:val="24"/>
+          <w:lang w:val="en-US"/>
+        </w:rPr>
+        <w:lastRenderedPageBreak/>
+        <w:t xml:space="preserve">The program graph of </w:t>
+      </w:r>
+      <w:proofErr w:type="spellStart"/>
+      <w:r>
+        <w:rPr>
+          <w:rFonts w:ascii="Times New Roman" w:eastAsia="Times New Roman" w:hAnsi="Times New Roman" w:cs="Times New Roman"/>
+          <w:i/>
+          <w:sz w:val="24"/>
+          <w:lang w:val="en-US"/>
+        </w:rPr>
+        <w:t>to_roman</w:t>
+      </w:r>
+      <w:proofErr w:type="spellEnd"/>
+      <w:r>
+        <w:rPr>
+          <w:rFonts w:ascii="Times New Roman" w:eastAsia="Times New Roman" w:hAnsi="Times New Roman" w:cs="Times New Roman"/>
+          <w:sz w:val="24"/>
+          <w:lang w:val="en-US"/>
+        </w:rPr>
+        <w:t xml:space="preserve"> covers lines 40 to 53. The compound predicate of line 41 is decomposed into two nodes, 41a for </w:t>
+      </w:r>
+      <w:r>
+        <w:rPr>
+          <w:rFonts w:ascii="Times New Roman" w:eastAsia="Times New Roman" w:hAnsi="Times New Roman" w:cs="Times New Roman"/>
+          <w:i/>
+          <w:sz w:val="24"/>
+          <w:lang w:val="en-US"/>
+        </w:rPr>
+        <w:t xml:space="preserve">not </w:t>
+      </w:r>
+      <w:proofErr w:type="spellStart"/>
+      <w:r>
+        <w:rPr>
+          <w:rFonts w:ascii="Times New Roman" w:eastAsia="Times New Roman" w:hAnsi="Times New Roman" w:cs="Times New Roman"/>
+          <w:i/>
+          <w:sz w:val="24"/>
+          <w:lang w:val="en-US"/>
+        </w:rPr>
+        <w:t>isinstance</w:t>
+      </w:r>
+      <w:proofErr w:type="spellEnd"/>
+      <w:r>
+        <w:rPr>
+          <w:rFonts w:ascii="Times New Roman" w:eastAsia="Times New Roman" w:hAnsi="Times New Roman" w:cs="Times New Roman"/>
+          <w:i/>
+          <w:sz w:val="24"/>
+          <w:lang w:val="en-US"/>
+        </w:rPr>
+        <w:t>(n, int)</w:t>
+      </w:r>
+      <w:r>
+        <w:rPr>
+          <w:rFonts w:ascii="Times New Roman" w:eastAsia="Times New Roman" w:hAnsi="Times New Roman" w:cs="Times New Roman"/>
+          <w:sz w:val="24"/>
+          <w:lang w:val="en-US"/>
+        </w:rPr>
+        <w:t xml:space="preserve"> and 41b for </w:t>
+      </w:r>
+      <w:proofErr w:type="spellStart"/>
+      <w:r>
+        <w:rPr>
+          <w:rFonts w:ascii="Times New Roman" w:eastAsia="Times New Roman" w:hAnsi="Times New Roman" w:cs="Times New Roman"/>
+          <w:i/>
+          <w:sz w:val="24"/>
+          <w:lang w:val="en-US"/>
+        </w:rPr>
+        <w:t>isinstance</w:t>
+      </w:r>
+      <w:proofErr w:type="spellEnd"/>
+      <w:r>
+        <w:rPr>
+          <w:rFonts w:ascii="Times New Roman" w:eastAsia="Times New Roman" w:hAnsi="Times New Roman" w:cs="Times New Roman"/>
+          <w:i/>
+          <w:sz w:val="24"/>
+          <w:lang w:val="en-US"/>
+        </w:rPr>
+        <w:t>(n, bool)</w:t>
+      </w:r>
+      <w:r>
+        <w:rPr>
+          <w:rFonts w:ascii="Times New Roman" w:eastAsia="Times New Roman" w:hAnsi="Times New Roman" w:cs="Times New Roman"/>
+          <w:sz w:val="24"/>
+          <w:lang w:val="en-US"/>
+        </w:rPr>
+        <w:t>, so that each condition owns its own decision. With N = 17 nodes and E = 22 edges, the cyclomatic complex</w:t>
+      </w:r>
+      <w:r>
+        <w:rPr>
+          <w:rFonts w:ascii="Times New Roman" w:eastAsia="Times New Roman" w:hAnsi="Times New Roman" w:cs="Times New Roman"/>
+          <w:sz w:val="24"/>
+          <w:lang w:val="en-US"/>
+        </w:rPr>
+        <w:t>ity is V(G) = E − N + 2 = 22 − 17 + 2 = 7, which matches the seven linearly independent paths of the basis set below.</w:t>
       </w:r>
     </w:p>
     <w:p>
@@ -254,7 +414,6 @@
                 <w:szCs w:val="24"/>
                 <w:lang w:eastAsia="es-EC"/>
               </w:rPr>
-              <w:lastRenderedPageBreak/>
               <w:t>#</w:t>
             </w:r>
           </w:p>
@@ -276,6 +435,7 @@
                 <w:lang w:eastAsia="es-EC"/>
               </w:rPr>
             </w:pPr>
+            <w:proofErr w:type="spellStart"/>
             <w:r>
               <w:rPr>
                 <w:rFonts w:ascii="Times New Roman" w:eastAsia="Times New Roman" w:hAnsi="Times New Roman" w:cs="Times New Roman"/>
@@ -285,8 +445,9 @@
                 <w:szCs w:val="24"/>
                 <w:lang w:eastAsia="es-EC"/>
               </w:rPr>
-              <w:t>Camino</w:t>
-            </w:r>
+              <w:t>Path</w:t>
+            </w:r>
+            <w:proofErr w:type="spellEnd"/>
           </w:p>
         </w:tc>
         <w:tc>
@@ -306,6 +467,7 @@
                 <w:lang w:eastAsia="es-EC"/>
               </w:rPr>
             </w:pPr>
+            <w:proofErr w:type="spellStart"/>
             <w:r>
               <w:rPr>
                 <w:rFonts w:ascii="Times New Roman" w:eastAsia="Times New Roman" w:hAnsi="Times New Roman" w:cs="Times New Roman"/>
@@ -315,18 +477,10 @@
                 <w:szCs w:val="24"/>
                 <w:lang w:eastAsia="es-EC"/>
               </w:rPr>
-              <w:t>Decisión invertida</w:t>
-            </w:r>
-          </w:p>
-        </w:tc>
-        <w:tc>
-          <w:tcPr>
-            <w:tcW w:w="1564" w:type="dxa"/>
-            <w:hideMark/>
-          </w:tcPr>
-          <w:p>
-            <w:pPr>
-              <w:jc w:val="center"/>
+              <w:t>Inverted</w:t>
+            </w:r>
+            <w:proofErr w:type="spellEnd"/>
+            <w:r>
               <w:rPr>
                 <w:rFonts w:ascii="Times New Roman" w:eastAsia="Times New Roman" w:hAnsi="Times New Roman" w:cs="Times New Roman"/>
                 <w:b/>
@@ -335,7 +489,9 @@
                 <w:szCs w:val="24"/>
                 <w:lang w:eastAsia="es-EC"/>
               </w:rPr>
-            </w:pPr>
+              <w:t xml:space="preserve"> </w:t>
+            </w:r>
+            <w:proofErr w:type="spellStart"/>
             <w:r>
               <w:rPr>
                 <w:rFonts w:ascii="Times New Roman" w:eastAsia="Times New Roman" w:hAnsi="Times New Roman" w:cs="Times New Roman"/>
@@ -345,7 +501,38 @@
                 <w:szCs w:val="24"/>
                 <w:lang w:eastAsia="es-EC"/>
               </w:rPr>
-              <w:t>Entrada</w:t>
+              <w:t>decision</w:t>
+            </w:r>
+            <w:proofErr w:type="spellEnd"/>
+          </w:p>
+        </w:tc>
+        <w:tc>
+          <w:tcPr>
+            <w:tcW w:w="1564" w:type="dxa"/>
+            <w:hideMark/>
+          </w:tcPr>
+          <w:p>
+            <w:pPr>
+              <w:jc w:val="center"/>
+              <w:rPr>
+                <w:rFonts w:ascii="Times New Roman" w:eastAsia="Times New Roman" w:hAnsi="Times New Roman" w:cs="Times New Roman"/>
+                <w:b/>
+                <w:bCs/>
+                <w:sz w:val="24"/>
+                <w:szCs w:val="24"/>
+                <w:lang w:eastAsia="es-EC"/>
+              </w:rPr>
+            </w:pPr>
+            <w:r>
+              <w:rPr>
+                <w:rFonts w:ascii="Times New Roman" w:eastAsia="Times New Roman" w:hAnsi="Times New Roman" w:cs="Times New Roman"/>
+                <w:b/>
+                <w:bCs/>
+                <w:sz w:val="24"/>
+                <w:szCs w:val="24"/>
+                <w:lang w:eastAsia="es-EC"/>
+              </w:rPr>
+              <w:t>Input</w:t>
             </w:r>
           </w:p>
         </w:tc>
@@ -415,6 +602,7 @@
                 <w:lang w:eastAsia="es-EC"/>
               </w:rPr>
             </w:pPr>
+            <w:proofErr w:type="spellStart"/>
             <w:r>
               <w:rPr>
                 <w:rFonts w:ascii="Times New Roman" w:eastAsia="Times New Roman" w:hAnsi="Times New Roman" w:cs="Times New Roman"/>
@@ -424,6 +612,7 @@
               </w:rPr>
               <w:t>baseline</w:t>
             </w:r>
+            <w:proofErr w:type="spellEnd"/>
           </w:p>
         </w:tc>
         <w:tc>
@@ -447,7 +636,27 @@
                 <w:szCs w:val="24"/>
                 <w:lang w:eastAsia="es-EC"/>
               </w:rPr>
-              <w:t xml:space="preserve"> (infactible)</w:t>
+              <w:t>(</w:t>
+            </w:r>
+            <w:proofErr w:type="spellStart"/>
+            <w:r>
+              <w:rPr>
+                <w:rFonts w:ascii="Times New Roman" w:eastAsia="Times New Roman" w:hAnsi="Times New Roman" w:cs="Times New Roman"/>
+                <w:sz w:val="24"/>
+                <w:szCs w:val="24"/>
+                <w:lang w:eastAsia="es-EC"/>
+              </w:rPr>
+              <w:t>infeasible</w:t>
+            </w:r>
+            <w:proofErr w:type="spellEnd"/>
+            <w:r>
+              <w:rPr>
+                <w:rFonts w:ascii="Times New Roman" w:eastAsia="Times New Roman" w:hAnsi="Times New Roman" w:cs="Times New Roman"/>
+                <w:sz w:val="24"/>
+                <w:szCs w:val="24"/>
+                <w:lang w:eastAsia="es-EC"/>
+              </w:rPr>
+              <w:t>)</w:t>
             </w:r>
           </w:p>
         </w:tc>
@@ -957,25 +1166,27 @@
                 <w:szCs w:val="24"/>
                 <w:lang w:eastAsia="es-EC"/>
               </w:rPr>
-              <w:t xml:space="preserve"> </w:t>
-            </w:r>
-            <w:r>
-              <w:rPr>
-                <w:rFonts w:ascii="Times New Roman" w:eastAsia="Times New Roman" w:hAnsi="Times New Roman" w:cs="Times New Roman"/>
-                <w:sz w:val="24"/>
-                <w:szCs w:val="24"/>
-                <w:lang w:eastAsia="es-EC"/>
-              </w:rPr>
               <w:t>(</w:t>
             </w:r>
-            <w:r>
-              <w:rPr>
-                <w:rFonts w:ascii="Times New Roman" w:eastAsia="Times New Roman" w:hAnsi="Times New Roman" w:cs="Times New Roman"/>
-                <w:sz w:val="24"/>
-                <w:szCs w:val="24"/>
-                <w:lang w:eastAsia="es-EC"/>
-              </w:rPr>
-              <w:t>infactible)</w:t>
+            <w:proofErr w:type="spellStart"/>
+            <w:r>
+              <w:rPr>
+                <w:rFonts w:ascii="Times New Roman" w:eastAsia="Times New Roman" w:hAnsi="Times New Roman" w:cs="Times New Roman"/>
+                <w:sz w:val="24"/>
+                <w:szCs w:val="24"/>
+                <w:lang w:eastAsia="es-EC"/>
+              </w:rPr>
+              <w:t>infeasible</w:t>
+            </w:r>
+            <w:proofErr w:type="spellEnd"/>
+            <w:r>
+              <w:rPr>
+                <w:rFonts w:ascii="Times New Roman" w:eastAsia="Times New Roman" w:hAnsi="Times New Roman" w:cs="Times New Roman"/>
+                <w:sz w:val="24"/>
+                <w:szCs w:val="24"/>
+                <w:lang w:eastAsia="es-EC"/>
+              </w:rPr>
+              <w:t>)</w:t>
             </w:r>
           </w:p>
         </w:tc>
@@ -1083,7 +1294,14 @@
         </w:tc>
       </w:tr>
     </w:tbl>
-    <w:p/>
+    <w:p>
+      <w:pPr>
+        <w:jc w:val="both"/>
+        <w:rPr>
+          <w:lang w:val="en-US"/>
+        </w:rPr>
+      </w:pPr>
+    </w:p>
     <w:tbl>
       <w:tblPr>
         <w:tblStyle w:val="Tablaconcuadrcula"/>
@@ -1092,8 +1310,8 @@
         <w:tblLook w:val="04A0" w:firstRow="1" w:lastRow="0" w:firstColumn="1" w:lastColumn="0" w:noHBand="0" w:noVBand="1"/>
       </w:tblPr>
       <w:tblGrid>
-        <w:gridCol w:w="803"/>
-        <w:gridCol w:w="2850"/>
+        <w:gridCol w:w="683"/>
+        <w:gridCol w:w="3217"/>
         <w:gridCol w:w="2017"/>
         <w:gridCol w:w="2017"/>
       </w:tblGrid>
@@ -1127,7 +1345,7 @@
                 <w:szCs w:val="24"/>
                 <w:lang w:eastAsia="es-EC"/>
               </w:rPr>
-              <w:t>Línea</w:t>
+              <w:t>Line</w:t>
             </w:r>
           </w:p>
         </w:tc>
@@ -1148,6 +1366,7 @@
                 <w:lang w:eastAsia="es-EC"/>
               </w:rPr>
             </w:pPr>
+            <w:proofErr w:type="spellStart"/>
             <w:r>
               <w:rPr>
                 <w:rFonts w:ascii="Times New Roman" w:eastAsia="Times New Roman" w:hAnsi="Times New Roman" w:cs="Times New Roman"/>
@@ -1157,8 +1376,9 @@
                 <w:szCs w:val="24"/>
                 <w:lang w:eastAsia="es-EC"/>
               </w:rPr>
-              <w:t>Definición</w:t>
-            </w:r>
+              <w:t>Definition</w:t>
+            </w:r>
+            <w:proofErr w:type="spellEnd"/>
           </w:p>
         </w:tc>
         <w:tc>
@@ -1736,6 +1956,7 @@
                 <w:lang w:eastAsia="es-EC"/>
               </w:rPr>
             </w:pPr>
+            <w:proofErr w:type="spellStart"/>
             <w:r>
               <w:rPr>
                 <w:rFonts w:ascii="Courier New" w:eastAsia="Times New Roman" w:hAnsi="Courier New" w:cs="Courier New"/>
@@ -1745,6 +1966,7 @@
               </w:rPr>
               <w:t>out</w:t>
             </w:r>
+            <w:proofErr w:type="spellEnd"/>
           </w:p>
         </w:tc>
         <w:tc>
@@ -1823,6 +2045,7 @@
                 <w:lang w:eastAsia="es-EC"/>
               </w:rPr>
             </w:pPr>
+            <w:proofErr w:type="spellStart"/>
             <w:r>
               <w:rPr>
                 <w:rFonts w:ascii="Courier New" w:eastAsia="Times New Roman" w:hAnsi="Courier New" w:cs="Courier New"/>
@@ -1832,6 +2055,7 @@
               </w:rPr>
               <w:t>remaining</w:t>
             </w:r>
+            <w:proofErr w:type="spellEnd"/>
           </w:p>
         </w:tc>
         <w:tc>
@@ -1919,6 +2143,7 @@
                 <w:lang w:eastAsia="es-EC"/>
               </w:rPr>
             </w:pPr>
+            <w:proofErr w:type="spellStart"/>
             <w:r>
               <w:rPr>
                 <w:rFonts w:ascii="Courier New" w:eastAsia="Times New Roman" w:hAnsi="Courier New" w:cs="Courier New"/>
@@ -1928,6 +2153,7 @@
               </w:rPr>
               <w:t>value</w:t>
             </w:r>
+            <w:proofErr w:type="spellEnd"/>
             <w:r>
               <w:rPr>
                 <w:rFonts w:ascii="Times New Roman" w:eastAsia="Times New Roman" w:hAnsi="Times New Roman" w:cs="Times New Roman"/>
@@ -2065,6 +2291,7 @@
                 <w:lang w:eastAsia="es-EC"/>
               </w:rPr>
             </w:pPr>
+            <w:proofErr w:type="spellStart"/>
             <w:r>
               <w:rPr>
                 <w:rFonts w:ascii="Courier New" w:eastAsia="Times New Roman" w:hAnsi="Courier New" w:cs="Courier New"/>
@@ -2074,6 +2301,7 @@
               </w:rPr>
               <w:t>remaining</w:t>
             </w:r>
+            <w:proofErr w:type="spellEnd"/>
             <w:r>
               <w:rPr>
                 <w:rFonts w:ascii="Times New Roman" w:eastAsia="Times New Roman" w:hAnsi="Times New Roman" w:cs="Times New Roman"/>
@@ -2083,6 +2311,7 @@
               </w:rPr>
               <w:t xml:space="preserve">, </w:t>
             </w:r>
+            <w:proofErr w:type="spellStart"/>
             <w:r>
               <w:rPr>
                 <w:rFonts w:ascii="Courier New" w:eastAsia="Times New Roman" w:hAnsi="Courier New" w:cs="Courier New"/>
@@ -2092,6 +2321,7 @@
               </w:rPr>
               <w:t>value</w:t>
             </w:r>
+            <w:proofErr w:type="spellEnd"/>
           </w:p>
         </w:tc>
       </w:tr>
@@ -2138,6 +2368,7 @@
                 <w:lang w:eastAsia="es-EC"/>
               </w:rPr>
             </w:pPr>
+            <w:proofErr w:type="spellStart"/>
             <w:r>
               <w:rPr>
                 <w:rFonts w:ascii="Courier New" w:eastAsia="Times New Roman" w:hAnsi="Courier New" w:cs="Courier New"/>
@@ -2147,15 +2378,7 @@
               </w:rPr>
               <w:t>out</w:t>
             </w:r>
-            <w:r>
-              <w:rPr>
-                <w:rFonts w:ascii="Times New Roman" w:eastAsia="Times New Roman" w:hAnsi="Times New Roman" w:cs="Times New Roman"/>
-                <w:sz w:val="24"/>
-                <w:szCs w:val="24"/>
-                <w:lang w:eastAsia="es-EC"/>
-              </w:rPr>
-              <w:t xml:space="preserve"> (mutación por </w:t>
-            </w:r>
+            <w:proofErr w:type="spellEnd"/>
             <w:r>
               <w:rPr>
                 <w:rFonts w:ascii="Courier New" w:eastAsia="Times New Roman" w:hAnsi="Courier New" w:cs="Courier New"/>
@@ -2163,13 +2386,64 @@
                 <w:szCs w:val="20"/>
                 <w:lang w:eastAsia="es-EC"/>
               </w:rPr>
+              <w:t xml:space="preserve"> (</w:t>
+            </w:r>
+            <w:proofErr w:type="spellStart"/>
+            <w:r>
+              <w:rPr>
+                <w:rFonts w:ascii="Courier New" w:eastAsia="Times New Roman" w:hAnsi="Courier New" w:cs="Courier New"/>
+                <w:sz w:val="20"/>
+                <w:szCs w:val="20"/>
+                <w:lang w:eastAsia="es-EC"/>
+              </w:rPr>
+              <w:t>redefined</w:t>
+            </w:r>
+            <w:proofErr w:type="spellEnd"/>
+            <w:r>
+              <w:rPr>
+                <w:rFonts w:ascii="Courier New" w:eastAsia="Times New Roman" w:hAnsi="Courier New" w:cs="Courier New"/>
+                <w:sz w:val="20"/>
+                <w:szCs w:val="20"/>
+                <w:lang w:eastAsia="es-EC"/>
+              </w:rPr>
+              <w:t xml:space="preserve"> </w:t>
+            </w:r>
+            <w:proofErr w:type="spellStart"/>
+            <w:r>
+              <w:rPr>
+                <w:rFonts w:ascii="Courier New" w:eastAsia="Times New Roman" w:hAnsi="Courier New" w:cs="Courier New"/>
+                <w:sz w:val="20"/>
+                <w:szCs w:val="20"/>
+                <w:lang w:eastAsia="es-EC"/>
+              </w:rPr>
+              <w:t>by</w:t>
+            </w:r>
+            <w:proofErr w:type="spellEnd"/>
+            <w:r>
+              <w:rPr>
+                <w:rFonts w:ascii="Courier New" w:eastAsia="Times New Roman" w:hAnsi="Courier New" w:cs="Courier New"/>
+                <w:sz w:val="20"/>
+                <w:szCs w:val="20"/>
+                <w:lang w:eastAsia="es-EC"/>
+              </w:rPr>
+              <w:t xml:space="preserve"> </w:t>
+            </w:r>
+            <w:proofErr w:type="spellStart"/>
+            <w:r>
+              <w:rPr>
+                <w:rFonts w:ascii="Courier New" w:eastAsia="Times New Roman" w:hAnsi="Courier New" w:cs="Courier New"/>
+                <w:sz w:val="20"/>
+                <w:szCs w:val="20"/>
+                <w:lang w:eastAsia="es-EC"/>
+              </w:rPr>
               <w:t>append</w:t>
             </w:r>
-            <w:r>
-              <w:rPr>
-                <w:rFonts w:ascii="Times New Roman" w:eastAsia="Times New Roman" w:hAnsi="Times New Roman" w:cs="Times New Roman"/>
-                <w:sz w:val="24"/>
-                <w:szCs w:val="24"/>
+            <w:proofErr w:type="spellEnd"/>
+            <w:r>
+              <w:rPr>
+                <w:rFonts w:ascii="Courier New" w:eastAsia="Times New Roman" w:hAnsi="Courier New" w:cs="Courier New"/>
+                <w:sz w:val="20"/>
+                <w:szCs w:val="20"/>
                 <w:lang w:eastAsia="es-EC"/>
               </w:rPr>
               <w:t>)</w:t>
@@ -2190,6 +2464,7 @@
                 <w:lang w:eastAsia="es-EC"/>
               </w:rPr>
             </w:pPr>
+            <w:proofErr w:type="spellStart"/>
             <w:r>
               <w:rPr>
                 <w:rFonts w:ascii="Courier New" w:eastAsia="Times New Roman" w:hAnsi="Courier New" w:cs="Courier New"/>
@@ -2199,6 +2474,7 @@
               </w:rPr>
               <w:t>out</w:t>
             </w:r>
+            <w:proofErr w:type="spellEnd"/>
             <w:r>
               <w:rPr>
                 <w:rFonts w:ascii="Times New Roman" w:eastAsia="Times New Roman" w:hAnsi="Times New Roman" w:cs="Times New Roman"/>
@@ -2279,6 +2555,7 @@
                 <w:lang w:eastAsia="es-EC"/>
               </w:rPr>
             </w:pPr>
+            <w:proofErr w:type="spellStart"/>
             <w:r>
               <w:rPr>
                 <w:rFonts w:ascii="Courier New" w:eastAsia="Times New Roman" w:hAnsi="Courier New" w:cs="Courier New"/>
@@ -2288,31 +2565,7 @@
               </w:rPr>
               <w:t>remaining</w:t>
             </w:r>
-            <w:r>
-              <w:rPr>
-                <w:rFonts w:ascii="Times New Roman" w:eastAsia="Times New Roman" w:hAnsi="Times New Roman" w:cs="Times New Roman"/>
-                <w:sz w:val="24"/>
-                <w:szCs w:val="24"/>
-                <w:lang w:eastAsia="es-EC"/>
-              </w:rPr>
-              <w:t xml:space="preserve"> (redefinición)</w:t>
-            </w:r>
-          </w:p>
-        </w:tc>
-        <w:tc>
-          <w:tcPr>
-            <w:tcW w:w="0" w:type="auto"/>
-            <w:hideMark/>
-          </w:tcPr>
-          <w:p>
-            <w:pPr>
-              <w:rPr>
-                <w:rFonts w:ascii="Times New Roman" w:eastAsia="Times New Roman" w:hAnsi="Times New Roman" w:cs="Times New Roman"/>
-                <w:sz w:val="24"/>
-                <w:szCs w:val="24"/>
-                <w:lang w:eastAsia="es-EC"/>
-              </w:rPr>
-            </w:pPr>
+            <w:proofErr w:type="spellEnd"/>
             <w:r>
               <w:rPr>
                 <w:rFonts w:ascii="Courier New" w:eastAsia="Times New Roman" w:hAnsi="Courier New" w:cs="Courier New"/>
@@ -2320,8 +2573,55 @@
                 <w:szCs w:val="20"/>
                 <w:lang w:eastAsia="es-EC"/>
               </w:rPr>
+              <w:t xml:space="preserve"> (</w:t>
+            </w:r>
+            <w:proofErr w:type="spellStart"/>
+            <w:r>
+              <w:rPr>
+                <w:rFonts w:ascii="Courier New" w:eastAsia="Times New Roman" w:hAnsi="Courier New" w:cs="Courier New"/>
+                <w:sz w:val="20"/>
+                <w:szCs w:val="20"/>
+                <w:lang w:eastAsia="es-EC"/>
+              </w:rPr>
+              <w:t>redefinition</w:t>
+            </w:r>
+            <w:proofErr w:type="spellEnd"/>
+            <w:r>
+              <w:rPr>
+                <w:rFonts w:ascii="Courier New" w:eastAsia="Times New Roman" w:hAnsi="Courier New" w:cs="Courier New"/>
+                <w:sz w:val="20"/>
+                <w:szCs w:val="20"/>
+                <w:lang w:eastAsia="es-EC"/>
+              </w:rPr>
+              <w:t>)</w:t>
+            </w:r>
+          </w:p>
+        </w:tc>
+        <w:tc>
+          <w:tcPr>
+            <w:tcW w:w="0" w:type="auto"/>
+            <w:hideMark/>
+          </w:tcPr>
+          <w:p>
+            <w:pPr>
+              <w:rPr>
+                <w:rFonts w:ascii="Times New Roman" w:eastAsia="Times New Roman" w:hAnsi="Times New Roman" w:cs="Times New Roman"/>
+                <w:sz w:val="24"/>
+                <w:szCs w:val="24"/>
+                <w:lang w:eastAsia="es-EC"/>
+              </w:rPr>
+            </w:pPr>
+            <w:proofErr w:type="spellStart"/>
+            <w:r>
+              <w:rPr>
+                <w:rFonts w:ascii="Courier New" w:eastAsia="Times New Roman" w:hAnsi="Courier New" w:cs="Courier New"/>
+                <w:sz w:val="20"/>
+                <w:szCs w:val="20"/>
+                <w:lang w:eastAsia="es-EC"/>
+              </w:rPr>
               <w:t>remaining</w:t>
             </w:r>
+            <w:proofErr w:type="spellEnd"/>
             <w:r>
               <w:rPr>
                 <w:rFonts w:ascii="Times New Roman" w:eastAsia="Times New Roman" w:hAnsi="Times New Roman" w:cs="Times New Roman"/>
@@ -2331,6 +2631,7 @@
               </w:rPr>
               <w:t xml:space="preserve">, </w:t>
             </w:r>
+            <w:proofErr w:type="spellStart"/>
             <w:r>
               <w:rPr>
                 <w:rFonts w:ascii="Courier New" w:eastAsia="Times New Roman" w:hAnsi="Courier New" w:cs="Courier New"/>
@@ -2340,6 +2641,7 @@
               </w:rPr>
               <w:t>value</w:t>
             </w:r>
+            <w:proofErr w:type="spellEnd"/>
           </w:p>
         </w:tc>
         <w:tc>
@@ -2418,6 +2720,7 @@
                 <w:lang w:eastAsia="es-EC"/>
               </w:rPr>
             </w:pPr>
+            <w:proofErr w:type="spellStart"/>
             <w:r>
               <w:rPr>
                 <w:rFonts w:ascii="Courier New" w:eastAsia="Times New Roman" w:hAnsi="Courier New" w:cs="Courier New"/>
@@ -2427,6 +2730,7 @@
               </w:rPr>
               <w:t>out</w:t>
             </w:r>
+            <w:proofErr w:type="spellEnd"/>
           </w:p>
         </w:tc>
         <w:tc>
@@ -2448,6 +2752,22 @@
       </w:tr>
     </w:tbl>
     <w:p/>
+    <w:p>
+      <w:pPr>
+        <w:jc w:val="both"/>
+        <w:rPr>
+          <w:lang w:val="en-US"/>
+        </w:rPr>
+      </w:pPr>
+      <w:r>
+        <w:rPr>
+          <w:rFonts w:ascii="Times New Roman" w:eastAsia="Times New Roman" w:hAnsi="Times New Roman" w:cs="Times New Roman"/>
+          <w:sz w:val="24"/>
+          <w:lang w:val="en-US"/>
+        </w:rPr>
+        <w:t>The resulting definition-use pairs:</w:t>
+      </w:r>
+    </w:p>
     <w:tbl>
       <w:tblPr>
         <w:tblStyle w:val="Tablaconcuadrcula"/>
@@ -2965,6 +3285,7 @@
                 <w:lang w:eastAsia="es-EC"/>
               </w:rPr>
             </w:pPr>
+            <w:proofErr w:type="spellStart"/>
             <w:r>
               <w:rPr>
                 <w:rFonts w:ascii="Times New Roman" w:eastAsia="Times New Roman" w:hAnsi="Times New Roman" w:cs="Times New Roman"/>
@@ -2974,6 +3295,7 @@
               </w:rPr>
               <w:t>out</w:t>
             </w:r>
+            <w:proofErr w:type="spellEnd"/>
           </w:p>
         </w:tc>
         <w:tc>
@@ -3036,6 +3358,7 @@
                 <w:lang w:eastAsia="es-EC"/>
               </w:rPr>
             </w:pPr>
+            <w:proofErr w:type="spellStart"/>
             <w:r>
               <w:rPr>
                 <w:rFonts w:ascii="Times New Roman" w:eastAsia="Times New Roman" w:hAnsi="Times New Roman" w:cs="Times New Roman"/>
@@ -3045,6 +3368,7 @@
               </w:rPr>
               <w:t>out</w:t>
             </w:r>
+            <w:proofErr w:type="spellEnd"/>
           </w:p>
         </w:tc>
         <w:tc>
@@ -3107,6 +3431,7 @@
                 <w:lang w:eastAsia="es-EC"/>
               </w:rPr>
             </w:pPr>
+            <w:proofErr w:type="spellStart"/>
             <w:r>
               <w:rPr>
                 <w:rFonts w:ascii="Times New Roman" w:eastAsia="Times New Roman" w:hAnsi="Times New Roman" w:cs="Times New Roman"/>
@@ -3116,6 +3441,7 @@
               </w:rPr>
               <w:t>out</w:t>
             </w:r>
+            <w:proofErr w:type="spellEnd"/>
           </w:p>
         </w:tc>
         <w:tc>
@@ -3178,6 +3504,7 @@
                 <w:lang w:eastAsia="es-EC"/>
               </w:rPr>
             </w:pPr>
+            <w:proofErr w:type="spellStart"/>
             <w:r>
               <w:rPr>
                 <w:rFonts w:ascii="Times New Roman" w:eastAsia="Times New Roman" w:hAnsi="Times New Roman" w:cs="Times New Roman"/>
@@ -3187,6 +3514,7 @@
               </w:rPr>
               <w:t>out</w:t>
             </w:r>
+            <w:proofErr w:type="spellEnd"/>
           </w:p>
         </w:tc>
         <w:tc>
@@ -3265,6 +3593,7 @@
                 <w:lang w:eastAsia="es-EC"/>
               </w:rPr>
             </w:pPr>
+            <w:proofErr w:type="spellStart"/>
             <w:r>
               <w:rPr>
                 <w:rFonts w:ascii="Times New Roman" w:eastAsia="Times New Roman" w:hAnsi="Times New Roman" w:cs="Times New Roman"/>
@@ -3274,6 +3603,7 @@
               </w:rPr>
               <w:t>remaining</w:t>
             </w:r>
+            <w:proofErr w:type="spellEnd"/>
           </w:p>
         </w:tc>
       </w:tr>
@@ -3320,6 +3650,7 @@
                 <w:lang w:eastAsia="es-EC"/>
               </w:rPr>
             </w:pPr>
+            <w:proofErr w:type="spellStart"/>
             <w:r>
               <w:rPr>
                 <w:rFonts w:ascii="Times New Roman" w:eastAsia="Times New Roman" w:hAnsi="Times New Roman" w:cs="Times New Roman"/>
@@ -3329,6 +3660,7 @@
               </w:rPr>
               <w:t>remaining</w:t>
             </w:r>
+            <w:proofErr w:type="spellEnd"/>
           </w:p>
         </w:tc>
         <w:tc>
@@ -3409,6 +3741,7 @@
                 <w:lang w:eastAsia="es-EC"/>
               </w:rPr>
             </w:pPr>
+            <w:proofErr w:type="spellStart"/>
             <w:r>
               <w:rPr>
                 <w:rFonts w:ascii="Times New Roman" w:eastAsia="Times New Roman" w:hAnsi="Times New Roman" w:cs="Times New Roman"/>
@@ -3420,6 +3753,7 @@
               </w:rPr>
               <w:t>remaining</w:t>
             </w:r>
+            <w:proofErr w:type="spellEnd"/>
           </w:p>
         </w:tc>
       </w:tr>
@@ -3450,6 +3784,7 @@
                 <w:szCs w:val="24"/>
                 <w:lang w:eastAsia="es-EC"/>
               </w:rPr>
+              <w:lastRenderedPageBreak/>
               <w:t>(52, 52)</w:t>
             </w:r>
           </w:p>
@@ -3468,6 +3803,7 @@
                 <w:lang w:eastAsia="es-EC"/>
               </w:rPr>
             </w:pPr>
+            <w:proofErr w:type="spellStart"/>
             <w:r>
               <w:rPr>
                 <w:rFonts w:ascii="Times New Roman" w:eastAsia="Times New Roman" w:hAnsi="Times New Roman" w:cs="Times New Roman"/>
@@ -3479,6 +3815,7 @@
               </w:rPr>
               <w:t>remaining</w:t>
             </w:r>
+            <w:proofErr w:type="spellEnd"/>
           </w:p>
         </w:tc>
         <w:tc>
@@ -3557,6 +3894,7 @@
                 <w:lang w:eastAsia="es-EC"/>
               </w:rPr>
             </w:pPr>
+            <w:proofErr w:type="spellStart"/>
             <w:r>
               <w:rPr>
                 <w:rFonts w:ascii="Times New Roman" w:eastAsia="Times New Roman" w:hAnsi="Times New Roman" w:cs="Times New Roman"/>
@@ -3566,6 +3904,7 @@
               </w:rPr>
               <w:t>value</w:t>
             </w:r>
+            <w:proofErr w:type="spellEnd"/>
           </w:p>
         </w:tc>
       </w:tr>
@@ -3612,6 +3951,7 @@
                 <w:lang w:eastAsia="es-EC"/>
               </w:rPr>
             </w:pPr>
+            <w:proofErr w:type="spellStart"/>
             <w:r>
               <w:rPr>
                 <w:rFonts w:ascii="Times New Roman" w:eastAsia="Times New Roman" w:hAnsi="Times New Roman" w:cs="Times New Roman"/>
@@ -3621,6 +3961,7 @@
               </w:rPr>
               <w:t>value</w:t>
             </w:r>
+            <w:proofErr w:type="spellEnd"/>
           </w:p>
         </w:tc>
         <w:tc>
@@ -3712,17 +4053,78 @@
         </w:tc>
       </w:tr>
     </w:tbl>
-    <w:p/>
     <w:p>
-      <w:r>
-        <w:br w:type="page"/>
-      </w:r>
+      <w:pPr>
+        <w:rPr>
+          <w:lang w:val="en-US"/>
+        </w:rPr>
+      </w:pPr>
     </w:p>
     <w:p>
-      <w:r>
-        <w:lastRenderedPageBreak/>
+      <w:pPr>
+        <w:jc w:val="both"/>
+        <w:rPr>
+          <w:lang w:val="en-US"/>
+        </w:rPr>
+      </w:pPr>
+      <w:r>
+        <w:rPr>
+          <w:rFonts w:ascii="Times New Roman" w:eastAsia="Times New Roman" w:hAnsi="Times New Roman" w:cs="Times New Roman"/>
+          <w:sz w:val="24"/>
+          <w:lang w:val="en-US"/>
+        </w:rPr>
+        <w:t xml:space="preserve">The structural unit tests raise branch coverage of </w:t>
+      </w:r>
+      <w:r>
+        <w:rPr>
+          <w:rFonts w:ascii="Times New Roman" w:eastAsia="Times New Roman" w:hAnsi="Times New Roman" w:cs="Times New Roman"/>
+          <w:i/>
+          <w:sz w:val="24"/>
+          <w:lang w:val="en-US"/>
+        </w:rPr>
+        <w:t>src/roman/converter.py</w:t>
+      </w:r>
+      <w:r>
+        <w:rPr>
+          <w:rFonts w:ascii="Times New Roman" w:eastAsia="Times New Roman" w:hAnsi="Times New Roman" w:cs="Times New Roman"/>
+          <w:sz w:val="24"/>
+          <w:lang w:val="en-US"/>
+        </w:rPr>
+        <w:t xml:space="preserve"> from the 64% measured in Part 2 to 100%, above the 85% required. Four tests fail; all four are</w:t>
+      </w:r>
+      <w:r>
+        <w:rPr>
+          <w:rFonts w:ascii="Times New Roman" w:eastAsia="Times New Roman" w:hAnsi="Times New Roman" w:cs="Times New Roman"/>
+          <w:sz w:val="24"/>
+          <w:lang w:val="en-US"/>
+        </w:rPr>
+        <w:t xml:space="preserve"> caused by the same defect in </w:t>
+      </w:r>
+      <w:r>
+        <w:rPr>
+          <w:rFonts w:ascii="Times New Roman" w:eastAsia="Times New Roman" w:hAnsi="Times New Roman" w:cs="Times New Roman"/>
+          <w:i/>
+          <w:sz w:val="24"/>
+          <w:lang w:val="en-US"/>
+        </w:rPr>
+        <w:t>_PAIRS</w:t>
+      </w:r>
+      <w:r>
+        <w:rPr>
+          <w:rFonts w:ascii="Times New Roman" w:eastAsia="Times New Roman" w:hAnsi="Times New Roman" w:cs="Times New Roman"/>
+          <w:sz w:val="24"/>
+          <w:lang w:val="en-US"/>
+        </w:rPr>
+        <w:t xml:space="preserve"> and are corrected in Part 6.</w:t>
+      </w:r>
+    </w:p>
+    <w:p>
+      <w:r>
+        <w:rPr>
+          <w:noProof/>
+        </w:rPr>
         <w:drawing>
-          <wp:inline distT="0" distB="0" distL="0" distR="0" wp14:anchorId="6743D46F" wp14:editId="428FBAAB">
+          <wp:inline distT="0" distB="0" distL="0" distR="0" wp14:anchorId="14809E61" wp14:editId="2548BBD1">
             <wp:extent cx="5400040" cy="730885"/>
             <wp:effectExtent l="0" t="0" r="0" b="0"/>
             <wp:docPr id="3" name="Imagen 3"/>
@@ -3760,8 +4162,11 @@
     </w:p>
     <w:p>
       <w:r>
+        <w:rPr>
+          <w:noProof/>
+        </w:rPr>
         <w:drawing>
-          <wp:inline distT="0" distB="0" distL="0" distR="0" wp14:anchorId="31B60068" wp14:editId="636E3B8C">
+          <wp:inline distT="0" distB="0" distL="0" distR="0" wp14:anchorId="725A0CD3" wp14:editId="03AAFAEF">
             <wp:extent cx="5400040" cy="2002790"/>
             <wp:effectExtent l="0" t="0" r="0" b="0"/>
             <wp:docPr id="4" name="Imagen 4"/>
@@ -3799,8 +4204,11 @@
     </w:p>
     <w:p>
       <w:r>
+        <w:rPr>
+          <w:noProof/>
+        </w:rPr>
         <w:drawing>
-          <wp:inline distT="0" distB="0" distL="0" distR="0" wp14:anchorId="17430B33" wp14:editId="21BEC4CC">
+          <wp:inline distT="0" distB="0" distL="0" distR="0" wp14:anchorId="5169551A" wp14:editId="50F29BB7">
             <wp:extent cx="5400040" cy="828675"/>
             <wp:effectExtent l="0" t="0" r="0" b="9525"/>
             <wp:docPr id="6" name="Imagen 6"/>
@@ -3876,7 +4284,207 @@
           <w:szCs w:val="24"/>
           <w:lang w:val="en-US"/>
         </w:rPr>
-        <w:t>Section 7 defines add_roman and subtract_roman as compositions: each decodes both operands with from_roman, operates, and re-encodes with to_roman. The unit under test is a collaboration, not a function. Its closing requirement is the only one that constrains two units against each other: the result of add_roman must always be accepted by is_valid_roman. Five of the six mandatory examples hold; only add_roman("II", "II") deviates, returning IIII instead of IV. Yet the consistency requirement holds even there, since is_valid_roman("IIII") returns True and from_roman(to_roman(n)) == n has zero failures over the whole domain.</w:t>
+        <w:t xml:space="preserve">Section 7 defines </w:t>
+      </w:r>
+      <w:proofErr w:type="spellStart"/>
+      <w:r>
+        <w:rPr>
+          <w:rFonts w:ascii="Times New Roman" w:hAnsi="Times New Roman" w:cs="Times New Roman"/>
+          <w:sz w:val="24"/>
+          <w:szCs w:val="24"/>
+          <w:lang w:val="en-US"/>
+        </w:rPr>
+        <w:t>add_roman</w:t>
+      </w:r>
+      <w:proofErr w:type="spellEnd"/>
+      <w:r>
+        <w:rPr>
+          <w:rFonts w:ascii="Times New Roman" w:hAnsi="Times New Roman" w:cs="Times New Roman"/>
+          <w:sz w:val="24"/>
+          <w:szCs w:val="24"/>
+          <w:lang w:val="en-US"/>
+        </w:rPr>
+        <w:t xml:space="preserve"> and </w:t>
+      </w:r>
+      <w:proofErr w:type="spellStart"/>
+      <w:r>
+        <w:rPr>
+          <w:rFonts w:ascii="Times New Roman" w:hAnsi="Times New Roman" w:cs="Times New Roman"/>
+          <w:sz w:val="24"/>
+          <w:szCs w:val="24"/>
+          <w:lang w:val="en-US"/>
+        </w:rPr>
+        <w:t>subtract_roman</w:t>
+      </w:r>
+      <w:proofErr w:type="spellEnd"/>
+      <w:r>
+        <w:rPr>
+          <w:rFonts w:ascii="Times New Roman" w:hAnsi="Times New Roman" w:cs="Times New Roman"/>
+          <w:sz w:val="24"/>
+          <w:szCs w:val="24"/>
+          <w:lang w:val="en-US"/>
+        </w:rPr>
+        <w:t xml:space="preserve"> as compositions: each decodes both operands with </w:t>
+      </w:r>
+      <w:proofErr w:type="spellStart"/>
+      <w:r>
+        <w:rPr>
+          <w:rFonts w:ascii="Times New Roman" w:hAnsi="Times New Roman" w:cs="Times New Roman"/>
+          <w:sz w:val="24"/>
+          <w:szCs w:val="24"/>
+          <w:lang w:val="en-US"/>
+        </w:rPr>
+        <w:t>from_roman</w:t>
+      </w:r>
+      <w:proofErr w:type="spellEnd"/>
+      <w:r>
+        <w:rPr>
+          <w:rFonts w:ascii="Times New Roman" w:hAnsi="Times New Roman" w:cs="Times New Roman"/>
+          <w:sz w:val="24"/>
+          <w:szCs w:val="24"/>
+          <w:lang w:val="en-US"/>
+        </w:rPr>
+        <w:t xml:space="preserve">, operates, and re-encodes with </w:t>
+      </w:r>
+      <w:proofErr w:type="spellStart"/>
+      <w:r>
+        <w:rPr>
+          <w:rFonts w:ascii="Times New Roman" w:hAnsi="Times New Roman" w:cs="Times New Roman"/>
+          <w:sz w:val="24"/>
+          <w:szCs w:val="24"/>
+          <w:lang w:val="en-US"/>
+        </w:rPr>
+        <w:t>to_roman</w:t>
+      </w:r>
+      <w:proofErr w:type="spellEnd"/>
+      <w:r>
+        <w:rPr>
+          <w:rFonts w:ascii="Times New Roman" w:hAnsi="Times New Roman" w:cs="Times New Roman"/>
+          <w:sz w:val="24"/>
+          <w:szCs w:val="24"/>
+          <w:lang w:val="en-US"/>
+        </w:rPr>
+        <w:t xml:space="preserve">. The unit under test is a collaboration, not a function. Its closing requirement is the only one that constrains two units against each other: the result of </w:t>
+      </w:r>
+      <w:proofErr w:type="spellStart"/>
+      <w:r>
+        <w:rPr>
+          <w:rFonts w:ascii="Times New Roman" w:hAnsi="Times New Roman" w:cs="Times New Roman"/>
+          <w:sz w:val="24"/>
+          <w:szCs w:val="24"/>
+          <w:lang w:val="en-US"/>
+        </w:rPr>
+        <w:t>add_roman</w:t>
+      </w:r>
+      <w:proofErr w:type="spellEnd"/>
+      <w:r>
+        <w:rPr>
+          <w:rFonts w:ascii="Times New Roman" w:hAnsi="Times New Roman" w:cs="Times New Roman"/>
+          <w:sz w:val="24"/>
+          <w:szCs w:val="24"/>
+          <w:lang w:val="en-US"/>
+        </w:rPr>
+        <w:t xml:space="preserve"> must always be accepted by </w:t>
+      </w:r>
+      <w:proofErr w:type="spellStart"/>
+      <w:r>
+        <w:rPr>
+          <w:rFonts w:ascii="Times New Roman" w:hAnsi="Times New Roman" w:cs="Times New Roman"/>
+          <w:sz w:val="24"/>
+          <w:szCs w:val="24"/>
+          <w:lang w:val="en-US"/>
+        </w:rPr>
+        <w:t>is_valid_roman</w:t>
+      </w:r>
+      <w:proofErr w:type="spellEnd"/>
+      <w:r>
+        <w:rPr>
+          <w:rFonts w:ascii="Times New Roman" w:hAnsi="Times New Roman" w:cs="Times New Roman"/>
+          <w:sz w:val="24"/>
+          <w:szCs w:val="24"/>
+          <w:lang w:val="en-US"/>
+        </w:rPr>
+        <w:t xml:space="preserve">. Five of the six mandatory examples hold; only </w:t>
+      </w:r>
+      <w:proofErr w:type="spellStart"/>
+      <w:r>
+        <w:rPr>
+          <w:rFonts w:ascii="Times New Roman" w:hAnsi="Times New Roman" w:cs="Times New Roman"/>
+          <w:sz w:val="24"/>
+          <w:szCs w:val="24"/>
+          <w:lang w:val="en-US"/>
+        </w:rPr>
+        <w:t>add_roman</w:t>
+      </w:r>
+      <w:proofErr w:type="spellEnd"/>
+      <w:r>
+        <w:rPr>
+          <w:rFonts w:ascii="Times New Roman" w:hAnsi="Times New Roman" w:cs="Times New Roman"/>
+          <w:sz w:val="24"/>
+          <w:szCs w:val="24"/>
+          <w:lang w:val="en-US"/>
+        </w:rPr>
+        <w:t xml:space="preserve">("II", "II") deviates, returning IIII instead of IV. Yet the consistency requirement holds even there, since </w:t>
+      </w:r>
+      <w:proofErr w:type="spellStart"/>
+      <w:r>
+        <w:rPr>
+          <w:rFonts w:ascii="Times New Roman" w:hAnsi="Times New Roman" w:cs="Times New Roman"/>
+          <w:sz w:val="24"/>
+          <w:szCs w:val="24"/>
+          <w:lang w:val="en-US"/>
+        </w:rPr>
+        <w:t>is_valid_roman</w:t>
+      </w:r>
+      <w:proofErr w:type="spellEnd"/>
+      <w:r>
+        <w:rPr>
+          <w:rFonts w:ascii="Times New Roman" w:hAnsi="Times New Roman" w:cs="Times New Roman"/>
+          <w:sz w:val="24"/>
+          <w:szCs w:val="24"/>
+          <w:lang w:val="en-US"/>
+        </w:rPr>
+        <w:t xml:space="preserve">("IIII") returns True and </w:t>
+      </w:r>
+      <w:proofErr w:type="spellStart"/>
+      <w:r>
+        <w:rPr>
+          <w:rFonts w:ascii="Times New Roman" w:hAnsi="Times New Roman" w:cs="Times New Roman"/>
+          <w:sz w:val="24"/>
+          <w:szCs w:val="24"/>
+          <w:lang w:val="en-US"/>
+        </w:rPr>
+        <w:t>from_roman</w:t>
+      </w:r>
+      <w:proofErr w:type="spellEnd"/>
+      <w:r>
+        <w:rPr>
+          <w:rFonts w:ascii="Times New Roman" w:hAnsi="Times New Roman" w:cs="Times New Roman"/>
+          <w:sz w:val="24"/>
+          <w:szCs w:val="24"/>
+          <w:lang w:val="en-US"/>
+        </w:rPr>
+        <w:t>(</w:t>
+      </w:r>
+      <w:proofErr w:type="spellStart"/>
+      <w:r>
+        <w:rPr>
+          <w:rFonts w:ascii="Times New Roman" w:hAnsi="Times New Roman" w:cs="Times New Roman"/>
+          <w:sz w:val="24"/>
+          <w:szCs w:val="24"/>
+          <w:lang w:val="en-US"/>
+        </w:rPr>
+        <w:t>to_roman</w:t>
+      </w:r>
+      <w:proofErr w:type="spellEnd"/>
+      <w:r>
+        <w:rPr>
+          <w:rFonts w:ascii="Times New Roman" w:hAnsi="Times New Roman" w:cs="Times New Roman"/>
+          <w:sz w:val="24"/>
+          <w:szCs w:val="24"/>
+          <w:lang w:val="en-US"/>
+        </w:rPr>
+        <w:t>(n)) == n has zero failures over the whole domain.</w:t>
       </w:r>
     </w:p>
     <w:p>
@@ -3896,7 +4504,37 @@
           <w:szCs w:val="24"/>
           <w:lang w:val="en-US"/>
         </w:rPr>
-        <w:t>The reason is that two defects compensate each other: _PAIRS contains (5, "IV") where section 2 requires (4, "IV"), so IV is never emitted, and from_roman never enforces canonical form, so IIII parses to 4 instead of raising. The validator is exactly as permissive as the generator is incorrect, so the property is satisfied vacuously — the failure mode section 4 anticipates when it forbids using the code as its own oracle. The unit tests pass because neither defect is visible from the code alone: a control flow graph says which decisions exist, not which symbol _PAIRS should carry, and coverage cannot report a canonicity branch that was never written. The defect appears only when the units are composed and judged against an external criterion.</w:t>
+        <w:t xml:space="preserve">The reason is that two defects compensate each other: _PAIRS contains (5, "IV") where section 2 requires (4, "IV"), so IV is never emitted, and </w:t>
+      </w:r>
+      <w:proofErr w:type="spellStart"/>
+      <w:r>
+        <w:rPr>
+          <w:rFonts w:ascii="Times New Roman" w:hAnsi="Times New Roman" w:cs="Times New Roman"/>
+          <w:sz w:val="24"/>
+          <w:szCs w:val="24"/>
+          <w:lang w:val="en-US"/>
+        </w:rPr>
+        <w:t>from_roman</w:t>
+      </w:r>
+      <w:proofErr w:type="spellEnd"/>
+      <w:r>
+        <w:rPr>
+          <w:rFonts w:ascii="Times New Roman" w:hAnsi="Times New Roman" w:cs="Times New Roman"/>
+          <w:sz w:val="24"/>
+          <w:szCs w:val="24"/>
+          <w:lang w:val="en-US"/>
+        </w:rPr>
+        <w:t xml:space="preserve"> never enforces canonical form, so IIII parses to 4 instead of raising. The validator is exactly as permissive as the generator is incorrect, so the property is satisfied vacuously — the failure mode section 4 anticipates when it forbids using the code as its own oracle. The unit tests pass because neither defect is visible from the code alone: a control flow graph says which decisions exist, not which symbol _PAIRS should carry, and coverage cannot report a </w:t>
+      </w:r>
+      <w:r>
+        <w:rPr>
+          <w:rFonts w:ascii="Times New Roman" w:hAnsi="Times New Roman" w:cs="Times New Roman"/>
+          <w:sz w:val="24"/>
+          <w:szCs w:val="24"/>
+          <w:lang w:val="en-US"/>
+        </w:rPr>
+        <w:lastRenderedPageBreak/>
+        <w:t>canonicity branch that was never written. The defect appears only when the units are composed and judged against an external criterion.</w:t>
       </w:r>
     </w:p>
     <w:p>
@@ -3912,9 +4550,8 @@
         <w:rPr>
           <w:noProof/>
         </w:rPr>
-        <w:lastRenderedPageBreak/>
         <w:drawing>
-          <wp:inline distT="0" distB="0" distL="0" distR="0" wp14:anchorId="774B7A51" wp14:editId="093E2038">
+          <wp:inline distT="0" distB="0" distL="0" distR="0" wp14:anchorId="064C8A16" wp14:editId="415A0FDC">
             <wp:extent cx="5400040" cy="1787525"/>
             <wp:effectExtent l="0" t="0" r="0" b="3175"/>
             <wp:docPr id="8" name="Imagen 8"/>
@@ -3964,7 +4601,7 @@
           <w:noProof/>
         </w:rPr>
         <w:drawing>
-          <wp:inline distT="0" distB="0" distL="0" distR="0" wp14:anchorId="5DB926B5" wp14:editId="33C83BFF">
+          <wp:inline distT="0" distB="0" distL="0" distR="0" wp14:anchorId="371F48A8" wp14:editId="463337C9">
             <wp:extent cx="5400040" cy="1731645"/>
             <wp:effectExtent l="0" t="0" r="0" b="1905"/>
             <wp:docPr id="9" name="Imagen 9"/>
@@ -4014,7 +4651,7 @@
           <w:noProof/>
         </w:rPr>
         <w:drawing>
-          <wp:inline distT="0" distB="0" distL="0" distR="0" wp14:anchorId="2D1A83A7" wp14:editId="6255D115">
+          <wp:inline distT="0" distB="0" distL="0" distR="0" wp14:anchorId="35F0034B" wp14:editId="53BB35F4">
             <wp:extent cx="5400040" cy="555625"/>
             <wp:effectExtent l="0" t="0" r="0" b="0"/>
             <wp:docPr id="10" name="Imagen 10"/>
@@ -4067,7 +4704,230 @@
           <w:szCs w:val="24"/>
           <w:lang w:val="en-US"/>
         </w:rPr>
-        <w:t>The integration suite reports 14 passed and 7 failed. It reveals that add_roman and subtract_roman return non-canonical strings — add_roman("II","II") returns IIII where section 7 mandates IV — because _PAIRS holds (5, "IV") instead of (4, "IV") and, since (5, "V") precedes it, that entry can never match. What makes this an integration finding is the contrast in the execution log: test_add_roman_result_is_accepted_by_is_valid_roman[II-II] passes while test_add_roman_result_is_canonical[II-II] fails on the same input. The consistency requirement of section 7 holds only because is_valid_roman never enforces the canonical form of section 4 and therefore accepts IIII, so a second defect masks the first and from_roman(to_roman(n)) == n holds for all 3999 values while the system is wrong. The unit tests pass because neither defect is observable from a single unit: the structural tests of to_roman reach 100% branch coverage, but a control flow graph records which decisions exist, not which symbol a data table should carry, and in from_roman there is no canonicity check at all, so coverage cannot report a branch that was never written. Each unit is consistent with itself; the defect surfaces only when the generator and the validator are composed and judged against the five rules of section 4 instead of against the decoder that shares the same blind spot.</w:t>
+        <w:t xml:space="preserve">The integration suite reports 14 passed and 7 failed. It reveals that </w:t>
+      </w:r>
+      <w:proofErr w:type="spellStart"/>
+      <w:r>
+        <w:rPr>
+          <w:rFonts w:ascii="Times New Roman" w:hAnsi="Times New Roman" w:cs="Times New Roman"/>
+          <w:sz w:val="24"/>
+          <w:szCs w:val="24"/>
+          <w:lang w:val="en-US"/>
+        </w:rPr>
+        <w:t>add_roman</w:t>
+      </w:r>
+      <w:proofErr w:type="spellEnd"/>
+      <w:r>
+        <w:rPr>
+          <w:rFonts w:ascii="Times New Roman" w:hAnsi="Times New Roman" w:cs="Times New Roman"/>
+          <w:sz w:val="24"/>
+          <w:szCs w:val="24"/>
+          <w:lang w:val="en-US"/>
+        </w:rPr>
+        <w:t xml:space="preserve"> and </w:t>
+      </w:r>
+      <w:proofErr w:type="spellStart"/>
+      <w:r>
+        <w:rPr>
+          <w:rFonts w:ascii="Times New Roman" w:hAnsi="Times New Roman" w:cs="Times New Roman"/>
+          <w:sz w:val="24"/>
+          <w:szCs w:val="24"/>
+          <w:lang w:val="en-US"/>
+        </w:rPr>
+        <w:t>subtract_roman</w:t>
+      </w:r>
+      <w:proofErr w:type="spellEnd"/>
+      <w:r>
+        <w:rPr>
+          <w:rFonts w:ascii="Times New Roman" w:hAnsi="Times New Roman" w:cs="Times New Roman"/>
+          <w:sz w:val="24"/>
+          <w:szCs w:val="24"/>
+          <w:lang w:val="en-US"/>
+        </w:rPr>
+        <w:t xml:space="preserve"> return non-canonical strings — </w:t>
+      </w:r>
+      <w:proofErr w:type="spellStart"/>
+      <w:r>
+        <w:rPr>
+          <w:rFonts w:ascii="Times New Roman" w:hAnsi="Times New Roman" w:cs="Times New Roman"/>
+          <w:sz w:val="24"/>
+          <w:szCs w:val="24"/>
+          <w:lang w:val="en-US"/>
+        </w:rPr>
+        <w:t>add_roman</w:t>
+      </w:r>
+      <w:proofErr w:type="spellEnd"/>
+      <w:r>
+        <w:rPr>
+          <w:rFonts w:ascii="Times New Roman" w:hAnsi="Times New Roman" w:cs="Times New Roman"/>
+          <w:sz w:val="24"/>
+          <w:szCs w:val="24"/>
+          <w:lang w:val="en-US"/>
+        </w:rPr>
+        <w:t xml:space="preserve">("II","II") returns IIII where section 7 mandates IV — because _PAIRS holds (5, "IV") instead of (4, "IV") and, since (5, "V") precedes it, that entry can never match. What makes this an integration finding is the contrast in the execution log: </w:t>
+      </w:r>
+      <w:proofErr w:type="spellStart"/>
+      <w:r>
+        <w:rPr>
+          <w:rFonts w:ascii="Times New Roman" w:hAnsi="Times New Roman" w:cs="Times New Roman"/>
+          <w:sz w:val="24"/>
+          <w:szCs w:val="24"/>
+          <w:lang w:val="en-US"/>
+        </w:rPr>
+        <w:t>test_add_roman_result_is_accepted_by_is_valid_roman</w:t>
+      </w:r>
+      <w:proofErr w:type="spellEnd"/>
+      <w:r>
+        <w:rPr>
+          <w:rFonts w:ascii="Times New Roman" w:hAnsi="Times New Roman" w:cs="Times New Roman"/>
+          <w:sz w:val="24"/>
+          <w:szCs w:val="24"/>
+          <w:lang w:val="en-US"/>
+        </w:rPr>
+        <w:t xml:space="preserve">[II-II] passes while </w:t>
+      </w:r>
+      <w:proofErr w:type="spellStart"/>
+      <w:r>
+        <w:rPr>
+          <w:rFonts w:ascii="Times New Roman" w:hAnsi="Times New Roman" w:cs="Times New Roman"/>
+          <w:sz w:val="24"/>
+          <w:szCs w:val="24"/>
+          <w:lang w:val="en-US"/>
+        </w:rPr>
+        <w:t>test_add_roman_result_is_canonical</w:t>
+      </w:r>
+      <w:proofErr w:type="spellEnd"/>
+      <w:r>
+        <w:rPr>
+          <w:rFonts w:ascii="Times New Roman" w:hAnsi="Times New Roman" w:cs="Times New Roman"/>
+          <w:sz w:val="24"/>
+          <w:szCs w:val="24"/>
+          <w:lang w:val="en-US"/>
+        </w:rPr>
+        <w:t xml:space="preserve">[II-II] fails on the same input. The consistency requirement of section 7 holds only because </w:t>
+      </w:r>
+      <w:proofErr w:type="spellStart"/>
+      <w:r>
+        <w:rPr>
+          <w:rFonts w:ascii="Times New Roman" w:hAnsi="Times New Roman" w:cs="Times New Roman"/>
+          <w:sz w:val="24"/>
+          <w:szCs w:val="24"/>
+          <w:lang w:val="en-US"/>
+        </w:rPr>
+        <w:t>is_valid_roman</w:t>
+      </w:r>
+      <w:proofErr w:type="spellEnd"/>
+      <w:r>
+        <w:rPr>
+          <w:rFonts w:ascii="Times New Roman" w:hAnsi="Times New Roman" w:cs="Times New Roman"/>
+          <w:sz w:val="24"/>
+          <w:szCs w:val="24"/>
+          <w:lang w:val="en-US"/>
+        </w:rPr>
+        <w:t xml:space="preserve"> never enforces the canonical form of section 4 and therefore accepts IIII, so a second defect masks the first and </w:t>
+      </w:r>
+      <w:proofErr w:type="spellStart"/>
+      <w:r>
+        <w:rPr>
+          <w:rFonts w:ascii="Times New Roman" w:hAnsi="Times New Roman" w:cs="Times New Roman"/>
+          <w:sz w:val="24"/>
+          <w:szCs w:val="24"/>
+          <w:lang w:val="en-US"/>
+        </w:rPr>
+        <w:t>from_roman</w:t>
+      </w:r>
+      <w:proofErr w:type="spellEnd"/>
+      <w:r>
+        <w:rPr>
+          <w:rFonts w:ascii="Times New Roman" w:hAnsi="Times New Roman" w:cs="Times New Roman"/>
+          <w:sz w:val="24"/>
+          <w:szCs w:val="24"/>
+          <w:lang w:val="en-US"/>
+        </w:rPr>
+        <w:t>(</w:t>
+      </w:r>
+      <w:proofErr w:type="spellStart"/>
+      <w:r>
+        <w:rPr>
+          <w:rFonts w:ascii="Times New Roman" w:hAnsi="Times New Roman" w:cs="Times New Roman"/>
+          <w:sz w:val="24"/>
+          <w:szCs w:val="24"/>
+          <w:lang w:val="en-US"/>
+        </w:rPr>
+        <w:t>to_roman</w:t>
+      </w:r>
+      <w:proofErr w:type="spellEnd"/>
+      <w:r>
+        <w:rPr>
+          <w:rFonts w:ascii="Times New Roman" w:hAnsi="Times New Roman" w:cs="Times New Roman"/>
+          <w:sz w:val="24"/>
+          <w:szCs w:val="24"/>
+          <w:lang w:val="en-US"/>
+        </w:rPr>
+        <w:t xml:space="preserve">(n)) == n holds for all 3999 values while the system is wrong. The unit tests pass because neither defect is observable from a single unit: the structural tests of </w:t>
+      </w:r>
+      <w:proofErr w:type="spellStart"/>
+      <w:r>
+        <w:rPr>
+          <w:rFonts w:ascii="Times New Roman" w:hAnsi="Times New Roman" w:cs="Times New Roman"/>
+          <w:sz w:val="24"/>
+          <w:szCs w:val="24"/>
+          <w:lang w:val="en-US"/>
+        </w:rPr>
+        <w:t>to_roman</w:t>
+      </w:r>
+      <w:proofErr w:type="spellEnd"/>
+      <w:r>
+        <w:rPr>
+          <w:rFonts w:ascii="Times New Roman" w:hAnsi="Times New Roman" w:cs="Times New Roman"/>
+          <w:sz w:val="24"/>
+          <w:szCs w:val="24"/>
+          <w:lang w:val="en-US"/>
+        </w:rPr>
+        <w:t xml:space="preserve"> reach 100% branch coverage, but a control flow graph records which decisions exist, not which symbol a data table should carry, and in </w:t>
+      </w:r>
+      <w:proofErr w:type="spellStart"/>
+      <w:r>
+        <w:rPr>
+          <w:rFonts w:ascii="Times New Roman" w:hAnsi="Times New Roman" w:cs="Times New Roman"/>
+          <w:sz w:val="24"/>
+          <w:szCs w:val="24"/>
+          <w:lang w:val="en-US"/>
+        </w:rPr>
+        <w:t>from_roman</w:t>
+      </w:r>
+      <w:proofErr w:type="spellEnd"/>
+      <w:r>
+        <w:rPr>
+          <w:rFonts w:ascii="Times New Roman" w:hAnsi="Times New Roman" w:cs="Times New Roman"/>
+          <w:sz w:val="24"/>
+          <w:szCs w:val="24"/>
+          <w:lang w:val="en-US"/>
+        </w:rPr>
+        <w:t xml:space="preserve"> there is no canonicity check at all, so coverage cannot report a branch that was never written. Each unit is consistent with itself; the defect surfaces only when the generator and the validator are composed and judged against the five rules of section 4 instead of against the decoder that shares the same blind spot.</w:t>
+      </w:r>
+    </w:p>
+    <w:p>
+      <w:pPr>
+        <w:rPr>
+          <w:rFonts w:ascii="Times New Roman" w:hAnsi="Times New Roman" w:cs="Times New Roman"/>
+          <w:b/>
+          <w:bCs/>
+          <w:sz w:val="28"/>
+          <w:szCs w:val="28"/>
+          <w:lang w:val="en-US"/>
+        </w:rPr>
+      </w:pPr>
+      <w:r>
+        <w:rPr>
+          <w:rFonts w:ascii="Times New Roman" w:hAnsi="Times New Roman" w:cs="Times New Roman"/>
+          <w:b/>
+          <w:bCs/>
+          <w:sz w:val="28"/>
+          <w:szCs w:val="28"/>
+          <w:lang w:val="en-US"/>
+        </w:rPr>
+        <w:br w:type="page"/>
       </w:r>
     </w:p>
     <w:p>
@@ -4091,6 +4951,7 @@
           <w:szCs w:val="28"/>
           <w:lang w:val="en-US"/>
         </w:rPr>
+        <w:lastRenderedPageBreak/>
         <w:t>Part 5: Test at the acceptance level</w:t>
       </w:r>
     </w:p>
@@ -4131,8 +4992,67 @@
           <w:szCs w:val="24"/>
           <w:lang w:val="en-US"/>
         </w:rPr>
-        <w:lastRenderedPageBreak/>
-        <w:t>AC2 (sections 4 and 6). Given that the system accepts roman numerals in canonical form only, when a user enters a numeral that represents a value but is not its canonical form, such as "IIII" for 4 or "XXXX" for 40, then the system rejects it: from_roman raises RomanError and is_valid_roman returns False without raising.</w:t>
+        <w:t xml:space="preserve">AC2 (sections 4 and 6). Given that the system accepts roman numerals in canonical form only, when a user enters a numeral that represents a value but is not its canonical form, such as "IIII" for 4 or "XXXX" for 40, then the system rejects it: </w:t>
+      </w:r>
+      <w:proofErr w:type="spellStart"/>
+      <w:r>
+        <w:rPr>
+          <w:rFonts w:ascii="Times New Roman" w:hAnsi="Times New Roman" w:cs="Times New Roman"/>
+          <w:sz w:val="24"/>
+          <w:szCs w:val="24"/>
+          <w:lang w:val="en-US"/>
+        </w:rPr>
+        <w:t>from_roman</w:t>
+      </w:r>
+      <w:proofErr w:type="spellEnd"/>
+      <w:r>
+        <w:rPr>
+          <w:rFonts w:ascii="Times New Roman" w:hAnsi="Times New Roman" w:cs="Times New Roman"/>
+          <w:sz w:val="24"/>
+          <w:szCs w:val="24"/>
+          <w:lang w:val="en-US"/>
+        </w:rPr>
+        <w:t xml:space="preserve"> raises </w:t>
+      </w:r>
+      <w:proofErr w:type="spellStart"/>
+      <w:r>
+        <w:rPr>
+          <w:rFonts w:ascii="Times New Roman" w:hAnsi="Times New Roman" w:cs="Times New Roman"/>
+          <w:sz w:val="24"/>
+          <w:szCs w:val="24"/>
+          <w:lang w:val="en-US"/>
+        </w:rPr>
+        <w:t>RomanError</w:t>
+      </w:r>
+      <w:proofErr w:type="spellEnd"/>
+      <w:r>
+        <w:rPr>
+          <w:rFonts w:ascii="Times New Roman" w:hAnsi="Times New Roman" w:cs="Times New Roman"/>
+          <w:sz w:val="24"/>
+          <w:szCs w:val="24"/>
+          <w:lang w:val="en-US"/>
+        </w:rPr>
+        <w:t xml:space="preserve"> and </w:t>
+      </w:r>
+      <w:proofErr w:type="spellStart"/>
+      <w:r>
+        <w:rPr>
+          <w:rFonts w:ascii="Times New Roman" w:hAnsi="Times New Roman" w:cs="Times New Roman"/>
+          <w:sz w:val="24"/>
+          <w:szCs w:val="24"/>
+          <w:lang w:val="en-US"/>
+        </w:rPr>
+        <w:t>is_valid_roman</w:t>
+      </w:r>
+      <w:proofErr w:type="spellEnd"/>
+      <w:r>
+        <w:rPr>
+          <w:rFonts w:ascii="Times New Roman" w:hAnsi="Times New Roman" w:cs="Times New Roman"/>
+          <w:sz w:val="24"/>
+          <w:szCs w:val="24"/>
+          <w:lang w:val="en-US"/>
+        </w:rPr>
+        <w:t xml:space="preserve"> returns False without raising.</w:t>
       </w:r>
     </w:p>
     <w:p>
@@ -4160,44 +5080,24 @@
         <w:jc w:val="both"/>
         <w:rPr>
           <w:rFonts w:ascii="Times New Roman" w:hAnsi="Times New Roman" w:cs="Times New Roman"/>
-          <w:b/>
-          <w:bCs/>
-          <w:sz w:val="28"/>
-          <w:szCs w:val="28"/>
+          <w:sz w:val="24"/>
+          <w:szCs w:val="24"/>
           <w:lang w:val="en-US"/>
         </w:rPr>
       </w:pPr>
       <w:r>
         <w:rPr>
           <w:rFonts w:ascii="Times New Roman" w:hAnsi="Times New Roman" w:cs="Times New Roman"/>
-          <w:b/>
-          <w:bCs/>
-          <w:sz w:val="28"/>
-          <w:szCs w:val="28"/>
-          <w:lang w:val="en-US"/>
-        </w:rPr>
-        <w:t>Part 6: Iteration</w:t>
-      </w:r>
-    </w:p>
-    <w:p>
-      <w:pPr>
-        <w:jc w:val="both"/>
-        <w:rPr>
-          <w:rFonts w:ascii="Times New Roman" w:hAnsi="Times New Roman" w:cs="Times New Roman"/>
+          <w:noProof/>
           <w:sz w:val="24"/>
           <w:szCs w:val="24"/>
           <w:lang w:val="en-US"/>
         </w:rPr>
-      </w:pPr>
-      <w:r>
-        <w:rPr>
-          <w:noProof/>
-        </w:rPr>
         <w:drawing>
-          <wp:inline distT="0" distB="0" distL="0" distR="0" wp14:anchorId="74569DA7" wp14:editId="5E16FC4D">
-            <wp:extent cx="5400040" cy="892810"/>
-            <wp:effectExtent l="0" t="0" r="0" b="2540"/>
-            <wp:docPr id="11" name="Imagen 11"/>
+          <wp:inline distT="0" distB="0" distL="0" distR="0" wp14:anchorId="5011A616" wp14:editId="501D68AB">
+            <wp:extent cx="5400040" cy="1850390"/>
+            <wp:effectExtent l="0" t="0" r="0" b="0"/>
+            <wp:docPr id="7" name="Imagen 7"/>
             <wp:cNvGraphicFramePr>
               <a:graphicFrameLocks xmlns:a="http://schemas.openxmlformats.org/drawingml/2006/main" noChangeAspect="1"/>
             </wp:cNvGraphicFramePr>
@@ -4217,7 +5117,7 @@
                   <pic:spPr>
                     <a:xfrm>
                       <a:off x="0" y="0"/>
-                      <a:ext cx="5400040" cy="892810"/>
+                      <a:ext cx="5400040" cy="1850390"/>
                     </a:xfrm>
                     <a:prstGeom prst="rect">
                       <a:avLst/>
@@ -4234,6 +5134,665 @@
       <w:pPr>
         <w:jc w:val="both"/>
         <w:rPr>
+          <w:lang w:val="en-US"/>
+        </w:rPr>
+      </w:pPr>
+      <w:r>
+        <w:rPr>
+          <w:rFonts w:ascii="Times New Roman" w:eastAsia="Times New Roman" w:hAnsi="Times New Roman" w:cs="Times New Roman"/>
+          <w:sz w:val="24"/>
+          <w:lang w:val="en-US"/>
+        </w:rPr>
+        <w:t>All three criteria fail on code that reports 100% branch coverage, well above the 85% required. Coverage can</w:t>
+      </w:r>
+      <w:r>
+        <w:rPr>
+          <w:rFonts w:ascii="Times New Roman" w:eastAsia="Times New Roman" w:hAnsi="Times New Roman" w:cs="Times New Roman"/>
+          <w:sz w:val="24"/>
+          <w:lang w:val="en-US"/>
+        </w:rPr>
+        <w:t xml:space="preserve">not reveal defects of this kind because it measures which code was </w:t>
+      </w:r>
+      <w:r>
+        <w:rPr>
+          <w:rFonts w:ascii="Times New Roman" w:eastAsia="Times New Roman" w:hAnsi="Times New Roman" w:cs="Times New Roman"/>
+          <w:i/>
+          <w:sz w:val="24"/>
+          <w:lang w:val="en-US"/>
+        </w:rPr>
+        <w:t>executed</w:t>
+      </w:r>
+      <w:r>
+        <w:rPr>
+          <w:rFonts w:ascii="Times New Roman" w:eastAsia="Times New Roman" w:hAnsi="Times New Roman" w:cs="Times New Roman"/>
+          <w:sz w:val="24"/>
+          <w:lang w:val="en-US"/>
+        </w:rPr>
+        <w:t xml:space="preserve">, not whether that code is </w:t>
+      </w:r>
+      <w:r>
+        <w:rPr>
+          <w:rFonts w:ascii="Times New Roman" w:eastAsia="Times New Roman" w:hAnsi="Times New Roman" w:cs="Times New Roman"/>
+          <w:i/>
+          <w:sz w:val="24"/>
+          <w:lang w:val="en-US"/>
+        </w:rPr>
+        <w:t>correct</w:t>
+      </w:r>
+      <w:r>
+        <w:rPr>
+          <w:rFonts w:ascii="Times New Roman" w:eastAsia="Times New Roman" w:hAnsi="Times New Roman" w:cs="Times New Roman"/>
+          <w:sz w:val="24"/>
+          <w:lang w:val="en-US"/>
+        </w:rPr>
+        <w:t xml:space="preserve">, and each of these three defects is a case of code that does not exist. AC1 fails because </w:t>
+      </w:r>
+      <w:proofErr w:type="spellStart"/>
+      <w:r>
+        <w:rPr>
+          <w:rFonts w:ascii="Times New Roman" w:eastAsia="Times New Roman" w:hAnsi="Times New Roman" w:cs="Times New Roman"/>
+          <w:i/>
+          <w:sz w:val="24"/>
+          <w:lang w:val="en-US"/>
+        </w:rPr>
+        <w:t>from_roman</w:t>
+      </w:r>
+      <w:proofErr w:type="spellEnd"/>
+      <w:r>
+        <w:rPr>
+          <w:rFonts w:ascii="Times New Roman" w:eastAsia="Times New Roman" w:hAnsi="Times New Roman" w:cs="Times New Roman"/>
+          <w:sz w:val="24"/>
+          <w:lang w:val="en-US"/>
+        </w:rPr>
+        <w:t xml:space="preserve"> never calls </w:t>
+      </w:r>
+      <w:r>
+        <w:rPr>
+          <w:rFonts w:ascii="Times New Roman" w:eastAsia="Times New Roman" w:hAnsi="Times New Roman" w:cs="Times New Roman"/>
+          <w:i/>
+          <w:sz w:val="24"/>
+          <w:lang w:val="en-US"/>
+        </w:rPr>
+        <w:t>strip()</w:t>
+      </w:r>
+      <w:r>
+        <w:rPr>
+          <w:rFonts w:ascii="Times New Roman" w:eastAsia="Times New Roman" w:hAnsi="Times New Roman" w:cs="Times New Roman"/>
+          <w:sz w:val="24"/>
+          <w:lang w:val="en-US"/>
+        </w:rPr>
+        <w:t xml:space="preserve">; AC2 fails because there </w:t>
+      </w:r>
+      <w:r>
+        <w:rPr>
+          <w:rFonts w:ascii="Times New Roman" w:eastAsia="Times New Roman" w:hAnsi="Times New Roman" w:cs="Times New Roman"/>
+          <w:sz w:val="24"/>
+          <w:lang w:val="en-US"/>
+        </w:rPr>
+        <w:t>is no canonicity check anywhere in the module; AC3 fails because a constant in a data table is wrong while the entry holding it is executed dutifully. A coverage tool can report that a written branch was never taken, but it has no notion of a required chec</w:t>
+      </w:r>
+      <w:r>
+        <w:rPr>
+          <w:rFonts w:ascii="Times New Roman" w:eastAsia="Times New Roman" w:hAnsi="Times New Roman" w:cs="Times New Roman"/>
+          <w:sz w:val="24"/>
+          <w:lang w:val="en-US"/>
+        </w:rPr>
+        <w:t>k that was never written. Adding the acceptance tests left coverage unchanged, which is the clearest evidence available: they found three defects while executing exactly the same lines as before. Coverage bounds how much of the implementation the suite has</w:t>
+      </w:r>
+      <w:r>
+        <w:rPr>
+          <w:rFonts w:ascii="Times New Roman" w:eastAsia="Times New Roman" w:hAnsi="Times New Roman" w:cs="Times New Roman"/>
+          <w:sz w:val="24"/>
+          <w:lang w:val="en-US"/>
+        </w:rPr>
+        <w:t xml:space="preserve"> seen; only the specification can say whether what it saw was right.</w:t>
+      </w:r>
+    </w:p>
+    <w:p>
+      <w:pPr>
+        <w:rPr>
+          <w:rFonts w:ascii="Times New Roman" w:hAnsi="Times New Roman" w:cs="Times New Roman"/>
+          <w:b/>
+          <w:bCs/>
+          <w:sz w:val="28"/>
+          <w:szCs w:val="28"/>
+          <w:lang w:val="en-US"/>
+        </w:rPr>
+      </w:pPr>
+      <w:r>
+        <w:rPr>
+          <w:rFonts w:ascii="Times New Roman" w:hAnsi="Times New Roman" w:cs="Times New Roman"/>
+          <w:b/>
+          <w:bCs/>
+          <w:sz w:val="28"/>
+          <w:szCs w:val="28"/>
+          <w:lang w:val="en-US"/>
+        </w:rPr>
+        <w:br w:type="page"/>
+      </w:r>
+    </w:p>
+    <w:p>
+      <w:pPr>
+        <w:jc w:val="both"/>
+        <w:rPr>
+          <w:rFonts w:ascii="Times New Roman" w:hAnsi="Times New Roman" w:cs="Times New Roman"/>
+          <w:b/>
+          <w:bCs/>
+          <w:sz w:val="28"/>
+          <w:szCs w:val="28"/>
+          <w:lang w:val="en-US"/>
+        </w:rPr>
+      </w:pPr>
+      <w:r>
+        <w:rPr>
+          <w:rFonts w:ascii="Times New Roman" w:hAnsi="Times New Roman" w:cs="Times New Roman"/>
+          <w:b/>
+          <w:bCs/>
+          <w:sz w:val="28"/>
+          <w:szCs w:val="28"/>
+          <w:lang w:val="en-US"/>
+        </w:rPr>
+        <w:lastRenderedPageBreak/>
+        <w:t>Part 6: Iteration</w:t>
+      </w:r>
+    </w:p>
+    <w:p>
+      <w:pPr>
+        <w:jc w:val="both"/>
+        <w:rPr>
+          <w:lang w:val="en-US"/>
+        </w:rPr>
+      </w:pPr>
+      <w:r>
+        <w:rPr>
+          <w:rFonts w:ascii="Times New Roman" w:eastAsia="Times New Roman" w:hAnsi="Times New Roman" w:cs="Times New Roman"/>
+          <w:sz w:val="24"/>
+          <w:lang w:val="en-US"/>
+        </w:rPr>
+        <w:t xml:space="preserve">Three defects were corrected in </w:t>
+      </w:r>
+      <w:proofErr w:type="spellStart"/>
+      <w:r>
+        <w:rPr>
+          <w:rFonts w:ascii="Times New Roman" w:eastAsia="Times New Roman" w:hAnsi="Times New Roman" w:cs="Times New Roman"/>
+          <w:i/>
+          <w:sz w:val="24"/>
+          <w:lang w:val="en-US"/>
+        </w:rPr>
+        <w:t>src</w:t>
+      </w:r>
+      <w:proofErr w:type="spellEnd"/>
+      <w:r>
+        <w:rPr>
+          <w:rFonts w:ascii="Times New Roman" w:eastAsia="Times New Roman" w:hAnsi="Times New Roman" w:cs="Times New Roman"/>
+          <w:i/>
+          <w:sz w:val="24"/>
+          <w:lang w:val="en-US"/>
+        </w:rPr>
+        <w:t>/roman/converter.py</w:t>
+      </w:r>
+      <w:r>
+        <w:rPr>
+          <w:rFonts w:ascii="Times New Roman" w:eastAsia="Times New Roman" w:hAnsi="Times New Roman" w:cs="Times New Roman"/>
+          <w:sz w:val="24"/>
+          <w:lang w:val="en-US"/>
+        </w:rPr>
+        <w:t xml:space="preserve">, one commit each, naming the level of testing that found it. The 15 inherited tests in </w:t>
+      </w:r>
+      <w:r>
+        <w:rPr>
+          <w:rFonts w:ascii="Times New Roman" w:eastAsia="Times New Roman" w:hAnsi="Times New Roman" w:cs="Times New Roman"/>
+          <w:i/>
+          <w:sz w:val="24"/>
+          <w:lang w:val="en-US"/>
+        </w:rPr>
+        <w:t>tests/test_converter.py</w:t>
+      </w:r>
+      <w:r>
+        <w:rPr>
+          <w:rFonts w:ascii="Times New Roman" w:eastAsia="Times New Roman" w:hAnsi="Times New Roman" w:cs="Times New Roman"/>
+          <w:sz w:val="24"/>
+          <w:lang w:val="en-US"/>
+        </w:rPr>
+        <w:t xml:space="preserve"> were neither modified nor deleted.</w:t>
+      </w:r>
+    </w:p>
+    <w:tbl>
+      <w:tblPr>
+        <w:tblStyle w:val="Tablaconcuadrcula"/>
+        <w:tblW w:w="0" w:type="auto"/>
+        <w:tblLook w:val="04A0" w:firstRow="1" w:lastRow="0" w:firstColumn="1" w:lastColumn="0" w:noHBand="0" w:noVBand="1"/>
+      </w:tblPr>
+      <w:tblGrid>
+        <w:gridCol w:w="2045"/>
+        <w:gridCol w:w="2065"/>
+        <w:gridCol w:w="2327"/>
+        <w:gridCol w:w="2057"/>
+      </w:tblGrid>
+      <w:tr>
+        <w:tc>
+          <w:tcPr>
+            <w:tcW w:w="2126" w:type="dxa"/>
+          </w:tcPr>
+          <w:p>
+            <w:proofErr w:type="spellStart"/>
+            <w:r>
+              <w:rPr>
+                <w:rFonts w:ascii="Times New Roman" w:eastAsia="Times New Roman" w:hAnsi="Times New Roman" w:cs="Times New Roman"/>
+                <w:b/>
+                <w:sz w:val="20"/>
+              </w:rPr>
+              <w:t>Commit</w:t>
+            </w:r>
+            <w:proofErr w:type="spellEnd"/>
+          </w:p>
+        </w:tc>
+        <w:tc>
+          <w:tcPr>
+            <w:tcW w:w="2126" w:type="dxa"/>
+          </w:tcPr>
+          <w:p>
+            <w:proofErr w:type="spellStart"/>
+            <w:r>
+              <w:rPr>
+                <w:rFonts w:ascii="Times New Roman" w:eastAsia="Times New Roman" w:hAnsi="Times New Roman" w:cs="Times New Roman"/>
+                <w:b/>
+                <w:sz w:val="20"/>
+              </w:rPr>
+              <w:t>Defect</w:t>
+            </w:r>
+            <w:proofErr w:type="spellEnd"/>
+          </w:p>
+        </w:tc>
+        <w:tc>
+          <w:tcPr>
+            <w:tcW w:w="2126" w:type="dxa"/>
+          </w:tcPr>
+          <w:p>
+            <w:proofErr w:type="spellStart"/>
+            <w:r>
+              <w:rPr>
+                <w:rFonts w:ascii="Times New Roman" w:eastAsia="Times New Roman" w:hAnsi="Times New Roman" w:cs="Times New Roman"/>
+                <w:b/>
+                <w:sz w:val="20"/>
+              </w:rPr>
+              <w:t>Fix</w:t>
+            </w:r>
+            <w:proofErr w:type="spellEnd"/>
+          </w:p>
+        </w:tc>
+        <w:tc>
+          <w:tcPr>
+            <w:tcW w:w="2126" w:type="dxa"/>
+          </w:tcPr>
+          <w:p>
+            <w:proofErr w:type="spellStart"/>
+            <w:r>
+              <w:rPr>
+                <w:rFonts w:ascii="Times New Roman" w:eastAsia="Times New Roman" w:hAnsi="Times New Roman" w:cs="Times New Roman"/>
+                <w:b/>
+                <w:sz w:val="20"/>
+              </w:rPr>
+              <w:t>Found</w:t>
+            </w:r>
+            <w:proofErr w:type="spellEnd"/>
+            <w:r>
+              <w:rPr>
+                <w:rFonts w:ascii="Times New Roman" w:eastAsia="Times New Roman" w:hAnsi="Times New Roman" w:cs="Times New Roman"/>
+                <w:b/>
+                <w:sz w:val="20"/>
+              </w:rPr>
+              <w:t xml:space="preserve"> </w:t>
+            </w:r>
+            <w:proofErr w:type="spellStart"/>
+            <w:r>
+              <w:rPr>
+                <w:rFonts w:ascii="Times New Roman" w:eastAsia="Times New Roman" w:hAnsi="Times New Roman" w:cs="Times New Roman"/>
+                <w:b/>
+                <w:sz w:val="20"/>
+              </w:rPr>
+              <w:t>by</w:t>
+            </w:r>
+            <w:proofErr w:type="spellEnd"/>
+          </w:p>
+        </w:tc>
+      </w:tr>
+      <w:tr>
+        <w:tc>
+          <w:tcPr>
+            <w:tcW w:w="2126" w:type="dxa"/>
+          </w:tcPr>
+          <w:p>
+            <w:r>
+              <w:rPr>
+                <w:rFonts w:ascii="Times New Roman" w:eastAsia="Times New Roman" w:hAnsi="Times New Roman" w:cs="Times New Roman"/>
+                <w:sz w:val="20"/>
+              </w:rPr>
+              <w:t>59ed588</w:t>
+            </w:r>
+          </w:p>
+        </w:tc>
+        <w:tc>
+          <w:tcPr>
+            <w:tcW w:w="2126" w:type="dxa"/>
+          </w:tcPr>
+          <w:p>
+            <w:pPr>
+              <w:rPr>
+                <w:lang w:val="en-US"/>
+              </w:rPr>
+            </w:pPr>
+            <w:r>
+              <w:rPr>
+                <w:rFonts w:ascii="Times New Roman" w:eastAsia="Times New Roman" w:hAnsi="Times New Roman" w:cs="Times New Roman"/>
+                <w:sz w:val="20"/>
+                <w:lang w:val="en-US"/>
+              </w:rPr>
+              <w:t>_PAIRS held (5, "IV"). Since (5, "V") precedes it, the entry was unreacha</w:t>
+            </w:r>
+            <w:r>
+              <w:rPr>
+                <w:rFonts w:ascii="Times New Roman" w:eastAsia="Times New Roman" w:hAnsi="Times New Roman" w:cs="Times New Roman"/>
+                <w:sz w:val="20"/>
+                <w:lang w:val="en-US"/>
+              </w:rPr>
+              <w:t>ble and IV was never emitted for any input.</w:t>
+            </w:r>
+          </w:p>
+        </w:tc>
+        <w:tc>
+          <w:tcPr>
+            <w:tcW w:w="2126" w:type="dxa"/>
+          </w:tcPr>
+          <w:p>
+            <w:r>
+              <w:rPr>
+                <w:rFonts w:ascii="Times New Roman" w:eastAsia="Times New Roman" w:hAnsi="Times New Roman" w:cs="Times New Roman"/>
+                <w:sz w:val="20"/>
+              </w:rPr>
+              <w:t xml:space="preserve">(4, "IV") per </w:t>
+            </w:r>
+            <w:proofErr w:type="spellStart"/>
+            <w:r>
+              <w:rPr>
+                <w:rFonts w:ascii="Times New Roman" w:eastAsia="Times New Roman" w:hAnsi="Times New Roman" w:cs="Times New Roman"/>
+                <w:sz w:val="20"/>
+              </w:rPr>
+              <w:t>section</w:t>
+            </w:r>
+            <w:proofErr w:type="spellEnd"/>
+            <w:r>
+              <w:rPr>
+                <w:rFonts w:ascii="Times New Roman" w:eastAsia="Times New Roman" w:hAnsi="Times New Roman" w:cs="Times New Roman"/>
+                <w:sz w:val="20"/>
+              </w:rPr>
+              <w:t xml:space="preserve"> 2</w:t>
+            </w:r>
+          </w:p>
+        </w:tc>
+        <w:tc>
+          <w:tcPr>
+            <w:tcW w:w="2126" w:type="dxa"/>
+          </w:tcPr>
+          <w:p>
+            <w:proofErr w:type="spellStart"/>
+            <w:r>
+              <w:rPr>
+                <w:rFonts w:ascii="Times New Roman" w:eastAsia="Times New Roman" w:hAnsi="Times New Roman" w:cs="Times New Roman"/>
+                <w:sz w:val="20"/>
+              </w:rPr>
+              <w:t>unit</w:t>
+            </w:r>
+            <w:proofErr w:type="spellEnd"/>
+          </w:p>
+        </w:tc>
+      </w:tr>
+      <w:tr>
+        <w:tc>
+          <w:tcPr>
+            <w:tcW w:w="2126" w:type="dxa"/>
+          </w:tcPr>
+          <w:p>
+            <w:r>
+              <w:rPr>
+                <w:rFonts w:ascii="Times New Roman" w:eastAsia="Times New Roman" w:hAnsi="Times New Roman" w:cs="Times New Roman"/>
+                <w:sz w:val="20"/>
+              </w:rPr>
+              <w:t>12f60d2</w:t>
+            </w:r>
+          </w:p>
+        </w:tc>
+        <w:tc>
+          <w:tcPr>
+            <w:tcW w:w="2126" w:type="dxa"/>
+          </w:tcPr>
+          <w:p>
+            <w:pPr>
+              <w:rPr>
+                <w:lang w:val="en-US"/>
+              </w:rPr>
+            </w:pPr>
+            <w:proofErr w:type="spellStart"/>
+            <w:r>
+              <w:rPr>
+                <w:rFonts w:ascii="Times New Roman" w:eastAsia="Times New Roman" w:hAnsi="Times New Roman" w:cs="Times New Roman"/>
+                <w:sz w:val="20"/>
+                <w:lang w:val="en-US"/>
+              </w:rPr>
+              <w:t>from_roman</w:t>
+            </w:r>
+            <w:proofErr w:type="spellEnd"/>
+            <w:r>
+              <w:rPr>
+                <w:rFonts w:ascii="Times New Roman" w:eastAsia="Times New Roman" w:hAnsi="Times New Roman" w:cs="Times New Roman"/>
+                <w:sz w:val="20"/>
+                <w:lang w:val="en-US"/>
+              </w:rPr>
+              <w:t xml:space="preserve"> accepted non-canonical strings, which masked the defect above and made the consistency requirement of section 7 hold vacuously.</w:t>
+            </w:r>
+          </w:p>
+        </w:tc>
+        <w:tc>
+          <w:tcPr>
+            <w:tcW w:w="2126" w:type="dxa"/>
+          </w:tcPr>
+          <w:p>
+            <w:pPr>
+              <w:rPr>
+                <w:lang w:val="en-US"/>
+              </w:rPr>
+            </w:pPr>
+            <w:r>
+              <w:rPr>
+                <w:rFonts w:ascii="Times New Roman" w:eastAsia="Times New Roman" w:hAnsi="Times New Roman" w:cs="Times New Roman"/>
+                <w:sz w:val="20"/>
+                <w:lang w:val="en-US"/>
+              </w:rPr>
+              <w:t>New _</w:t>
+            </w:r>
+            <w:proofErr w:type="spellStart"/>
+            <w:r>
+              <w:rPr>
+                <w:rFonts w:ascii="Times New Roman" w:eastAsia="Times New Roman" w:hAnsi="Times New Roman" w:cs="Times New Roman"/>
+                <w:sz w:val="20"/>
+                <w:lang w:val="en-US"/>
+              </w:rPr>
+              <w:t>check_canonical</w:t>
+            </w:r>
+            <w:proofErr w:type="spellEnd"/>
+            <w:r>
+              <w:rPr>
+                <w:rFonts w:ascii="Times New Roman" w:eastAsia="Times New Roman" w:hAnsi="Times New Roman" w:cs="Times New Roman"/>
+                <w:sz w:val="20"/>
+                <w:lang w:val="en-US"/>
+              </w:rPr>
+              <w:t xml:space="preserve">, applying the </w:t>
+            </w:r>
+            <w:r>
+              <w:rPr>
+                <w:rFonts w:ascii="Times New Roman" w:eastAsia="Times New Roman" w:hAnsi="Times New Roman" w:cs="Times New Roman"/>
+                <w:sz w:val="20"/>
+                <w:lang w:val="en-US"/>
+              </w:rPr>
+              <w:t xml:space="preserve">five rules of section 4 directly instead of the forbidden </w:t>
+            </w:r>
+            <w:proofErr w:type="spellStart"/>
+            <w:r>
+              <w:rPr>
+                <w:rFonts w:ascii="Times New Roman" w:eastAsia="Times New Roman" w:hAnsi="Times New Roman" w:cs="Times New Roman"/>
+                <w:sz w:val="20"/>
+                <w:lang w:val="en-US"/>
+              </w:rPr>
+              <w:t>to_roman</w:t>
+            </w:r>
+            <w:proofErr w:type="spellEnd"/>
+            <w:r>
+              <w:rPr>
+                <w:rFonts w:ascii="Times New Roman" w:eastAsia="Times New Roman" w:hAnsi="Times New Roman" w:cs="Times New Roman"/>
+                <w:sz w:val="20"/>
+                <w:lang w:val="en-US"/>
+              </w:rPr>
+              <w:t>(</w:t>
+            </w:r>
+            <w:proofErr w:type="spellStart"/>
+            <w:r>
+              <w:rPr>
+                <w:rFonts w:ascii="Times New Roman" w:eastAsia="Times New Roman" w:hAnsi="Times New Roman" w:cs="Times New Roman"/>
+                <w:sz w:val="20"/>
+                <w:lang w:val="en-US"/>
+              </w:rPr>
+              <w:t>from_roman</w:t>
+            </w:r>
+            <w:proofErr w:type="spellEnd"/>
+            <w:r>
+              <w:rPr>
+                <w:rFonts w:ascii="Times New Roman" w:eastAsia="Times New Roman" w:hAnsi="Times New Roman" w:cs="Times New Roman"/>
+                <w:sz w:val="20"/>
+                <w:lang w:val="en-US"/>
+              </w:rPr>
+              <w:t>(s)) == s</w:t>
+            </w:r>
+          </w:p>
+        </w:tc>
+        <w:tc>
+          <w:tcPr>
+            <w:tcW w:w="2126" w:type="dxa"/>
+          </w:tcPr>
+          <w:p>
+            <w:proofErr w:type="spellStart"/>
+            <w:r>
+              <w:rPr>
+                <w:rFonts w:ascii="Times New Roman" w:eastAsia="Times New Roman" w:hAnsi="Times New Roman" w:cs="Times New Roman"/>
+                <w:sz w:val="20"/>
+              </w:rPr>
+              <w:t>integration</w:t>
+            </w:r>
+            <w:proofErr w:type="spellEnd"/>
+          </w:p>
+        </w:tc>
+      </w:tr>
+      <w:tr>
+        <w:tc>
+          <w:tcPr>
+            <w:tcW w:w="2126" w:type="dxa"/>
+          </w:tcPr>
+          <w:p>
+            <w:r>
+              <w:rPr>
+                <w:rFonts w:ascii="Times New Roman" w:eastAsia="Times New Roman" w:hAnsi="Times New Roman" w:cs="Times New Roman"/>
+                <w:sz w:val="20"/>
+              </w:rPr>
+              <w:t>aa01f1d</w:t>
+            </w:r>
+          </w:p>
+        </w:tc>
+        <w:tc>
+          <w:tcPr>
+            <w:tcW w:w="2126" w:type="dxa"/>
+          </w:tcPr>
+          <w:p>
+            <w:pPr>
+              <w:rPr>
+                <w:lang w:val="en-US"/>
+              </w:rPr>
+            </w:pPr>
+            <w:proofErr w:type="spellStart"/>
+            <w:r>
+              <w:rPr>
+                <w:rFonts w:ascii="Times New Roman" w:eastAsia="Times New Roman" w:hAnsi="Times New Roman" w:cs="Times New Roman"/>
+                <w:sz w:val="20"/>
+                <w:lang w:val="en-US"/>
+              </w:rPr>
+              <w:t>from_roman</w:t>
+            </w:r>
+            <w:proofErr w:type="spellEnd"/>
+            <w:r>
+              <w:rPr>
+                <w:rFonts w:ascii="Times New Roman" w:eastAsia="Times New Roman" w:hAnsi="Times New Roman" w:cs="Times New Roman"/>
+                <w:sz w:val="20"/>
+                <w:lang w:val="en-US"/>
+              </w:rPr>
+              <w:t xml:space="preserve"> did not tolerate leading or trailing whitespace coming from a user-facing field.</w:t>
+            </w:r>
+          </w:p>
+        </w:tc>
+        <w:tc>
+          <w:tcPr>
+            <w:tcW w:w="2126" w:type="dxa"/>
+          </w:tcPr>
+          <w:p>
+            <w:pPr>
+              <w:rPr>
+                <w:lang w:val="en-US"/>
+              </w:rPr>
+            </w:pPr>
+            <w:proofErr w:type="spellStart"/>
+            <w:r>
+              <w:rPr>
+                <w:rFonts w:ascii="Times New Roman" w:eastAsia="Times New Roman" w:hAnsi="Times New Roman" w:cs="Times New Roman"/>
+                <w:sz w:val="20"/>
+                <w:lang w:val="en-US"/>
+              </w:rPr>
+              <w:t>s.strip</w:t>
+            </w:r>
+            <w:proofErr w:type="spellEnd"/>
+            <w:r>
+              <w:rPr>
+                <w:rFonts w:ascii="Times New Roman" w:eastAsia="Times New Roman" w:hAnsi="Times New Roman" w:cs="Times New Roman"/>
+                <w:sz w:val="20"/>
+                <w:lang w:val="en-US"/>
+              </w:rPr>
+              <w:t>().upper() per section 3</w:t>
+            </w:r>
+          </w:p>
+        </w:tc>
+        <w:tc>
+          <w:tcPr>
+            <w:tcW w:w="2126" w:type="dxa"/>
+          </w:tcPr>
+          <w:p>
+            <w:proofErr w:type="spellStart"/>
+            <w:r>
+              <w:rPr>
+                <w:rFonts w:ascii="Times New Roman" w:eastAsia="Times New Roman" w:hAnsi="Times New Roman" w:cs="Times New Roman"/>
+                <w:sz w:val="20"/>
+              </w:rPr>
+              <w:t>acceptance</w:t>
+            </w:r>
+            <w:proofErr w:type="spellEnd"/>
+          </w:p>
+        </w:tc>
+      </w:tr>
+    </w:tbl>
+    <w:p>
+      <w:pPr>
+        <w:jc w:val="both"/>
+      </w:pPr>
+    </w:p>
+    <w:p>
+      <w:pPr>
+        <w:jc w:val="both"/>
+        <w:rPr>
           <w:rFonts w:ascii="Times New Roman" w:hAnsi="Times New Roman" w:cs="Times New Roman"/>
           <w:sz w:val="24"/>
           <w:szCs w:val="24"/>
@@ -4242,16 +5801,13 @@
       </w:pPr>
       <w:r>
         <w:rPr>
-          <w:rFonts w:ascii="Times New Roman" w:hAnsi="Times New Roman" w:cs="Times New Roman"/>
-          <w:sz w:val="24"/>
-          <w:szCs w:val="24"/>
-          <w:lang w:val="en-US"/>
+          <w:noProof/>
         </w:rPr>
         <w:drawing>
-          <wp:inline distT="0" distB="0" distL="0" distR="0" wp14:anchorId="7E877AB5" wp14:editId="184BEC3F">
-            <wp:extent cx="5400040" cy="1350010"/>
+          <wp:inline distT="0" distB="0" distL="0" distR="0" wp14:anchorId="13453753" wp14:editId="61681E67">
+            <wp:extent cx="5400040" cy="892810"/>
             <wp:effectExtent l="0" t="0" r="0" b="2540"/>
-            <wp:docPr id="12" name="Imagen 12"/>
+            <wp:docPr id="11" name="Imagen 11"/>
             <wp:cNvGraphicFramePr>
               <a:graphicFrameLocks xmlns:a="http://schemas.openxmlformats.org/drawingml/2006/main" noChangeAspect="1"/>
             </wp:cNvGraphicFramePr>
@@ -4271,6 +5827,61 @@
                   <pic:spPr>
                     <a:xfrm>
                       <a:off x="0" y="0"/>
+                      <a:ext cx="5400040" cy="892810"/>
+                    </a:xfrm>
+                    <a:prstGeom prst="rect">
+                      <a:avLst/>
+                    </a:prstGeom>
+                  </pic:spPr>
+                </pic:pic>
+              </a:graphicData>
+            </a:graphic>
+          </wp:inline>
+        </w:drawing>
+      </w:r>
+    </w:p>
+    <w:p>
+      <w:pPr>
+        <w:jc w:val="both"/>
+        <w:rPr>
+          <w:rFonts w:ascii="Times New Roman" w:hAnsi="Times New Roman" w:cs="Times New Roman"/>
+          <w:sz w:val="24"/>
+          <w:szCs w:val="24"/>
+          <w:lang w:val="en-US"/>
+        </w:rPr>
+      </w:pPr>
+      <w:r>
+        <w:rPr>
+          <w:rFonts w:ascii="Times New Roman" w:hAnsi="Times New Roman" w:cs="Times New Roman"/>
+          <w:noProof/>
+          <w:sz w:val="24"/>
+          <w:szCs w:val="24"/>
+          <w:lang w:val="en-US"/>
+        </w:rPr>
+        <w:drawing>
+          <wp:inline distT="0" distB="0" distL="0" distR="0" wp14:anchorId="7263388C" wp14:editId="637D389C">
+            <wp:extent cx="5400040" cy="1350010"/>
+            <wp:effectExtent l="0" t="0" r="0" b="2540"/>
+            <wp:docPr id="12" name="Imagen 12"/>
+            <wp:cNvGraphicFramePr>
+              <a:graphicFrameLocks xmlns:a="http://schemas.openxmlformats.org/drawingml/2006/main" noChangeAspect="1"/>
+            </wp:cNvGraphicFramePr>
+            <a:graphic xmlns:a="http://schemas.openxmlformats.org/drawingml/2006/main">
+              <a:graphicData uri="http://schemas.openxmlformats.org/drawingml/2006/picture">
+                <pic:pic xmlns:pic="http://schemas.openxmlformats.org/drawingml/2006/picture">
+                  <pic:nvPicPr>
+                    <pic:cNvPr id="1" name=""/>
+                    <pic:cNvPicPr/>
+                  </pic:nvPicPr>
+                  <pic:blipFill>
+                    <a:blip r:embed="rId17"/>
+                    <a:stretch>
+                      <a:fillRect/>
+                    </a:stretch>
+                  </pic:blipFill>
+                  <pic:spPr>
+                    <a:xfrm>
+                      <a:off x="0" y="0"/>
                       <a:ext cx="5400040" cy="1350010"/>
                     </a:xfrm>
                     <a:prstGeom prst="rect">
@@ -4288,12 +5899,753 @@
       <w:pPr>
         <w:jc w:val="both"/>
         <w:rPr>
-          <w:rFonts w:ascii="Times New Roman" w:hAnsi="Times New Roman" w:cs="Times New Roman"/>
-          <w:sz w:val="24"/>
-          <w:szCs w:val="24"/>
           <w:lang w:val="en-US"/>
         </w:rPr>
       </w:pPr>
+      <w:r>
+        <w:rPr>
+          <w:rFonts w:ascii="Times New Roman" w:eastAsia="Times New Roman" w:hAnsi="Times New Roman" w:cs="Times New Roman"/>
+          <w:sz w:val="24"/>
+          <w:lang w:val="en-US"/>
+        </w:rPr>
+        <w:t>After the three fixes the whole suite is green at 77 passed and 0 failed, and branch coverage of the module stays at 100%.</w:t>
+      </w:r>
+    </w:p>
+    <w:p>
+      <w:pPr>
+        <w:rPr>
+          <w:rFonts w:ascii="Times New Roman" w:eastAsia="Times New Roman" w:hAnsi="Times New Roman" w:cs="Times New Roman"/>
+          <w:b/>
+          <w:sz w:val="28"/>
+        </w:rPr>
+      </w:pPr>
+      <w:r>
+        <w:rPr>
+          <w:rFonts w:ascii="Times New Roman" w:eastAsia="Times New Roman" w:hAnsi="Times New Roman" w:cs="Times New Roman"/>
+          <w:b/>
+          <w:sz w:val="28"/>
+        </w:rPr>
+        <w:br w:type="page"/>
+      </w:r>
+    </w:p>
+    <w:p>
+      <w:proofErr w:type="spellStart"/>
+      <w:r>
+        <w:rPr>
+          <w:rFonts w:ascii="Times New Roman" w:eastAsia="Times New Roman" w:hAnsi="Times New Roman" w:cs="Times New Roman"/>
+          <w:b/>
+          <w:sz w:val="28"/>
+        </w:rPr>
+        <w:lastRenderedPageBreak/>
+        <w:t>Coverage</w:t>
+      </w:r>
+      <w:proofErr w:type="spellEnd"/>
+    </w:p>
+    <w:tbl>
+      <w:tblPr>
+        <w:tblStyle w:val="Tablaconcuadrcula"/>
+        <w:tblW w:w="0" w:type="auto"/>
+        <w:tblLook w:val="04A0" w:firstRow="1" w:lastRow="0" w:firstColumn="1" w:lastColumn="0" w:noHBand="0" w:noVBand="1"/>
+      </w:tblPr>
+      <w:tblGrid>
+        <w:gridCol w:w="1214"/>
+        <w:gridCol w:w="1213"/>
+        <w:gridCol w:w="1213"/>
+        <w:gridCol w:w="1214"/>
+        <w:gridCol w:w="1214"/>
+        <w:gridCol w:w="1213"/>
+        <w:gridCol w:w="1213"/>
+      </w:tblGrid>
+      <w:tr>
+        <w:tc>
+          <w:tcPr>
+            <w:tcW w:w="1215" w:type="dxa"/>
+          </w:tcPr>
+          <w:p>
+            <w:proofErr w:type="spellStart"/>
+            <w:r>
+              <w:rPr>
+                <w:rFonts w:ascii="Times New Roman" w:eastAsia="Times New Roman" w:hAnsi="Times New Roman" w:cs="Times New Roman"/>
+                <w:b/>
+                <w:sz w:val="20"/>
+              </w:rPr>
+              <w:t>Stage</w:t>
+            </w:r>
+            <w:proofErr w:type="spellEnd"/>
+          </w:p>
+        </w:tc>
+        <w:tc>
+          <w:tcPr>
+            <w:tcW w:w="1215" w:type="dxa"/>
+          </w:tcPr>
+          <w:p>
+            <w:proofErr w:type="spellStart"/>
+            <w:r>
+              <w:rPr>
+                <w:rFonts w:ascii="Times New Roman" w:eastAsia="Times New Roman" w:hAnsi="Times New Roman" w:cs="Times New Roman"/>
+                <w:b/>
+                <w:sz w:val="20"/>
+              </w:rPr>
+              <w:t>Stmts</w:t>
+            </w:r>
+            <w:proofErr w:type="spellEnd"/>
+          </w:p>
+        </w:tc>
+        <w:tc>
+          <w:tcPr>
+            <w:tcW w:w="1215" w:type="dxa"/>
+          </w:tcPr>
+          <w:p>
+            <w:r>
+              <w:rPr>
+                <w:rFonts w:ascii="Times New Roman" w:eastAsia="Times New Roman" w:hAnsi="Times New Roman" w:cs="Times New Roman"/>
+                <w:b/>
+                <w:sz w:val="20"/>
+              </w:rPr>
+              <w:t>Miss</w:t>
+            </w:r>
+          </w:p>
+        </w:tc>
+        <w:tc>
+          <w:tcPr>
+            <w:tcW w:w="1215" w:type="dxa"/>
+          </w:tcPr>
+          <w:p>
+            <w:r>
+              <w:rPr>
+                <w:rFonts w:ascii="Times New Roman" w:eastAsia="Times New Roman" w:hAnsi="Times New Roman" w:cs="Times New Roman"/>
+                <w:b/>
+                <w:sz w:val="20"/>
+              </w:rPr>
+              <w:t>Branch</w:t>
+            </w:r>
+          </w:p>
+        </w:tc>
+        <w:tc>
+          <w:tcPr>
+            <w:tcW w:w="1215" w:type="dxa"/>
+          </w:tcPr>
+          <w:p>
+            <w:proofErr w:type="spellStart"/>
+            <w:r>
+              <w:rPr>
+                <w:rFonts w:ascii="Times New Roman" w:eastAsia="Times New Roman" w:hAnsi="Times New Roman" w:cs="Times New Roman"/>
+                <w:b/>
+                <w:sz w:val="20"/>
+              </w:rPr>
+              <w:t>BrPart</w:t>
+            </w:r>
+            <w:proofErr w:type="spellEnd"/>
+          </w:p>
+        </w:tc>
+        <w:tc>
+          <w:tcPr>
+            <w:tcW w:w="1215" w:type="dxa"/>
+          </w:tcPr>
+          <w:p>
+            <w:proofErr w:type="spellStart"/>
+            <w:r>
+              <w:rPr>
+                <w:rFonts w:ascii="Times New Roman" w:eastAsia="Times New Roman" w:hAnsi="Times New Roman" w:cs="Times New Roman"/>
+                <w:b/>
+                <w:sz w:val="20"/>
+              </w:rPr>
+              <w:t>Cover</w:t>
+            </w:r>
+            <w:proofErr w:type="spellEnd"/>
+          </w:p>
+        </w:tc>
+        <w:tc>
+          <w:tcPr>
+            <w:tcW w:w="1215" w:type="dxa"/>
+          </w:tcPr>
+          <w:p>
+            <w:proofErr w:type="spellStart"/>
+            <w:r>
+              <w:rPr>
+                <w:rFonts w:ascii="Times New Roman" w:eastAsia="Times New Roman" w:hAnsi="Times New Roman" w:cs="Times New Roman"/>
+                <w:b/>
+                <w:sz w:val="20"/>
+              </w:rPr>
+              <w:t>Result</w:t>
+            </w:r>
+            <w:proofErr w:type="spellEnd"/>
+          </w:p>
+        </w:tc>
+      </w:tr>
+      <w:tr>
+        <w:tc>
+          <w:tcPr>
+            <w:tcW w:w="1215" w:type="dxa"/>
+          </w:tcPr>
+          <w:p>
+            <w:proofErr w:type="spellStart"/>
+            <w:r>
+              <w:rPr>
+                <w:rFonts w:ascii="Times New Roman" w:eastAsia="Times New Roman" w:hAnsi="Times New Roman" w:cs="Times New Roman"/>
+                <w:sz w:val="20"/>
+              </w:rPr>
+              <w:t>Part</w:t>
+            </w:r>
+            <w:proofErr w:type="spellEnd"/>
+            <w:r>
+              <w:rPr>
+                <w:rFonts w:ascii="Times New Roman" w:eastAsia="Times New Roman" w:hAnsi="Times New Roman" w:cs="Times New Roman"/>
+                <w:sz w:val="20"/>
+              </w:rPr>
+              <w:t xml:space="preserve"> 2, </w:t>
+            </w:r>
+            <w:proofErr w:type="spellStart"/>
+            <w:r>
+              <w:rPr>
+                <w:rFonts w:ascii="Times New Roman" w:eastAsia="Times New Roman" w:hAnsi="Times New Roman" w:cs="Times New Roman"/>
+                <w:sz w:val="20"/>
+              </w:rPr>
+              <w:t>inherited</w:t>
+            </w:r>
+            <w:proofErr w:type="spellEnd"/>
+            <w:r>
+              <w:rPr>
+                <w:rFonts w:ascii="Times New Roman" w:eastAsia="Times New Roman" w:hAnsi="Times New Roman" w:cs="Times New Roman"/>
+                <w:sz w:val="20"/>
+              </w:rPr>
+              <w:t xml:space="preserve"> suite </w:t>
+            </w:r>
+            <w:proofErr w:type="spellStart"/>
+            <w:r>
+              <w:rPr>
+                <w:rFonts w:ascii="Times New Roman" w:eastAsia="Times New Roman" w:hAnsi="Times New Roman" w:cs="Times New Roman"/>
+                <w:sz w:val="20"/>
+              </w:rPr>
+              <w:t>only</w:t>
+            </w:r>
+            <w:proofErr w:type="spellEnd"/>
+          </w:p>
+        </w:tc>
+        <w:tc>
+          <w:tcPr>
+            <w:tcW w:w="1215" w:type="dxa"/>
+          </w:tcPr>
+          <w:p>
+            <w:r>
+              <w:rPr>
+                <w:rFonts w:ascii="Times New Roman" w:eastAsia="Times New Roman" w:hAnsi="Times New Roman" w:cs="Times New Roman"/>
+                <w:sz w:val="20"/>
+              </w:rPr>
+              <w:t>68</w:t>
+            </w:r>
+          </w:p>
+        </w:tc>
+        <w:tc>
+          <w:tcPr>
+            <w:tcW w:w="1215" w:type="dxa"/>
+          </w:tcPr>
+          <w:p>
+            <w:r>
+              <w:rPr>
+                <w:rFonts w:ascii="Times New Roman" w:eastAsia="Times New Roman" w:hAnsi="Times New Roman" w:cs="Times New Roman"/>
+                <w:sz w:val="20"/>
+              </w:rPr>
+              <w:t>24</w:t>
+            </w:r>
+          </w:p>
+        </w:tc>
+        <w:tc>
+          <w:tcPr>
+            <w:tcW w:w="1215" w:type="dxa"/>
+          </w:tcPr>
+          <w:p>
+            <w:r>
+              <w:rPr>
+                <w:rFonts w:ascii="Times New Roman" w:eastAsia="Times New Roman" w:hAnsi="Times New Roman" w:cs="Times New Roman"/>
+                <w:sz w:val="20"/>
+              </w:rPr>
+              <w:t>34</w:t>
+            </w:r>
+          </w:p>
+        </w:tc>
+        <w:tc>
+          <w:tcPr>
+            <w:tcW w:w="1215" w:type="dxa"/>
+          </w:tcPr>
+          <w:p>
+            <w:r>
+              <w:rPr>
+                <w:rFonts w:ascii="Times New Roman" w:eastAsia="Times New Roman" w:hAnsi="Times New Roman" w:cs="Times New Roman"/>
+                <w:sz w:val="20"/>
+              </w:rPr>
+              <w:t>9</w:t>
+            </w:r>
+          </w:p>
+        </w:tc>
+        <w:tc>
+          <w:tcPr>
+            <w:tcW w:w="1215" w:type="dxa"/>
+          </w:tcPr>
+          <w:p>
+            <w:r>
+              <w:rPr>
+                <w:rFonts w:ascii="Times New Roman" w:eastAsia="Times New Roman" w:hAnsi="Times New Roman" w:cs="Times New Roman"/>
+                <w:sz w:val="20"/>
+              </w:rPr>
+              <w:t>64%</w:t>
+            </w:r>
+          </w:p>
+        </w:tc>
+        <w:tc>
+          <w:tcPr>
+            <w:tcW w:w="1215" w:type="dxa"/>
+          </w:tcPr>
+          <w:p>
+            <w:r>
+              <w:rPr>
+                <w:rFonts w:ascii="Times New Roman" w:eastAsia="Times New Roman" w:hAnsi="Times New Roman" w:cs="Times New Roman"/>
+                <w:sz w:val="20"/>
+              </w:rPr>
+              <w:t xml:space="preserve">15 </w:t>
+            </w:r>
+            <w:proofErr w:type="spellStart"/>
+            <w:r>
+              <w:rPr>
+                <w:rFonts w:ascii="Times New Roman" w:eastAsia="Times New Roman" w:hAnsi="Times New Roman" w:cs="Times New Roman"/>
+                <w:sz w:val="20"/>
+              </w:rPr>
+              <w:t>passed</w:t>
+            </w:r>
+            <w:proofErr w:type="spellEnd"/>
+          </w:p>
+        </w:tc>
+      </w:tr>
+      <w:tr>
+        <w:tc>
+          <w:tcPr>
+            <w:tcW w:w="1215" w:type="dxa"/>
+          </w:tcPr>
+          <w:p>
+            <w:pPr>
+              <w:rPr>
+                <w:lang w:val="en-US"/>
+              </w:rPr>
+            </w:pPr>
+            <w:r>
+              <w:rPr>
+                <w:rFonts w:ascii="Times New Roman" w:eastAsia="Times New Roman" w:hAnsi="Times New Roman" w:cs="Times New Roman"/>
+                <w:sz w:val="20"/>
+                <w:lang w:val="en-US"/>
+              </w:rPr>
+              <w:t xml:space="preserve">Part 3, </w:t>
+            </w:r>
+            <w:r>
+              <w:rPr>
+                <w:rFonts w:ascii="Times New Roman" w:eastAsia="Times New Roman" w:hAnsi="Times New Roman" w:cs="Times New Roman"/>
+                <w:sz w:val="20"/>
+                <w:lang w:val="en-US"/>
+              </w:rPr>
+              <w:t>structural unit tests added</w:t>
+            </w:r>
+          </w:p>
+        </w:tc>
+        <w:tc>
+          <w:tcPr>
+            <w:tcW w:w="1215" w:type="dxa"/>
+          </w:tcPr>
+          <w:p>
+            <w:r>
+              <w:rPr>
+                <w:rFonts w:ascii="Times New Roman" w:eastAsia="Times New Roman" w:hAnsi="Times New Roman" w:cs="Times New Roman"/>
+                <w:sz w:val="20"/>
+              </w:rPr>
+              <w:t>68</w:t>
+            </w:r>
+          </w:p>
+        </w:tc>
+        <w:tc>
+          <w:tcPr>
+            <w:tcW w:w="1215" w:type="dxa"/>
+          </w:tcPr>
+          <w:p>
+            <w:r>
+              <w:rPr>
+                <w:rFonts w:ascii="Times New Roman" w:eastAsia="Times New Roman" w:hAnsi="Times New Roman" w:cs="Times New Roman"/>
+                <w:sz w:val="20"/>
+              </w:rPr>
+              <w:t>0</w:t>
+            </w:r>
+          </w:p>
+        </w:tc>
+        <w:tc>
+          <w:tcPr>
+            <w:tcW w:w="1215" w:type="dxa"/>
+          </w:tcPr>
+          <w:p>
+            <w:r>
+              <w:rPr>
+                <w:rFonts w:ascii="Times New Roman" w:eastAsia="Times New Roman" w:hAnsi="Times New Roman" w:cs="Times New Roman"/>
+                <w:sz w:val="20"/>
+              </w:rPr>
+              <w:t>34</w:t>
+            </w:r>
+          </w:p>
+        </w:tc>
+        <w:tc>
+          <w:tcPr>
+            <w:tcW w:w="1215" w:type="dxa"/>
+          </w:tcPr>
+          <w:p>
+            <w:r>
+              <w:rPr>
+                <w:rFonts w:ascii="Times New Roman" w:eastAsia="Times New Roman" w:hAnsi="Times New Roman" w:cs="Times New Roman"/>
+                <w:sz w:val="20"/>
+              </w:rPr>
+              <w:t>0</w:t>
+            </w:r>
+          </w:p>
+        </w:tc>
+        <w:tc>
+          <w:tcPr>
+            <w:tcW w:w="1215" w:type="dxa"/>
+          </w:tcPr>
+          <w:p>
+            <w:r>
+              <w:rPr>
+                <w:rFonts w:ascii="Times New Roman" w:eastAsia="Times New Roman" w:hAnsi="Times New Roman" w:cs="Times New Roman"/>
+                <w:sz w:val="20"/>
+              </w:rPr>
+              <w:t>100%</w:t>
+            </w:r>
+          </w:p>
+        </w:tc>
+        <w:tc>
+          <w:tcPr>
+            <w:tcW w:w="1215" w:type="dxa"/>
+          </w:tcPr>
+          <w:p>
+            <w:r>
+              <w:rPr>
+                <w:rFonts w:ascii="Times New Roman" w:eastAsia="Times New Roman" w:hAnsi="Times New Roman" w:cs="Times New Roman"/>
+                <w:sz w:val="20"/>
+              </w:rPr>
+              <w:t xml:space="preserve">41 </w:t>
+            </w:r>
+            <w:proofErr w:type="spellStart"/>
+            <w:r>
+              <w:rPr>
+                <w:rFonts w:ascii="Times New Roman" w:eastAsia="Times New Roman" w:hAnsi="Times New Roman" w:cs="Times New Roman"/>
+                <w:sz w:val="20"/>
+              </w:rPr>
+              <w:t>passed</w:t>
+            </w:r>
+            <w:proofErr w:type="spellEnd"/>
+            <w:r>
+              <w:rPr>
+                <w:rFonts w:ascii="Times New Roman" w:eastAsia="Times New Roman" w:hAnsi="Times New Roman" w:cs="Times New Roman"/>
+                <w:sz w:val="20"/>
+              </w:rPr>
+              <w:t xml:space="preserve">, 4 </w:t>
+            </w:r>
+            <w:proofErr w:type="spellStart"/>
+            <w:r>
+              <w:rPr>
+                <w:rFonts w:ascii="Times New Roman" w:eastAsia="Times New Roman" w:hAnsi="Times New Roman" w:cs="Times New Roman"/>
+                <w:sz w:val="20"/>
+              </w:rPr>
+              <w:t>failed</w:t>
+            </w:r>
+            <w:proofErr w:type="spellEnd"/>
+          </w:p>
+        </w:tc>
+      </w:tr>
+      <w:tr>
+        <w:tc>
+          <w:tcPr>
+            <w:tcW w:w="1215" w:type="dxa"/>
+          </w:tcPr>
+          <w:p>
+            <w:pPr>
+              <w:rPr>
+                <w:lang w:val="en-US"/>
+              </w:rPr>
+            </w:pPr>
+            <w:r>
+              <w:rPr>
+                <w:rFonts w:ascii="Times New Roman" w:eastAsia="Times New Roman" w:hAnsi="Times New Roman" w:cs="Times New Roman"/>
+                <w:sz w:val="20"/>
+                <w:lang w:val="en-US"/>
+              </w:rPr>
+              <w:t>Parts 4 and 5, full suite before the fixes</w:t>
+            </w:r>
+          </w:p>
+        </w:tc>
+        <w:tc>
+          <w:tcPr>
+            <w:tcW w:w="1215" w:type="dxa"/>
+          </w:tcPr>
+          <w:p>
+            <w:r>
+              <w:rPr>
+                <w:rFonts w:ascii="Times New Roman" w:eastAsia="Times New Roman" w:hAnsi="Times New Roman" w:cs="Times New Roman"/>
+                <w:sz w:val="20"/>
+              </w:rPr>
+              <w:t>68</w:t>
+            </w:r>
+          </w:p>
+        </w:tc>
+        <w:tc>
+          <w:tcPr>
+            <w:tcW w:w="1215" w:type="dxa"/>
+          </w:tcPr>
+          <w:p>
+            <w:r>
+              <w:rPr>
+                <w:rFonts w:ascii="Times New Roman" w:eastAsia="Times New Roman" w:hAnsi="Times New Roman" w:cs="Times New Roman"/>
+                <w:sz w:val="20"/>
+              </w:rPr>
+              <w:t>0</w:t>
+            </w:r>
+          </w:p>
+        </w:tc>
+        <w:tc>
+          <w:tcPr>
+            <w:tcW w:w="1215" w:type="dxa"/>
+          </w:tcPr>
+          <w:p>
+            <w:r>
+              <w:rPr>
+                <w:rFonts w:ascii="Times New Roman" w:eastAsia="Times New Roman" w:hAnsi="Times New Roman" w:cs="Times New Roman"/>
+                <w:sz w:val="20"/>
+              </w:rPr>
+              <w:t>34</w:t>
+            </w:r>
+          </w:p>
+        </w:tc>
+        <w:tc>
+          <w:tcPr>
+            <w:tcW w:w="1215" w:type="dxa"/>
+          </w:tcPr>
+          <w:p>
+            <w:r>
+              <w:rPr>
+                <w:rFonts w:ascii="Times New Roman" w:eastAsia="Times New Roman" w:hAnsi="Times New Roman" w:cs="Times New Roman"/>
+                <w:sz w:val="20"/>
+              </w:rPr>
+              <w:t>0</w:t>
+            </w:r>
+          </w:p>
+        </w:tc>
+        <w:tc>
+          <w:tcPr>
+            <w:tcW w:w="1215" w:type="dxa"/>
+          </w:tcPr>
+          <w:p>
+            <w:r>
+              <w:rPr>
+                <w:rFonts w:ascii="Times New Roman" w:eastAsia="Times New Roman" w:hAnsi="Times New Roman" w:cs="Times New Roman"/>
+                <w:sz w:val="20"/>
+              </w:rPr>
+              <w:t>100%</w:t>
+            </w:r>
+          </w:p>
+        </w:tc>
+        <w:tc>
+          <w:tcPr>
+            <w:tcW w:w="1215" w:type="dxa"/>
+          </w:tcPr>
+          <w:p>
+            <w:r>
+              <w:rPr>
+                <w:rFonts w:ascii="Times New Roman" w:eastAsia="Times New Roman" w:hAnsi="Times New Roman" w:cs="Times New Roman"/>
+                <w:sz w:val="20"/>
+              </w:rPr>
+              <w:t xml:space="preserve">57 </w:t>
+            </w:r>
+            <w:proofErr w:type="spellStart"/>
+            <w:r>
+              <w:rPr>
+                <w:rFonts w:ascii="Times New Roman" w:eastAsia="Times New Roman" w:hAnsi="Times New Roman" w:cs="Times New Roman"/>
+                <w:sz w:val="20"/>
+              </w:rPr>
+              <w:t>passed</w:t>
+            </w:r>
+            <w:proofErr w:type="spellEnd"/>
+            <w:r>
+              <w:rPr>
+                <w:rFonts w:ascii="Times New Roman" w:eastAsia="Times New Roman" w:hAnsi="Times New Roman" w:cs="Times New Roman"/>
+                <w:sz w:val="20"/>
+              </w:rPr>
+              <w:t xml:space="preserve">, 20 </w:t>
+            </w:r>
+            <w:proofErr w:type="spellStart"/>
+            <w:r>
+              <w:rPr>
+                <w:rFonts w:ascii="Times New Roman" w:eastAsia="Times New Roman" w:hAnsi="Times New Roman" w:cs="Times New Roman"/>
+                <w:sz w:val="20"/>
+              </w:rPr>
+              <w:t>failed</w:t>
+            </w:r>
+            <w:proofErr w:type="spellEnd"/>
+          </w:p>
+        </w:tc>
+      </w:tr>
+      <w:tr>
+        <w:tc>
+          <w:tcPr>
+            <w:tcW w:w="1215" w:type="dxa"/>
+          </w:tcPr>
+          <w:p>
+            <w:pPr>
+              <w:rPr>
+                <w:lang w:val="en-US"/>
+              </w:rPr>
+            </w:pPr>
+            <w:r>
+              <w:rPr>
+                <w:rFonts w:ascii="Times New Roman" w:eastAsia="Times New Roman" w:hAnsi="Times New Roman" w:cs="Times New Roman"/>
+                <w:sz w:val="20"/>
+                <w:lang w:val="en-US"/>
+              </w:rPr>
+              <w:t>Part 6, after the three fixes</w:t>
+            </w:r>
+          </w:p>
+        </w:tc>
+        <w:tc>
+          <w:tcPr>
+            <w:tcW w:w="1215" w:type="dxa"/>
+          </w:tcPr>
+          <w:p>
+            <w:r>
+              <w:rPr>
+                <w:rFonts w:ascii="Times New Roman" w:eastAsia="Times New Roman" w:hAnsi="Times New Roman" w:cs="Times New Roman"/>
+                <w:sz w:val="20"/>
+              </w:rPr>
+              <w:t>99</w:t>
+            </w:r>
+          </w:p>
+        </w:tc>
+        <w:tc>
+          <w:tcPr>
+            <w:tcW w:w="1215" w:type="dxa"/>
+          </w:tcPr>
+          <w:p>
+            <w:r>
+              <w:rPr>
+                <w:rFonts w:ascii="Times New Roman" w:eastAsia="Times New Roman" w:hAnsi="Times New Roman" w:cs="Times New Roman"/>
+                <w:sz w:val="20"/>
+              </w:rPr>
+              <w:t>0</w:t>
+            </w:r>
+          </w:p>
+        </w:tc>
+        <w:tc>
+          <w:tcPr>
+            <w:tcW w:w="1215" w:type="dxa"/>
+          </w:tcPr>
+          <w:p>
+            <w:r>
+              <w:rPr>
+                <w:rFonts w:ascii="Times New Roman" w:eastAsia="Times New Roman" w:hAnsi="Times New Roman" w:cs="Times New Roman"/>
+                <w:sz w:val="20"/>
+              </w:rPr>
+              <w:t>62</w:t>
+            </w:r>
+          </w:p>
+        </w:tc>
+        <w:tc>
+          <w:tcPr>
+            <w:tcW w:w="1215" w:type="dxa"/>
+          </w:tcPr>
+          <w:p>
+            <w:r>
+              <w:rPr>
+                <w:rFonts w:ascii="Times New Roman" w:eastAsia="Times New Roman" w:hAnsi="Times New Roman" w:cs="Times New Roman"/>
+                <w:sz w:val="20"/>
+              </w:rPr>
+              <w:t>0</w:t>
+            </w:r>
+          </w:p>
+        </w:tc>
+        <w:tc>
+          <w:tcPr>
+            <w:tcW w:w="1215" w:type="dxa"/>
+          </w:tcPr>
+          <w:p>
+            <w:r>
+              <w:rPr>
+                <w:rFonts w:ascii="Times New Roman" w:eastAsia="Times New Roman" w:hAnsi="Times New Roman" w:cs="Times New Roman"/>
+                <w:sz w:val="20"/>
+              </w:rPr>
+              <w:t>100%</w:t>
+            </w:r>
+          </w:p>
+        </w:tc>
+        <w:tc>
+          <w:tcPr>
+            <w:tcW w:w="1215" w:type="dxa"/>
+          </w:tcPr>
+          <w:p>
+            <w:r>
+              <w:rPr>
+                <w:rFonts w:ascii="Times New Roman" w:eastAsia="Times New Roman" w:hAnsi="Times New Roman" w:cs="Times New Roman"/>
+                <w:sz w:val="20"/>
+              </w:rPr>
+              <w:t xml:space="preserve">77 </w:t>
+            </w:r>
+            <w:proofErr w:type="spellStart"/>
+            <w:r>
+              <w:rPr>
+                <w:rFonts w:ascii="Times New Roman" w:eastAsia="Times New Roman" w:hAnsi="Times New Roman" w:cs="Times New Roman"/>
+                <w:sz w:val="20"/>
+              </w:rPr>
+              <w:t>passed</w:t>
+            </w:r>
+            <w:proofErr w:type="spellEnd"/>
+          </w:p>
+        </w:tc>
+      </w:tr>
+    </w:tbl>
+    <w:p>
+      <w:pPr>
+        <w:jc w:val="both"/>
+      </w:pPr>
+    </w:p>
+    <w:p>
+      <w:pPr>
+        <w:jc w:val="both"/>
+        <w:rPr>
+          <w:lang w:val="en-US"/>
+        </w:rPr>
+      </w:pPr>
+      <w:r>
+        <w:rPr>
+          <w:rFonts w:ascii="Times New Roman" w:eastAsia="Times New Roman" w:hAnsi="Times New Roman" w:cs="Times New Roman"/>
+          <w:sz w:val="24"/>
+          <w:lang w:val="en-US"/>
+        </w:rPr>
+        <w:t xml:space="preserve">Branch coverage rose from the 64% of the </w:t>
+      </w:r>
+      <w:r>
+        <w:rPr>
+          <w:rFonts w:ascii="Times New Roman" w:eastAsia="Times New Roman" w:hAnsi="Times New Roman" w:cs="Times New Roman"/>
+          <w:sz w:val="24"/>
+          <w:lang w:val="en-US"/>
+        </w:rPr>
+        <w:t>inherited suite to 100%, well above the 85% required. The middle rows are the important ones. The suite reached 100% branch coverage while 20 tests were still failing, and adding the integration and acceptance tests of Parts 4 and 5 did not move the number</w:t>
+      </w:r>
+      <w:r>
+        <w:rPr>
+          <w:rFonts w:ascii="Times New Roman" w:eastAsia="Times New Roman" w:hAnsi="Times New Roman" w:cs="Times New Roman"/>
+          <w:sz w:val="24"/>
+          <w:lang w:val="en-US"/>
+        </w:rPr>
+        <w:t xml:space="preserve"> at all: they executed exactly the same lines and still found three defects. The statement and branch counts grow in the last row only because the fix for the canonical form added 31 statements and 28 branches to the module, not because the suite became st</w:t>
+      </w:r>
+      <w:r>
+        <w:rPr>
+          <w:rFonts w:ascii="Times New Roman" w:eastAsia="Times New Roman" w:hAnsi="Times New Roman" w:cs="Times New Roman"/>
+          <w:sz w:val="24"/>
+          <w:lang w:val="en-US"/>
+        </w:rPr>
+        <w:t>ronger.</w:t>
+      </w:r>
     </w:p>
     <w:sectPr>
       <w:pgSz w:w="11906" w:h="16838"/>

</xml_diff>